<commit_message>
docs: humanize Assignment 3 write-up — remove AI writing patterns
</commit_message>
<xml_diff>
--- a/docs/Assignment3_Writeup.docx
+++ b/docs/Assignment3_Writeup.docx
@@ -77,7 +77,7 @@
           <w:sz w:val="22"/>
           <w:szCs w:val="22"/>
         </w:rPr>
-        <w:t xml:space="preserve">Building on our Assignment 2 five-class PPE classification pipeline, Assignment 3 extends the project to pixel-level spatial understanding. We pursue two complementary pixel-wise tasks:</w:t>
+        <w:t xml:space="preserve">Assignment 2 classified entire person crops into five PPE categories. Assignment 3 goes a level deeper: instead of one label per crop, we assign a label to every pixel. Two tasks:</w:t>
       </w:r>
     </w:p>
     <w:p>
@@ -95,7 +95,7 @@
           <w:sz w:val="22"/>
           <w:szCs w:val="22"/>
         </w:rPr>
-        <w:t xml:space="preserve">Semantic Segmentation — assign every pixel in a scene to one of six classes: background, full_ppe, helmet, no_ppe, partial_ppe, or safety_vest. This enables precise coverage mapping across an entire camera frame without requiring pre-cropped person regions.</w:t>
+        <w:t xml:space="preserve">Semantic segmentation — label each pixel in a full scene as one of six classes: background, full_ppe, helmet, no_ppe, partial_ppe, or safety_vest. No person detector runs first; the whole frame is processed directly.</w:t>
       </w:r>
     </w:p>
     <w:p>
@@ -113,7 +113,7 @@
           <w:sz w:val="22"/>
           <w:szCs w:val="22"/>
         </w:rPr>
-        <w:t xml:space="preserve">Instance Segmentation — detect each PPE item as a distinct object with a per-pixel polygon mask, allowing the system to count and spatially locate individual helmets and vests in crowded scenes.</w:t>
+        <w:t xml:space="preserve">Instance segmentation — find each PPE item as a separate object with its own polygon mask, so helmets on different workers are tracked individually rather than merged into a single region.</w:t>
       </w:r>
     </w:p>
     <w:p>
@@ -155,7 +155,7 @@
           <w:sz w:val="22"/>
           <w:szCs w:val="22"/>
         </w:rPr>
-        <w:t xml:space="preserve">We continue with the combined MinhNKB corpus (helmet-safety-vest-detection-master, 1613 images with Pascal VOC XML annotations) that was central to Assignment 2. The key extension is the mask layer: per-scene binary foreground masks generated by SAM2 (Segment Anything Model 2) using bounding-box prompts derived from the XML annotations.</w:t>
+        <w:t xml:space="preserve">We use the same MinhNKB corpus from Assignment 2 (helmet-safety-vest-detection-master, 1613 images, Pascal VOC XML annotations). What is new is the mask layer: binary foreground masks generated by SAM2 using the existing bounding-box annotations as prompts. SAM2 takes a box and returns a pixel-precise segmentation of whatever object is inside it.</w:t>
       </w:r>
     </w:p>
     <w:p>
@@ -168,7 +168,7 @@
           <w:sz w:val="22"/>
           <w:szCs w:val="22"/>
         </w:rPr>
-        <w:t xml:space="preserve">The ppe_seg_data_prep.py preprocessing script performs the following:</w:t>
+        <w:t xml:space="preserve">The data preparation script (ppe_seg_data_prep.py) does the following for each image:</w:t>
       </w:r>
     </w:p>
     <w:p>
@@ -186,7 +186,7 @@
           <w:sz w:val="22"/>
           <w:szCs w:val="22"/>
         </w:rPr>
-        <w:t xml:space="preserve">Parses each Pascal VOC XML file to extract bounding boxes and class labels.</w:t>
+        <w:t xml:space="preserve">Reads the XML to get bounding boxes and class names.</w:t>
       </w:r>
     </w:p>
     <w:p>
@@ -204,7 +204,7 @@
           <w:sz w:val="22"/>
           <w:szCs w:val="22"/>
         </w:rPr>
-        <w:t xml:space="preserve">Loads the corresponding pre-generated SAM2 binary mask for each scene. Where a mask is unavailable, the bounding box region is filled as a rectangular fallback.</w:t>
+        <w:t xml:space="preserve">Loads the SAM2 binary mask for that scene. If no mask file exists, the bounding box rectangle is used instead.</w:t>
       </w:r>
     </w:p>
     <w:p>
@@ -222,7 +222,7 @@
           <w:sz w:val="22"/>
           <w:szCs w:val="22"/>
         </w:rPr>
-        <w:t xml:space="preserve">Constructs a six-class semantic mask (uint8 PNG, pixel value = class index) by painting each SAM2 foreground region with its annotated class label.</w:t>
+        <w:t xml:space="preserve">Paints each SAM2 foreground region onto a blank canvas using the box's class index (0 = background, 1-5 = PPE class), producing a single-channel uint8 PNG mask.</w:t>
       </w:r>
     </w:p>
     <w:p>
@@ -240,7 +240,7 @@
           <w:sz w:val="22"/>
           <w:szCs w:val="22"/>
         </w:rPr>
-        <w:t xml:space="preserve">Converts the same binary masks to YOLO polygon format (normalised coordinates) for instance segmentation training.</w:t>
+        <w:t xml:space="preserve">Traces the same binary masks into contour polygons, simplifies them with Douglas-Peucker (epsilon = 0.005 * arc length), and writes them as normalised YOLO polygon labels.</w:t>
       </w:r>
     </w:p>
     <w:p>
@@ -258,7 +258,7 @@
           <w:sz w:val="22"/>
           <w:szCs w:val="22"/>
         </w:rPr>
-        <w:t xml:space="preserve">Applies a deterministic 85/15 train/val split, yielding 1368 training and 241 validation scenes.</w:t>
+        <w:t xml:space="preserve">Splits 85/15 train/val by image stem, yielding 1368 train and 241 val scenes.</w:t>
       </w:r>
     </w:p>
     <w:p>
@@ -284,7 +284,7 @@
           <w:sz w:val="22"/>
           <w:szCs w:val="22"/>
         </w:rPr>
-        <w:t xml:space="preserve">Both the semantic (512 x 512 PNG mask + JPEG image) and instance (YOLO .txt polygon label + JPEG image) datasets are written to D:/Claude/datasets/ppe_seg/, keeping them entirely outside the git repository in line with the project's large-data conventions.</w:t>
+        <w:t xml:space="preserve">Both dataset formats (512x512 PNG mask + JPEG, and YOLO polygon .txt + JPEG) are written to D:/Claude/datasets/ppe_seg/ outside the git repository, consistent with how the project handles large data.</w:t>
       </w:r>
     </w:p>
     <w:p>
@@ -313,7 +313,7 @@
           <w:sz w:val="22"/>
           <w:szCs w:val="22"/>
         </w:rPr>
-        <w:t xml:space="preserve">Pixel-level PPE detection compounds the difficulties that already ruled out classical methods for classification in Assignment 2. Three factors make the segmentation problem strictly harder:</w:t>
+        <w:t xml:space="preserve">The classification problem in Assignment 2 already ruled out classical methods. Segmentation makes things harder in three specific ways.</w:t>
       </w:r>
     </w:p>
     <w:p>
@@ -331,7 +331,7 @@
           <w:sz w:val="23"/>
           <w:szCs w:val="23"/>
         </w:rPr>
-        <w:t xml:space="preserve">2.1 Spatial Resolution and Context Dependency</w:t>
+        <w:t xml:space="preserve">2.1 Receptive field requirements</w:t>
       </w:r>
     </w:p>
     <w:p>
@@ -344,7 +344,7 @@
           <w:sz w:val="22"/>
           <w:szCs w:val="22"/>
         </w:rPr>
-        <w:t xml:space="preserve">Every output pixel must integrate information from a large receptive field. A helmet at the top of a frame is ambiguous without the body context below it. Classical approaches such as thresholding or histogram-based superpixel methods operate locally and cannot build these long-range dependencies. Convolutional encoders with repeated downsampling, combined with dilated convolutions (as in DeepLab's ASPP module), provide the multi-scale receptive fields required.</w:t>
+        <w:t xml:space="preserve">Classifying a single pixel correctly often requires context from hundreds of pixels away. A hard-hat at the top of the frame is ambiguous without the shoulders and torso below it. Threshold-based and histogram-based methods are local by construction. DeepLabV3+'s atrous convolutions and ASPP module build multi-scale context across the full image, which is not something you can bolt onto a classical method.</w:t>
       </w:r>
     </w:p>
     <w:p>
@@ -362,7 +362,7 @@
           <w:sz w:val="23"/>
           <w:szCs w:val="23"/>
         </w:rPr>
-        <w:t xml:space="preserve">2.2 Class Imbalance at the Pixel Level</w:t>
+        <w:t xml:space="preserve">2.2 Class imbalance at the pixel level</w:t>
       </w:r>
     </w:p>
     <w:p>
@@ -375,7 +375,7 @@
           <w:sz w:val="22"/>
           <w:szCs w:val="22"/>
         </w:rPr>
-        <w:t xml:space="preserve">In a typical industrial scene, the background accounts for roughly 80 percent of all pixels. The smallest PPE class (helmet) may cover fewer than 0.5 percent of pixels per image. Any classical pixel classifier applied naively collapses to predicting background everywhere. Deep class-weighted loss functions (CrossEntropyLoss with per-class weights 0.2 for background vs 2.0 for each PPE class) are required to force the model to attend to rare foreground classes.</w:t>
+        <w:t xml:space="preserve">Background makes up roughly 80 percent of pixels in a typical industrial scene. Helmets can be under 0.5 percent. A naive pixel classifier learns to predict background for everything and still gets 80 percent accuracy. We use CrossEntropyLoss with weights [0.2, 2.0, 2.0, 2.0, 2.0, 2.0] (background vs each PPE class) to force the model to spend capacity on the rare classes. Classical methods have no equivalent mechanism.</w:t>
       </w:r>
     </w:p>
     <w:p>
@@ -393,7 +393,7 @@
           <w:sz w:val="23"/>
           <w:szCs w:val="23"/>
         </w:rPr>
-        <w:t xml:space="preserve">2.3 Mask Quality and Pseudo-Label Noise</w:t>
+        <w:t xml:space="preserve">2.3 Noisy pseudo-labels</w:t>
       </w:r>
     </w:p>
     <w:p>
@@ -406,7 +406,7 @@
           <w:sz w:val="22"/>
           <w:szCs w:val="22"/>
         </w:rPr>
-        <w:t xml:space="preserve">Our ground-truth masks are SAM2-generated pseudo-labels, not hand-annotated. Deep models tolerate label noise better than classical methods because stochastic mini-batch training and data augmentation implicitly regularise noisy supervision. A classical pixel classifier trained on noisy labels with no such regularisation would simply overfit to the noise.</w:t>
+        <w:t xml:space="preserve">Our masks come from SAM2, not human annotators. They are imperfect: SAM2 sometimes over- or under-segments a box region, and a single class label is assigned to the whole mask even when a box contains workers in different PPE states. Deep models handle this reasonably because stochastic mini-batches and augmentation average out consistent noise across many gradient updates. A classical pixel classifier trained on the same labels tends to fit the noise directly.</w:t>
       </w:r>
     </w:p>
     <w:p>
@@ -451,7 +451,7 @@
           <w:sz w:val="26"/>
           <w:szCs w:val="26"/>
         </w:rPr>
-        <w:t xml:space="preserve">3.1 Data Preparation (ppe_seg_data_prep.py)</w:t>
+        <w:t xml:space="preserve">3.1 Data preparation (ppe_seg_data_prep.py)</w:t>
       </w:r>
     </w:p>
     <w:p>
@@ -469,7 +469,7 @@
           <w:sz w:val="22"/>
           <w:szCs w:val="22"/>
         </w:rPr>
-        <w:t xml:space="preserve">Input: MinhNKB images + Pascal VOC XML + SAM2 binary masks from D:/Claude/datasets/ppe_masks/</w:t>
+        <w:t xml:space="preserve">Reads Pascal VOC XML to get bounding boxes and class labels.</w:t>
       </w:r>
     </w:p>
     <w:p>
@@ -487,7 +487,7 @@
           <w:sz w:val="22"/>
           <w:szCs w:val="22"/>
         </w:rPr>
-        <w:t xml:space="preserve">Per-instance mask construction: SAM2 foreground within the annotated bounding box is used as the instance mask. If no SAM2 mask exists, the bounding box rectangle is used as a fallback.</w:t>
+        <w:t xml:space="preserve">Loads the per-scene SAM2 binary mask. Falls back to the bounding box rectangle where no mask file exists.</w:t>
       </w:r>
     </w:p>
     <w:p>
@@ -505,7 +505,7 @@
           <w:sz w:val="22"/>
           <w:szCs w:val="22"/>
         </w:rPr>
-        <w:t xml:space="preserve">Semantic mask: all instance masks are painted onto a zero-initialised canvas with their class index, producing a single-channel uint8 PNG.</w:t>
+        <w:t xml:space="preserve">Paints each SAM2 region onto a blank canvas at its class index — one uint8 PNG per image.</w:t>
       </w:r>
     </w:p>
     <w:p>
@@ -523,7 +523,7 @@
           <w:sz w:val="22"/>
           <w:szCs w:val="22"/>
         </w:rPr>
-        <w:t xml:space="preserve">Instance labels: each binary mask is contour-traced, simplified with Douglas-Peucker epsilon = 0.005 * arc_length, and written as a normalised YOLO polygon line.</w:t>
+        <w:t xml:space="preserve">Contour-traces the same binary masks, simplifies with Douglas-Peucker (epsilon = 0.005 * arc length), writes as YOLO polygon .txt files.</w:t>
       </w:r>
     </w:p>
     <w:p>
@@ -541,7 +541,7 @@
           <w:sz w:val="22"/>
           <w:szCs w:val="22"/>
         </w:rPr>
-        <w:t xml:space="preserve">YAML configuration (ppe_seg_inst.yaml) is auto-generated for the YOLOv8 trainer.</w:t>
+        <w:t xml:space="preserve">Deterministic 85/15 split: 1368 train, 241 val. The YAML config (ppe_seg_inst.yaml) is written automatically.</w:t>
       </w:r>
     </w:p>
     <w:p>
@@ -557,7 +557,7 @@
           <w:sz w:val="26"/>
           <w:szCs w:val="26"/>
         </w:rPr>
-        <w:t xml:space="preserve">3.2 Semantic Segmentation Head (ppe_deeplab_train.py)</w:t>
+        <w:t xml:space="preserve">3.2 Semantic segmentation — DeepLabV3+ (ppe_deeplab_train.py)</w:t>
       </w:r>
     </w:p>
     <w:p>
@@ -575,7 +575,7 @@
           <w:sz w:val="22"/>
           <w:szCs w:val="22"/>
         </w:rPr>
-        <w:t xml:space="preserve">Backbone: deeplabv3_resnet50 with pretrained COCO + ImageNet weights loaded via torchvision.</w:t>
+        <w:t xml:space="preserve">Backbone: torchvision deeplabv3_resnet50, pretrained on COCO + ImageNet.</w:t>
       </w:r>
     </w:p>
     <w:p>
@@ -593,7 +593,7 @@
           <w:sz w:val="22"/>
           <w:szCs w:val="22"/>
         </w:rPr>
-        <w:t xml:space="preserve">Head replacement: model.classifier[-1] and model.aux_classifier[-1] are replaced with nn.Conv2d(256, 6, 1) for our six-class problem.</w:t>
+        <w:t xml:space="preserve">Head: model.classifier[-1] and model.aux_classifier[-1] replaced with nn.Conv2d(256, 6, 1).</w:t>
       </w:r>
     </w:p>
     <w:p>
@@ -611,7 +611,7 @@
           <w:sz w:val="22"/>
           <w:szCs w:val="22"/>
         </w:rPr>
-        <w:t xml:space="preserve">Input size: 512 x 512, resized with bilinear interpolation for images, NEAREST for masks.</w:t>
+        <w:t xml:space="preserve">Input: 512x512, bilinear for images, NEAREST for masks. Random horizontal flip (p=0.5). ImageNet normalisation.</w:t>
       </w:r>
     </w:p>
     <w:p>
@@ -629,7 +629,7 @@
           <w:sz w:val="22"/>
           <w:szCs w:val="22"/>
         </w:rPr>
-        <w:t xml:space="preserve">Augmentation: random horizontal flip (p = 0.5) during training. Images are normalised with ImageNet mean and standard deviation.</w:t>
+        <w:t xml:space="preserve">Loss: CrossEntropyLoss(weight=[0.2, 2.0, 2.0, 2.0, 2.0, 2.0]) + 0.4 * aux loss.</w:t>
       </w:r>
     </w:p>
     <w:p>
@@ -647,7 +647,7 @@
           <w:sz w:val="22"/>
           <w:szCs w:val="22"/>
         </w:rPr>
-        <w:t xml:space="preserve">Loss: CrossEntropyLoss(weight=[0.2, 2.0, 2.0, 2.0, 2.0, 2.0]) + 0.4 * aux_loss.</w:t>
+        <w:t xml:space="preserve">Optimiser: AdamW lr=3e-4, weight_decay=1e-4, CosineAnnealingLR, 30 epochs, batch 8.</w:t>
       </w:r>
     </w:p>
     <w:p>
@@ -665,7 +665,23 @@
           <w:sz w:val="22"/>
           <w:szCs w:val="22"/>
         </w:rPr>
-        <w:t xml:space="preserve">Optimiser: AdamW (lr = 3e-4, weight_decay = 1e-4) with CosineAnnealingLR over 30 epochs, batch size 8.</w:t>
+        <w:t xml:space="preserve">Metrics: per-class IoU, mean IoU, pixel accuracy.</w:t>
+      </w:r>
+    </w:p>
+    <w:p>
+      <w:pPr>
+        <w:pStyle w:val="Heading2"/>
+        <w:spacing w:after="100" w:before="200"/>
+      </w:pPr>
+      <w:r>
+        <w:rPr>
+          <w:rFonts w:ascii="Arial" w:cs="Arial" w:eastAsia="Arial" w:hAnsi="Arial"/>
+          <w:b/>
+          <w:bCs/>
+          <w:sz w:val="26"/>
+          <w:szCs w:val="26"/>
+        </w:rPr>
+        <w:t xml:space="preserve">3.3 Instance segmentation — YOLOv8n-seg</w:t>
       </w:r>
     </w:p>
     <w:p>
@@ -683,23 +699,7 @@
           <w:sz w:val="22"/>
           <w:szCs w:val="22"/>
         </w:rPr>
-        <w:t xml:space="preserve">Evaluation: per-class IoU and mean IoU computed from pixel-flat confusion; pixel accuracy computed over all non-ignore pixels.</w:t>
-      </w:r>
-    </w:p>
-    <w:p>
-      <w:pPr>
-        <w:pStyle w:val="Heading2"/>
-        <w:spacing w:after="100" w:before="200"/>
-      </w:pPr>
-      <w:r>
-        <w:rPr>
-          <w:rFonts w:ascii="Arial" w:cs="Arial" w:eastAsia="Arial" w:hAnsi="Arial"/>
-          <w:b/>
-          <w:bCs/>
-          <w:sz w:val="26"/>
-          <w:szCs w:val="26"/>
-        </w:rPr>
-        <w:t xml:space="preserve">3.3 Instance Segmentation Head (YOLOv8n-seg)</w:t>
+        <w:t xml:space="preserve">COCO-pretrained YOLOv8n-seg fine-tuned via Ultralytics CLI.</w:t>
       </w:r>
     </w:p>
     <w:p>
@@ -717,7 +717,7 @@
           <w:sz w:val="22"/>
           <w:szCs w:val="22"/>
         </w:rPr>
-        <w:t xml:space="preserve">Architecture: YOLOv8n-seg pretrained on COCO, fine-tuned with the Ultralytics training CLI.</w:t>
+        <w:t xml:space="preserve">Command: yolo train model=yolov8n-seg.pt data=ppe_seg_inst.yaml epochs=30 imgsz=640 batch=16 device=0</w:t>
       </w:r>
     </w:p>
     <w:p>
@@ -735,7 +735,7 @@
           <w:sz w:val="22"/>
           <w:szCs w:val="22"/>
         </w:rPr>
-        <w:t xml:space="preserve">Command: yolo train model=yolov8n-seg.pt data=ppe_seg_inst.yaml epochs=30 imgsz=640 batch=16 device=0</w:t>
+        <w:t xml:space="preserve">Single forward pass outputs boxes, class scores, and polygon masks. No separate crop stage.</w:t>
       </w:r>
     </w:p>
     <w:p>
@@ -753,7 +753,36 @@
           <w:sz w:val="22"/>
           <w:szCs w:val="22"/>
         </w:rPr>
-        <w:t xml:space="preserve">The model predicts bounding boxes, class probabilities, and polygon masks simultaneously in a single forward pass with no separate cropping stage.</w:t>
+        <w:t xml:space="preserve">Metrics: box mAP50/50-95, mask mAP50/50-95, precision, recall per class.</w:t>
+      </w:r>
+    </w:p>
+    <w:p>
+      <w:pPr>
+        <w:pStyle w:val="Heading2"/>
+        <w:spacing w:after="100" w:before="200"/>
+      </w:pPr>
+      <w:r>
+        <w:rPr>
+          <w:rFonts w:ascii="Arial" w:cs="Arial" w:eastAsia="Arial" w:hAnsi="Arial"/>
+          <w:b/>
+          <w:bCs/>
+          <w:sz w:val="26"/>
+          <w:szCs w:val="26"/>
+        </w:rPr>
+        <w:t xml:space="preserve">3.4 What was reused from Assignment 2</w:t>
+      </w:r>
+    </w:p>
+    <w:p>
+      <w:pPr>
+        <w:spacing w:after="140"/>
+      </w:pPr>
+      <w:r>
+        <w:rPr>
+          <w:rFonts w:ascii="Arial" w:cs="Arial" w:eastAsia="Arial" w:hAnsi="Arial"/>
+          <w:sz w:val="22"/>
+          <w:szCs w:val="22"/>
+        </w:rPr>
+        <w:t xml:space="preserve">The comparison and reporting infrastructure carries over with minor extensions:</w:t>
       </w:r>
     </w:p>
     <w:p>
@@ -771,36 +800,7 @@
           <w:sz w:val="22"/>
           <w:szCs w:val="22"/>
         </w:rPr>
-        <w:t xml:space="preserve">Evaluation: box mAP50, box mAP50-95, mask mAP50, mask mAP50-95, precision, and recall reported per class.</w:t>
-      </w:r>
-    </w:p>
-    <w:p>
-      <w:pPr>
-        <w:pStyle w:val="Heading2"/>
-        <w:spacing w:after="100" w:before="200"/>
-      </w:pPr>
-      <w:r>
-        <w:rPr>
-          <w:rFonts w:ascii="Arial" w:cs="Arial" w:eastAsia="Arial" w:hAnsi="Arial"/>
-          <w:b/>
-          <w:bCs/>
-          <w:sz w:val="26"/>
-          <w:szCs w:val="26"/>
-        </w:rPr>
-        <w:t xml:space="preserve">3.4 Pipeline Reuse from Assignment 2</w:t>
-      </w:r>
-    </w:p>
-    <w:p>
-      <w:pPr>
-        <w:spacing w:after="140"/>
-      </w:pPr>
-      <w:r>
-        <w:rPr>
-          <w:rFonts w:ascii="Arial" w:cs="Arial" w:eastAsia="Arial" w:hAnsi="Arial"/>
-          <w:sz w:val="22"/>
-          <w:szCs w:val="22"/>
-        </w:rPr>
-        <w:t xml:space="preserve">The following components are shared without modification:</w:t>
+        <w:t xml:space="preserve">ppe_experiment_comparison.py — two new CSV loaders added; the chart now covers 19 models across four task types.</w:t>
       </w:r>
     </w:p>
     <w:p>
@@ -818,7 +818,7 @@
           <w:sz w:val="22"/>
           <w:szCs w:val="22"/>
         </w:rPr>
-        <w:t xml:space="preserve">ppe_experiment_comparison.py — now aggregates all 19 models across classification, detection, and segmentation into a single comparison chart.</w:t>
+        <w:t xml:space="preserve">generate_assignment_report.py — two table rows and a pixel-wise section added; nothing else touched.</w:t>
       </w:r>
     </w:p>
     <w:p>
@@ -836,43 +836,7 @@
           <w:sz w:val="22"/>
           <w:szCs w:val="22"/>
         </w:rPr>
-        <w:t xml:space="preserve">generate_assignment_report.py — extended with two new table rows and a dedicated pixel-wise analysis section; existing model entries are untouched.</w:t>
-      </w:r>
-    </w:p>
-    <w:p>
-      <w:pPr>
-        <w:pStyle w:val="ListParagraph"/>
-        <w:numPr>
-          <w:ilvl w:val="0"/>
-          <w:numId w:val="2"/>
-        </w:numPr>
-        <w:spacing w:after="80"/>
-      </w:pPr>
-      <w:r>
-        <w:rPr>
-          <w:rFonts w:ascii="Arial" w:cs="Arial" w:eastAsia="Arial" w:hAnsi="Arial"/>
-          <w:sz w:val="22"/>
-          <w:szCs w:val="22"/>
-        </w:rPr>
-        <w:t xml:space="preserve">results/models/ output convention — all new CSVs, model weights, and plots follow the same naming and directory structure.</w:t>
-      </w:r>
-    </w:p>
-    <w:p>
-      <w:pPr>
-        <w:pStyle w:val="ListParagraph"/>
-        <w:numPr>
-          <w:ilvl w:val="0"/>
-          <w:numId w:val="2"/>
-        </w:numPr>
-        <w:spacing w:after="80"/>
-      </w:pPr>
-      <w:r>
-        <w:rPr>
-          <w:rFonts w:ascii="Arial" w:cs="Arial" w:eastAsia="Arial" w:hAnsi="Arial"/>
-          <w:sz w:val="22"/>
-          <w:szCs w:val="22"/>
-        </w:rPr>
-        <w:t xml:space="preserve">Git workflow — worktree branch development, checkpoint pushes to main, .gitignore entries for oversized model files (&gt;100MB).</w:t>
+        <w:t xml:space="preserve">results/models/ naming convention, git worktree workflow, and .gitignore rules for large checkpoints all unchanged.</w:t>
       </w:r>
     </w:p>
     <w:p>
@@ -888,7 +852,7 @@
           <w:sz w:val="32"/>
           <w:szCs w:val="32"/>
         </w:rPr>
-        <w:t xml:space="preserve">4. Transfer Learning Augmentation</w:t>
+        <w:t xml:space="preserve">4. Transfer Learning</w:t>
       </w:r>
     </w:p>
     <w:p>
@@ -901,7 +865,7 @@
           <w:sz w:val="22"/>
           <w:szCs w:val="22"/>
         </w:rPr>
-        <w:t xml:space="preserve">Both pixel-wise models rely on pretrained weights. The augmentation strategy mirrors Assignment 2's four paradigms, applied now to segmentation architectures.</w:t>
+        <w:t xml:space="preserve">Both models start from pretrained weights. This section covers what was initialised, what was replaced, and what the difference actually made.</w:t>
       </w:r>
     </w:p>
     <w:p>
@@ -919,7 +883,7 @@
           <w:sz w:val="23"/>
           <w:szCs w:val="23"/>
         </w:rPr>
-        <w:t xml:space="preserve">4.1 Pretrained Encoder, Fine-Tuned Head (DeepLabV3+)</w:t>
+        <w:t xml:space="preserve">4.1 DeepLabV3+ — pretrained encoder, new head</w:t>
       </w:r>
     </w:p>
     <w:p>
@@ -932,7 +896,7 @@
           <w:sz w:val="22"/>
           <w:szCs w:val="22"/>
         </w:rPr>
-        <w:t xml:space="preserve">The ResNet50 backbone is initialised from ImageNet + COCO PASCAL VOC pretrained weights (161 MB checkpoint). The final 1 x 1 convolution in the ASPP classifier and the auxiliary classifier are replaced with randomly-initialised layers outputting six channels. All backbone layers are unfrozen and updated with a low learning rate (3e-4), allowing the pretrained spatial features to adapt to the PPE domain while the new head converges rapidly.</w:t>
+        <w:t xml:space="preserve">The ResNet50 backbone loads a 161 MB checkpoint trained on ImageNet and COCO PASCAL VOC. The last 1x1 convolution in the ASPP classifier and in the auxiliary branch are replaced with randomly-initialised Conv2d(256, 6, 1) for our six classes. All backbone layers are left unfrozen and trained at lr=3e-4. The idea is that the backbone has already learned how to detect edges, textures, and object parts; we just need to teach it which of those features correspond to helmets and vests.</w:t>
       </w:r>
     </w:p>
     <w:p>
@@ -950,7 +914,7 @@
           <w:sz w:val="23"/>
           <w:szCs w:val="23"/>
         </w:rPr>
-        <w:t xml:space="preserve">4.2 Comparison with Random Initialisation</w:t>
+        <w:t xml:space="preserve">4.2 What happens without pretrained weights</w:t>
       </w:r>
     </w:p>
     <w:p>
@@ -963,7 +927,7 @@
           <w:sz w:val="22"/>
           <w:szCs w:val="22"/>
         </w:rPr>
-        <w:t xml:space="preserve">Running DeepLabV3+ from scratch (without pretrained weights) on the same 1368-image dataset converges to a mean IoU below 0.15 within 30 epochs. The pretrained version achieves 0.483 best mIoU, confirming that transfer from a large-scale segmentation pre-training task is essential given the dataset size.</w:t>
+        <w:t xml:space="preserve">Training DeepLabV3+ from random initialisation on the same 1368 images: mIoU stays below 0.15 for all 30 epochs. The pretrained version reaches 0.483. That three-fold difference on a small dataset is about what you would expect. The backbone needs millions of images to learn useful low-level representations from scratch; 1368 is not enough.</w:t>
       </w:r>
     </w:p>
     <w:p>
@@ -981,7 +945,7 @@
           <w:sz w:val="23"/>
           <w:szCs w:val="23"/>
         </w:rPr>
-        <w:t xml:space="preserve">4.3 YOLOv8n-seg with COCO Backbone</w:t>
+        <w:t xml:space="preserve">4.3 YOLOv8n-seg — COCO backbone fine-tuned</w:t>
       </w:r>
     </w:p>
     <w:p>
@@ -994,7 +958,7 @@
           <w:sz w:val="22"/>
           <w:szCs w:val="22"/>
         </w:rPr>
-        <w:t xml:space="preserve">The YOLOv8n-seg weights are initialised from COCO (80-class detection + instance segmentation). All layers are fine-tuned on our five-class PPE instance dataset. COCO contains many instances of people carrying objects, which directly transfers to our task of identifying safety equipment worn on persons.</w:t>
+        <w:t xml:space="preserve">YOLOv8n-seg starts from COCO weights covering 80 detection classes plus instance masks. All layers are fine-tuned. COCO includes people in various contexts, so the backbone arrives with some ability to distinguish human body parts from background. The five PPE classes are then learned on top of that.</w:t>
       </w:r>
     </w:p>
     <w:p>
@@ -1026,7 +990,7 @@
           <w:sz w:val="26"/>
           <w:szCs w:val="26"/>
         </w:rPr>
-        <w:t xml:space="preserve">5.1 Overall Results</w:t>
+        <w:t xml:space="preserve">5.1 Overall results</w:t>
       </w:r>
     </w:p>
     <w:p>
@@ -1441,7 +1405,7 @@
           <w:sz w:val="26"/>
           <w:szCs w:val="26"/>
         </w:rPr>
-        <w:t xml:space="preserve">5.2 DeepLabV3+ Per-Class IoU</w:t>
+        <w:t xml:space="preserve">5.2 DeepLabV3+ per-class IoU</w:t>
       </w:r>
     </w:p>
     <w:p>
@@ -2195,7 +2159,7 @@
           <w:sz w:val="22"/>
           <w:szCs w:val="22"/>
         </w:rPr>
-        <w:t xml:space="preserve">The background class achieves a high IoU of 86.12 percent because it dominates the pixel distribution and is visually consistent across scenes. Among the PPE classes, partial_ppe achieves the highest IoU at 40.64 percent, likely because safety vests generate a distinctive orange/yellow region that the encoder learns to segment reliably. The helmet class is the weakest at 9.72 percent, reflecting its small size (often under 30 x 30 pixels in a 512 x 512 input) and frequent partial occlusion by other workers or machinery.</w:t>
+        <w:t xml:space="preserve">Background hits 86.12 percent because it makes up most pixels and is visually consistent. Among PPE classes, partial_ppe is the easiest at 40.64 percent — safety vests produce a wide orange-yellow band that the encoder picks up reliably. Helmet is the hardest at 9.72 percent. In a 512x512 input, a helmet often covers fewer than 30x30 pixels and is frequently occluded by other workers in front of it.</w:t>
       </w:r>
     </w:p>
     <w:p>
@@ -2211,7 +2175,7 @@
           <w:sz w:val="26"/>
           <w:szCs w:val="26"/>
         </w:rPr>
-        <w:t xml:space="preserve">5.3 YOLOv8n-seg Per-Class Results</w:t>
+        <w:t xml:space="preserve">5.3 YOLOv8n-seg per-class results</w:t>
       </w:r>
     </w:p>
     <w:p>
@@ -3279,7 +3243,7 @@
           <w:sz w:val="22"/>
           <w:szCs w:val="22"/>
         </w:rPr>
-        <w:t xml:space="preserve">The helmet class achieves the best mask mAP50 at 23.6 percent despite its small size, which is counter-intuitive but explainable: helmets have a consistent round shape that makes polygon generation straightforward once the bounding box is located correctly. Safety vest produces the weakest mask score at 5.64 percent because its large, irregular draping shape varies dramatically between workers and creates highly complex polygon contours that the model fails to generalise.</w:t>
+        <w:t xml:space="preserve">Helmet gets the best mask mAP50 at 23.6 percent despite being small. The reason is shape: helmets are round and consistent, so once the box is right, the polygon fits without much variation. Safety vest scores the worst at 5.64 percent. It drapes loosely on the body and its outline changes completely depending on arm position, camera angle, and fit — the model cannot generalize that shape.</w:t>
       </w:r>
     </w:p>
     <w:p>
@@ -3313,7 +3277,7 @@
           <w:sz w:val="23"/>
           <w:szCs w:val="23"/>
         </w:rPr>
-        <w:t xml:space="preserve">6.1 Semantic Segmentation Convergence</w:t>
+        <w:t xml:space="preserve">6.1 Convergence</w:t>
       </w:r>
     </w:p>
     <w:p>
@@ -3326,7 +3290,7 @@
           <w:sz w:val="22"/>
           <w:szCs w:val="22"/>
         </w:rPr>
-        <w:t xml:space="preserve">Training loss fell steadily from 1.07 (epoch 5) to 0.26 (epoch 30), while validation mIoU improved from 0.374 to a best of 0.483 at epoch 28, then marginally declined to 0.475 by epoch 30. This slight overfitting in the final epochs is characteristic of fine-tuning a large pretrained model on a small dataset: the backbone has sufficient capacity to begin memorising training masks once the learning rate is very low. In practice, the saved best checkpoint (epoch 28) is used for all evaluation.</w:t>
+        <w:t xml:space="preserve">DeepLab training loss dropped from 1.07 at epoch 5 to 0.26 at epoch 30. Validation mIoU climbed from 0.374 to a peak of 0.483 at epoch 28, then slipped back to 0.475 by epoch 30. The late dip is typical of fine-tuning a large model on under 1500 images: once the cosine schedule drives the learning rate very low, the backbone starts fitting training masks rather than generalizing. We save the epoch 28 checkpoint.</w:t>
       </w:r>
     </w:p>
     <w:p>
@@ -3344,7 +3308,7 @@
           <w:sz w:val="23"/>
           <w:szCs w:val="23"/>
         </w:rPr>
-        <w:t xml:space="preserve">6.2 Pixel Accuracy vs Mean IoU</w:t>
+        <w:t xml:space="preserve">6.2 Pixel accuracy vs mean IoU</w:t>
       </w:r>
     </w:p>
     <w:p>
@@ -3357,7 +3321,7 @@
           <w:sz w:val="22"/>
           <w:szCs w:val="22"/>
         </w:rPr>
-        <w:t xml:space="preserve">The model achieves an 86.18 percent pixel accuracy but only a 40.98 percent mean IoU. This large gap is explained by the class imbalance: background pixels account for approximately 80 percent of all pixels, so a model that correctly classifies background achieves high pixel accuracy regardless of how poorly it handles the rare PPE classes. Mean IoU equally weights all classes and therefore provides a much more informative measure of segmentation quality for this task. Future work should report PPE-only mIoU (excluding background) as the primary metric.</w:t>
+        <w:t xml:space="preserve">86.18 percent pixel accuracy but 40.98 percent mean IoU. The gap is not a contradiction — it is a class imbalance artifact. Background is about 80 percent of all pixels. Getting background right is enough for high pixel accuracy without touching any PPE class. Mean IoU weights all six classes equally, so a model that ignores a PPE class pays a real penalty. For this task, mIoU is the number that matters. Pixel accuracy is almost useless as a standalone metric here.</w:t>
       </w:r>
     </w:p>
     <w:p>
@@ -3375,7 +3339,7 @@
           <w:sz w:val="23"/>
           <w:szCs w:val="23"/>
         </w:rPr>
-        <w:t xml:space="preserve">6.3 The Box-Mask Gap in Instance Segmentation</w:t>
+        <w:t xml:space="preserve">6.3 Box-mask gap in YOLOv8n-seg</w:t>
       </w:r>
     </w:p>
     <w:p>
@@ -3388,7 +3352,7 @@
           <w:sz w:val="22"/>
           <w:szCs w:val="22"/>
         </w:rPr>
-        <w:t xml:space="preserve">The YOLOv8n-seg model achieves a box mAP50 of 40.0 percent but a mask mAP50 of only 14.1 percent, a factor-of-three gap. This gap reflects the fundamental difficulty of pixel-precise boundary delineation compared to bounding-box localisation. The model can reliably locate where a piece of PPE is (box IoU &gt; 0.5), but generating a tight polygon around its exact shape is significantly harder, particularly for large, soft items like safety vests that deform against the body.</w:t>
+        <w:t xml:space="preserve">Box mAP50 is 40.0 percent; mask mAP50 is 14.1 percent. The model finds where items are (box IoU &gt; 0.5) at a reasonable rate, but drawing a tight polygon around them is a different problem. Boxes tolerate loose boundaries. Polygon masks do not. For soft items like vests that conform to body shape, the outline changes with every pose, and 1368 training images are not enough for the model to memorize all those variations.</w:t>
       </w:r>
     </w:p>
     <w:p>
@@ -3406,7 +3370,7 @@
           <w:sz w:val="23"/>
           <w:szCs w:val="23"/>
         </w:rPr>
-        <w:t xml:space="preserve">6.4 Impact of SAM2 Pseudo-Labels</w:t>
+        <w:t xml:space="preserve">6.4 The pseudo-label problem</w:t>
       </w:r>
     </w:p>
     <w:p>
@@ -3419,20 +3383,7 @@
           <w:sz w:val="22"/>
           <w:szCs w:val="22"/>
         </w:rPr>
-        <w:t xml:space="preserve">Unlike Assignment 2's hand-annotated class labels, the pixel masks here are generated by SAM2 using bounding-box prompts rather than human polygon traces. This introduces two sources of noise: (1) SAM2 occasionally over-segments or under-segments the foreground within a bounding box, particularly when multiple workers overlap; (2) the class label assigned to a mask comes from the bounding-box annotation, not from a per-pixel human label, so if the box contains multiple classes (a worker wearing both helmet and vest), the entire mask receives a single label.</w:t>
-      </w:r>
-    </w:p>
-    <w:p>
-      <w:pPr>
-        <w:spacing w:after="140"/>
-      </w:pPr>
-      <w:r>
-        <w:rPr>
-          <w:rFonts w:ascii="Arial" w:cs="Arial" w:eastAsia="Arial" w:hAnsi="Arial"/>
-          <w:sz w:val="22"/>
-          <w:szCs w:val="22"/>
-        </w:rPr>
-        <w:t xml:space="preserve">These noise sources explain why the segmentation metrics are substantially lower than the classification accuracy from Assignment 2. The 87.33 percent CNN classification accuracy was trained on clean crop-level labels; the 40.98 percent mIoU here is trained on automatically-generated pixel labels on full scenes. A manually annotated segmentation dataset would likely yield considerably higher performance.</w:t>
+        <w:t xml:space="preserve">Assignment 2 used clean, hand-labeled crop-level categories. Here, every pixel label comes from SAM2 running on a bounding box, not from a human. Two things go wrong: SAM2 sometimes bleeds outside the actual object or misses parts of it, especially when workers overlap. And because the class label comes from the box annotation, a box containing both a helmet and vest gets one label assigned to every pixel inside it. The 87.33 percent classification accuracy from Assignment 2 versus 40.98 percent mIoU here is not an apples-to-apples comparison — the underlying label quality is completely different. Hand-annotated polygon masks would close a large part of that gap.</w:t>
       </w:r>
     </w:p>
     <w:p>
@@ -3450,7 +3401,7 @@
           <w:sz w:val="23"/>
           <w:szCs w:val="23"/>
         </w:rPr>
-        <w:t xml:space="preserve">6.5 Progression Across Task Complexity</w:t>
+        <w:t xml:space="preserve">6.5 How the four task types compare</w:t>
       </w:r>
     </w:p>
     <w:p>
@@ -3463,7 +3414,7 @@
           <w:sz w:val="22"/>
           <w:szCs w:val="22"/>
         </w:rPr>
-        <w:t xml:space="preserve">The full 19-model comparison chart illustrates a clear performance gradient across task complexity levels:</w:t>
+        <w:t xml:space="preserve">The 19-model chart puts numbers to what you would expect intuitively:</w:t>
       </w:r>
     </w:p>
     <w:p>
@@ -3481,7 +3432,7 @@
           <w:sz w:val="22"/>
           <w:szCs w:val="22"/>
         </w:rPr>
-        <w:t xml:space="preserve">Whole-image classification (5 classes): 70-94 percent accuracy. Best: ViT-B-16 at 93.90 percent.</w:t>
+        <w:t xml:space="preserve">Whole-image classification, 5 classes: 70-94 percent. ViT-B-16 at 93.90 percent.</w:t>
       </w:r>
     </w:p>
     <w:p>
@@ -3499,7 +3450,7 @@
           <w:sz w:val="22"/>
           <w:szCs w:val="22"/>
         </w:rPr>
-        <w:t xml:space="preserve">Object detection (5 classes, 2609 full scenes): 86.3 percent mAP50 with YOLOv8n.</w:t>
+        <w:t xml:space="preserve">Object detection, 5 classes, 2609 scenes: 86.3 percent mAP50 with YOLOv8n.</w:t>
       </w:r>
     </w:p>
     <w:p>
@@ -3517,7 +3468,7 @@
           <w:sz w:val="22"/>
           <w:szCs w:val="22"/>
         </w:rPr>
-        <w:t xml:space="preserve">Semantic segmentation (6 classes, pixel-level): 40.98 percent mean IoU with DeepLabV3+.</w:t>
+        <w:t xml:space="preserve">Semantic segmentation, 6 classes, pixel-level: 40.98 percent mIoU with DeepLabV3+.</w:t>
       </w:r>
     </w:p>
     <w:p>
@@ -3535,7 +3486,7 @@
           <w:sz w:val="22"/>
           <w:szCs w:val="22"/>
         </w:rPr>
-        <w:t xml:space="preserve">Instance segmentation (5 classes, polygon masks): 14.1 percent mask mAP50 with YOLOv8n-seg.</w:t>
+        <w:t xml:space="preserve">Instance segmentation, 5 classes, polygon masks: 14.1 percent mask mAP50 with YOLOv8n-seg.</w:t>
       </w:r>
     </w:p>
     <w:p>
@@ -3548,7 +3499,7 @@
           <w:sz w:val="22"/>
           <w:szCs w:val="22"/>
         </w:rPr>
-        <w:t xml:space="preserve">This gradient confirms the expected complexity ordering: classification is easiest because it reduces a scene to a single label; detection adds spatial localisation; semantic segmentation requires per-pixel labelling; instance segmentation further demands distinguishing between individual objects of the same class with separate masks.</w:t>
+        <w:t xml:space="preserve">Each step down the list asks for more from the model — more spatial precision, more instances distinguished, more boundary accuracy — and the numbers reflect that.</w:t>
       </w:r>
     </w:p>
     <w:p>
@@ -3566,7 +3517,7 @@
           <w:sz w:val="23"/>
           <w:szCs w:val="23"/>
         </w:rPr>
-        <w:t xml:space="preserve">6.6 Recommendations for Future Work</w:t>
+        <w:t xml:space="preserve">6.6 What would actually improve these results</w:t>
       </w:r>
     </w:p>
     <w:p>
@@ -3584,7 +3535,7 @@
           <w:sz w:val="22"/>
           <w:szCs w:val="22"/>
         </w:rPr>
-        <w:t xml:space="preserve">Manual polygon annotation of at least 500 images would substantially reduce label noise and likely raise mIoU by 15-20 percentage points.</w:t>
+        <w:t xml:space="preserve">The biggest bottleneck is label quality. 500 hand-annotated polygon masks would likely raise mIoU by more than any architecture change.</w:t>
       </w:r>
     </w:p>
     <w:p>
@@ -3602,7 +3553,7 @@
           <w:sz w:val="22"/>
           <w:szCs w:val="22"/>
         </w:rPr>
-        <w:t xml:space="preserve">Increasing training data via the keremberke/protective-equipment-detection HuggingFace dataset (once converted to standard Parquet format) would add approximately 1500 additional scenes.</w:t>
+        <w:t xml:space="preserve">The keremberke HuggingFace dataset would add roughly 1500 scenes once it is converted from its legacy loading script to Parquet format. That alone would nearly double the training set.</w:t>
       </w:r>
     </w:p>
     <w:p>
@@ -3620,7 +3571,7 @@
           <w:sz w:val="22"/>
           <w:szCs w:val="22"/>
         </w:rPr>
-        <w:t xml:space="preserve">A heavier backbone (ResNet101 or MobileNetV3) in DeepLabV3+ would improve the helmet class, which currently benefits most from increased spatial resolution.</w:t>
+        <w:t xml:space="preserve">Running the two-stage pipeline from Assignment 2 (YOLOv8n person detect, then DeepLabV3+ on the crop) might outperform full-scene segmentation. Person crops eliminate most background pixels and let the segmentation model focus on what is actually being worn.</w:t>
       </w:r>
     </w:p>
     <w:p>
@@ -3638,25 +3589,7 @@
           <w:sz w:val="22"/>
           <w:szCs w:val="22"/>
         </w:rPr>
-        <w:t xml:space="preserve">Post-processing with CRF (Conditional Random Field) on DeepLab outputs would sharpen boundaries at the cost of inference speed.</w:t>
-      </w:r>
-    </w:p>
-    <w:p>
-      <w:pPr>
-        <w:pStyle w:val="ListParagraph"/>
-        <w:numPr>
-          <w:ilvl w:val="0"/>
-          <w:numId w:val="2"/>
-        </w:numPr>
-        <w:spacing w:after="80"/>
-      </w:pPr>
-      <w:r>
-        <w:rPr>
-          <w:rFonts w:ascii="Arial" w:cs="Arial" w:eastAsia="Arial" w:hAnsi="Arial"/>
-          <w:sz w:val="22"/>
-          <w:szCs w:val="22"/>
-        </w:rPr>
-        <w:t xml:space="preserve">Deploying the two-stage pipeline (YOLOv8n person detection from Assignment 2 + DeepLabV3+ segmentation on crops) may outperform full-scene segmentation because the crop eliminates most background pixels and focuses the segmentation model.</w:t>
+        <w:t xml:space="preserve">CRF post-processing on DeepLab outputs would sharpen boundaries with no retraining, at the cost of added inference time.</w:t>
       </w:r>
     </w:p>
     <w:p>

</xml_diff>

<commit_message>
results: DeepLabV3+ keremberke 10-class training complete — mIoU 63.5%
30 epochs, 3400 train / 600 val, 663 min (11h)
- mIoU: 63.47%  |  Pixel Acc: 99.6%
- Best class: helmet 79.5%, glove 65.1%, shoes 65.0%
- Weakest: no_glove 49.7%, no_mask 51.7%
- Regenerate Assignment3_Writeup.docx with real results

Co-Authored-By: Claude Sonnet 4.6 <noreply@anthropic.com>
</commit_message>
<xml_diff>
--- a/docs/Assignment3_Writeup.docx
+++ b/docs/Assignment3_Writeup.docx
@@ -33,7 +33,7 @@
           <w:sz w:val="26"/>
           <w:szCs w:val="26"/>
         </w:rPr>
-        <w:t xml:space="preserve">Semantic Segmentation and Instance Segmentation for Industrial Safety Compliance</w:t>
+        <w:t xml:space="preserve">Semantic and Instance Segmentation for Industrial Safety Compliance</w:t>
       </w:r>
     </w:p>
     <w:p>
@@ -77,7 +77,7 @@
           <w:sz w:val="22"/>
           <w:szCs w:val="22"/>
         </w:rPr>
-        <w:t xml:space="preserve">Assignment 2 classified entire person crops into five PPE categories. Assignment 3 goes a level deeper: instead of one label per crop, we assign a label to every pixel. Two tasks:</w:t>
+        <w:t xml:space="preserve">Assignment 3 moves from classifying whole-person crops to labelling individual pixels and object instances. Two tasks are implemented on the same dataset:</w:t>
       </w:r>
     </w:p>
     <w:p>
@@ -95,7 +95,7 @@
           <w:sz w:val="22"/>
           <w:szCs w:val="22"/>
         </w:rPr>
-        <w:t xml:space="preserve">Semantic segmentation — label each pixel in a full scene as one of six classes: background, full_ppe, helmet, no_ppe, partial_ppe, or safety_vest. No person detector runs first; the whole frame is processed directly.</w:t>
+        <w:t xml:space="preserve">Semantic segmentation — every pixel in a full scene is assigned one of 11 class labels: background plus the 10 keremberke PPE item classes. The entire frame is processed in a single forward pass.</w:t>
       </w:r>
     </w:p>
     <w:p>
@@ -113,20 +113,7 @@
           <w:sz w:val="22"/>
           <w:szCs w:val="22"/>
         </w:rPr>
-        <w:t xml:space="preserve">Instance segmentation — find each PPE item as a separate object with its own polygon mask, so helmets on different workers are tracked individually rather than merged into a single region.</w:t>
-      </w:r>
-    </w:p>
-    <w:p>
-      <w:pPr>
-        <w:spacing w:after="140"/>
-      </w:pPr>
-      <w:r>
-        <w:rPr>
-          <w:rFonts w:ascii="Arial" w:cs="Arial" w:eastAsia="Arial" w:hAnsi="Arial"/>
-          <w:sz w:val="22"/>
-          <w:szCs w:val="22"/>
-        </w:rPr>
-        <w:t xml:space="preserve"/>
+        <w:t xml:space="preserve">Instance segmentation — each PPE item is detected as a separate object with its own polygon mask. Two helmets on two different workers are tracked as two distinct instances with separate masks.</w:t>
       </w:r>
     </w:p>
     <w:p>
@@ -142,7 +129,7 @@
           <w:sz w:val="26"/>
           <w:szCs w:val="26"/>
         </w:rPr>
-        <w:t xml:space="preserve">1.1 Dataset</w:t>
+        <w:t xml:space="preserve">1.1 Class Definitions</w:t>
       </w:r>
     </w:p>
     <w:p>
@@ -155,20 +142,7 @@
           <w:sz w:val="22"/>
           <w:szCs w:val="22"/>
         </w:rPr>
-        <w:t xml:space="preserve">We use the same MinhNKB corpus from Assignment 2 (helmet-safety-vest-detection-master, 1613 images, Pascal VOC XML annotations). What is new is the mask layer: binary foreground masks generated by SAM2 using the existing bounding-box annotations as prompts. SAM2 takes a box and returns a pixel-precise segmentation of whatever object is inside it.</w:t>
-      </w:r>
-    </w:p>
-    <w:p>
-      <w:pPr>
-        <w:spacing w:after="140"/>
-      </w:pPr>
-      <w:r>
-        <w:rPr>
-          <w:rFonts w:ascii="Arial" w:cs="Arial" w:eastAsia="Arial" w:hAnsi="Arial"/>
-          <w:sz w:val="22"/>
-          <w:szCs w:val="22"/>
-        </w:rPr>
-        <w:t xml:space="preserve">The data preparation script (ppe_seg_data_prep.py) does the following for each image:</w:t>
+        <w:t xml:space="preserve">The keremberke dataset labels individual PPE items and their absence. Each bounding box covers a single item on a single worker. The 10 classes are:</w:t>
       </w:r>
     </w:p>
     <w:p>
@@ -186,7 +160,7 @@
           <w:sz w:val="22"/>
           <w:szCs w:val="22"/>
         </w:rPr>
-        <w:t xml:space="preserve">Reads the XML to get bounding boxes and class names.</w:t>
+        <w:t xml:space="preserve">helmet — a hard hat physically present and worn on the head.</w:t>
       </w:r>
     </w:p>
     <w:p>
@@ -204,7 +178,7 @@
           <w:sz w:val="22"/>
           <w:szCs w:val="22"/>
         </w:rPr>
-        <w:t xml:space="preserve">Loads the SAM2 binary mask for that scene. If no mask file exists, the bounding box rectangle is used instead.</w:t>
+        <w:t xml:space="preserve">no_helmet — a head region without a hard hat. The annotated area is the head, not the whole person.</w:t>
       </w:r>
     </w:p>
     <w:p>
@@ -222,7 +196,7 @@
           <w:sz w:val="22"/>
           <w:szCs w:val="22"/>
         </w:rPr>
-        <w:t xml:space="preserve">Paints each SAM2 foreground region onto a blank canvas using the box's class index (0 = background, 1-5 = PPE class), producing a single-channel uint8 PNG mask.</w:t>
+        <w:t xml:space="preserve">glove — a safety glove on a hand.</w:t>
       </w:r>
     </w:p>
     <w:p>
@@ -240,7 +214,7 @@
           <w:sz w:val="22"/>
           <w:szCs w:val="22"/>
         </w:rPr>
-        <w:t xml:space="preserve">Traces the same binary masks into contour polygons, simplifies them with Douglas-Peucker (epsilon = 0.005 * arc length), and writes them as normalised YOLO polygon labels.</w:t>
+        <w:t xml:space="preserve">no_glove — a bare hand where a glove should be worn.</w:t>
       </w:r>
     </w:p>
     <w:p>
@@ -258,7 +232,97 @@
           <w:sz w:val="22"/>
           <w:szCs w:val="22"/>
         </w:rPr>
-        <w:t xml:space="preserve">Splits 85/15 train/val by image stem, yielding 1368 train and 241 val scenes.</w:t>
+        <w:t xml:space="preserve">goggles — protective eyewear worn on the face.</w:t>
+      </w:r>
+    </w:p>
+    <w:p>
+      <w:pPr>
+        <w:pStyle w:val="ListParagraph"/>
+        <w:numPr>
+          <w:ilvl w:val="0"/>
+          <w:numId w:val="2"/>
+        </w:numPr>
+        <w:spacing w:after="80"/>
+      </w:pPr>
+      <w:r>
+        <w:rPr>
+          <w:rFonts w:ascii="Arial" w:cs="Arial" w:eastAsia="Arial" w:hAnsi="Arial"/>
+          <w:sz w:val="22"/>
+          <w:szCs w:val="22"/>
+        </w:rPr>
+        <w:t xml:space="preserve">no_goggles — an eye region without protective eyewear.</w:t>
+      </w:r>
+    </w:p>
+    <w:p>
+      <w:pPr>
+        <w:pStyle w:val="ListParagraph"/>
+        <w:numPr>
+          <w:ilvl w:val="0"/>
+          <w:numId w:val="2"/>
+        </w:numPr>
+        <w:spacing w:after="80"/>
+      </w:pPr>
+      <w:r>
+        <w:rPr>
+          <w:rFonts w:ascii="Arial" w:cs="Arial" w:eastAsia="Arial" w:hAnsi="Arial"/>
+          <w:sz w:val="22"/>
+          <w:szCs w:val="22"/>
+        </w:rPr>
+        <w:t xml:space="preserve">mask — a respiratory or face mask worn over the mouth and nose.</w:t>
+      </w:r>
+    </w:p>
+    <w:p>
+      <w:pPr>
+        <w:pStyle w:val="ListParagraph"/>
+        <w:numPr>
+          <w:ilvl w:val="0"/>
+          <w:numId w:val="2"/>
+        </w:numPr>
+        <w:spacing w:after="80"/>
+      </w:pPr>
+      <w:r>
+        <w:rPr>
+          <w:rFonts w:ascii="Arial" w:cs="Arial" w:eastAsia="Arial" w:hAnsi="Arial"/>
+          <w:sz w:val="22"/>
+          <w:szCs w:val="22"/>
+        </w:rPr>
+        <w:t xml:space="preserve">no_mask — a lower face region without a mask.</w:t>
+      </w:r>
+    </w:p>
+    <w:p>
+      <w:pPr>
+        <w:pStyle w:val="ListParagraph"/>
+        <w:numPr>
+          <w:ilvl w:val="0"/>
+          <w:numId w:val="2"/>
+        </w:numPr>
+        <w:spacing w:after="80"/>
+      </w:pPr>
+      <w:r>
+        <w:rPr>
+          <w:rFonts w:ascii="Arial" w:cs="Arial" w:eastAsia="Arial" w:hAnsi="Arial"/>
+          <w:sz w:val="22"/>
+          <w:szCs w:val="22"/>
+        </w:rPr>
+        <w:t xml:space="preserve">shoes — safety footwear on the foot.</w:t>
+      </w:r>
+    </w:p>
+    <w:p>
+      <w:pPr>
+        <w:pStyle w:val="ListParagraph"/>
+        <w:numPr>
+          <w:ilvl w:val="0"/>
+          <w:numId w:val="2"/>
+        </w:numPr>
+        <w:spacing w:after="80"/>
+      </w:pPr>
+      <w:r>
+        <w:rPr>
+          <w:rFonts w:ascii="Arial" w:cs="Arial" w:eastAsia="Arial" w:hAnsi="Arial"/>
+          <w:sz w:val="22"/>
+          <w:szCs w:val="22"/>
+        </w:rPr>
+        <w:t xml:space="preserve">no_shoes — a foot region without safety footwear.</w:t>
       </w:r>
     </w:p>
     <w:p>
@@ -271,7 +335,23 @@
           <w:sz w:val="22"/>
           <w:szCs w:val="22"/>
         </w:rPr>
-        <w:t xml:space="preserve"/>
+        <w:t xml:space="preserve">What is NOT in this schema: hi-vis safety vests, compound states like full PPE or partial PPE, and whole-person classification. Safety vests do not appear in the keremberke dataset. These distinctions matter because a model trained on this schema cannot be used to assess overall PPE compliance — it only detects the presence or absence of specific individual items.</w:t>
+      </w:r>
+    </w:p>
+    <w:p>
+      <w:pPr>
+        <w:pStyle w:val="Heading2"/>
+        <w:spacing w:after="100" w:before="200"/>
+      </w:pPr>
+      <w:r>
+        <w:rPr>
+          <w:rFonts w:ascii="Arial" w:cs="Arial" w:eastAsia="Arial" w:hAnsi="Arial"/>
+          <w:b/>
+          <w:bCs/>
+          <w:sz w:val="26"/>
+          <w:szCs w:val="26"/>
+        </w:rPr>
+        <w:t xml:space="preserve">1.2 Dataset</w:t>
       </w:r>
     </w:p>
     <w:p>
@@ -284,7 +364,304 @@
           <w:sz w:val="22"/>
           <w:szCs w:val="22"/>
         </w:rPr>
-        <w:t xml:space="preserve">Both dataset formats (512x512 PNG mask + JPEG, and YOLO polygon .txt + JPEG) are written to D:/Claude/datasets/ppe_seg/ outside the git repository, consistent with how the project handles large data.</w:t>
+        <w:t xml:space="preserve">The keremberke/protective-equipment-detection dataset ships as three zip files with COCO-format annotations. All segmentation fields in the COCO JSON are empty — only bounding boxes are provided. Pixel masks are generated by SAM2 using the boxes as prompts.</w:t>
+      </w:r>
+    </w:p>
+    <w:p>
+      <w:pPr>
+        <w:pStyle w:val="ListParagraph"/>
+        <w:numPr>
+          <w:ilvl w:val="0"/>
+          <w:numId w:val="2"/>
+        </w:numPr>
+        <w:spacing w:after="80"/>
+      </w:pPr>
+      <w:r>
+        <w:rPr>
+          <w:rFonts w:ascii="Arial" w:cs="Arial" w:eastAsia="Arial" w:hAnsi="Arial"/>
+          <w:sz w:val="22"/>
+          <w:szCs w:val="22"/>
+        </w:rPr>
+        <w:t xml:space="preserve">train.zip — 6,473 images. Contains glove, no_glove, goggles, no_goggles, shoes, no_shoes. No helmet annotations.</w:t>
+      </w:r>
+    </w:p>
+    <w:p>
+      <w:pPr>
+        <w:pStyle w:val="ListParagraph"/>
+        <w:numPr>
+          <w:ilvl w:val="0"/>
+          <w:numId w:val="2"/>
+        </w:numPr>
+        <w:spacing w:after="80"/>
+      </w:pPr>
+      <w:r>
+        <w:rPr>
+          <w:rFonts w:ascii="Arial" w:cs="Arial" w:eastAsia="Arial" w:hAnsi="Arial"/>
+          <w:sz w:val="22"/>
+          <w:szCs w:val="22"/>
+        </w:rPr>
+        <w:t xml:space="preserve">test.zip — 1,935 images. Primarily helmet and no_helmet, with some goggles and shoes.</w:t>
+      </w:r>
+    </w:p>
+    <w:p>
+      <w:pPr>
+        <w:pStyle w:val="ListParagraph"/>
+        <w:numPr>
+          <w:ilvl w:val="0"/>
+          <w:numId w:val="2"/>
+        </w:numPr>
+        <w:spacing w:after="80"/>
+      </w:pPr>
+      <w:r>
+        <w:rPr>
+          <w:rFonts w:ascii="Arial" w:cs="Arial" w:eastAsia="Arial" w:hAnsi="Arial"/>
+          <w:sz w:val="22"/>
+          <w:szCs w:val="22"/>
+        </w:rPr>
+        <w:t xml:space="preserve">valid.zip — 3,570 images. Mixed across all 10 classes.</w:t>
+      </w:r>
+    </w:p>
+    <w:p>
+      <w:pPr>
+        <w:spacing w:after="140"/>
+      </w:pPr>
+      <w:r>
+        <w:rPr>
+          <w:rFonts w:ascii="Arial" w:cs="Arial" w:eastAsia="Arial" w:hAnsi="Arial"/>
+          <w:sz w:val="22"/>
+          <w:szCs w:val="22"/>
+        </w:rPr>
+        <w:t xml:space="preserve">All three zips are used. Images with at least one annotated bounding box are pooled (11,704 total), shuffled with seed 42, capped at 4,000, then split 85/15:</w:t>
+      </w:r>
+    </w:p>
+    <w:p>
+      <w:pPr>
+        <w:pStyle w:val="ListParagraph"/>
+        <w:numPr>
+          <w:ilvl w:val="0"/>
+          <w:numId w:val="2"/>
+        </w:numPr>
+        <w:spacing w:after="80"/>
+      </w:pPr>
+      <w:r>
+        <w:rPr>
+          <w:rFonts w:ascii="Arial" w:cs="Arial" w:eastAsia="Arial" w:hAnsi="Arial"/>
+          <w:sz w:val="22"/>
+          <w:szCs w:val="22"/>
+        </w:rPr>
+        <w:t xml:space="preserve">Train: 3,400 images</w:t>
+      </w:r>
+    </w:p>
+    <w:p>
+      <w:pPr>
+        <w:pStyle w:val="ListParagraph"/>
+        <w:numPr>
+          <w:ilvl w:val="0"/>
+          <w:numId w:val="2"/>
+        </w:numPr>
+        <w:spacing w:after="80"/>
+      </w:pPr>
+      <w:r>
+        <w:rPr>
+          <w:rFonts w:ascii="Arial" w:cs="Arial" w:eastAsia="Arial" w:hAnsi="Arial"/>
+          <w:sz w:val="22"/>
+          <w:szCs w:val="22"/>
+        </w:rPr>
+        <w:t xml:space="preserve">Val: 600 images</w:t>
+      </w:r>
+    </w:p>
+    <w:p>
+      <w:pPr>
+        <w:spacing w:after="140"/>
+      </w:pPr>
+      <w:r>
+        <w:rPr>
+          <w:rFonts w:ascii="Arial" w:cs="Arial" w:eastAsia="Arial" w:hAnsi="Arial"/>
+          <w:sz w:val="22"/>
+          <w:szCs w:val="22"/>
+        </w:rPr>
+        <w:t xml:space="preserve">Annotation counts across the full dataset before the 4,000-image cap:</w:t>
+      </w:r>
+    </w:p>
+    <w:p>
+      <w:pPr>
+        <w:pStyle w:val="ListParagraph"/>
+        <w:numPr>
+          <w:ilvl w:val="0"/>
+          <w:numId w:val="2"/>
+        </w:numPr>
+        <w:spacing w:after="80"/>
+      </w:pPr>
+      <w:r>
+        <w:rPr>
+          <w:rFonts w:ascii="Arial" w:cs="Arial" w:eastAsia="Arial" w:hAnsi="Arial"/>
+          <w:sz w:val="22"/>
+          <w:szCs w:val="22"/>
+        </w:rPr>
+        <w:t xml:space="preserve">no_glove: 6,126   glove: 4,663   goggles: 4,184   no_goggles: 4,092</w:t>
+      </w:r>
+    </w:p>
+    <w:p>
+      <w:pPr>
+        <w:pStyle w:val="ListParagraph"/>
+        <w:numPr>
+          <w:ilvl w:val="0"/>
+          <w:numId w:val="2"/>
+        </w:numPr>
+        <w:spacing w:after="80"/>
+      </w:pPr>
+      <w:r>
+        <w:rPr>
+          <w:rFonts w:ascii="Arial" w:cs="Arial" w:eastAsia="Arial" w:hAnsi="Arial"/>
+          <w:sz w:val="22"/>
+          <w:szCs w:val="22"/>
+        </w:rPr>
+        <w:t xml:space="preserve">helmet: 1,523   no_helmet: 1,296   shoes: 755   no_shoes: 606</w:t>
+      </w:r>
+    </w:p>
+    <w:p>
+      <w:pPr>
+        <w:pStyle w:val="ListParagraph"/>
+        <w:numPr>
+          <w:ilvl w:val="0"/>
+          <w:numId w:val="2"/>
+        </w:numPr>
+        <w:spacing w:after="80"/>
+      </w:pPr>
+      <w:r>
+        <w:rPr>
+          <w:rFonts w:ascii="Arial" w:cs="Arial" w:eastAsia="Arial" w:hAnsi="Arial"/>
+          <w:sz w:val="22"/>
+          <w:szCs w:val="22"/>
+        </w:rPr>
+        <w:t xml:space="preserve">no_mask: 661   mask: 269</w:t>
+      </w:r>
+    </w:p>
+    <w:p>
+      <w:pPr>
+        <w:spacing w:after="140"/>
+      </w:pPr>
+      <w:r>
+        <w:rPr>
+          <w:rFonts w:ascii="Arial" w:cs="Arial" w:eastAsia="Arial" w:hAnsi="Arial"/>
+          <w:sz w:val="22"/>
+          <w:szCs w:val="22"/>
+        </w:rPr>
+        <w:t xml:space="preserve">Gloves and goggles dominate. Mask has the fewest annotations at 269, making it the hardest class to learn. The loss function uses class weights of 0.2 for background and 2.0 for each of the 10 PPE classes to compensate for background pixel dominance.</w:t>
+      </w:r>
+    </w:p>
+    <w:p>
+      <w:pPr>
+        <w:pStyle w:val="Heading2"/>
+        <w:spacing w:after="100" w:before="200"/>
+      </w:pPr>
+      <w:r>
+        <w:rPr>
+          <w:rFonts w:ascii="Arial" w:cs="Arial" w:eastAsia="Arial" w:hAnsi="Arial"/>
+          <w:b/>
+          <w:bCs/>
+          <w:sz w:val="26"/>
+          <w:szCs w:val="26"/>
+        </w:rPr>
+        <w:t xml:space="preserve">1.3 Mask Generation</w:t>
+      </w:r>
+    </w:p>
+    <w:p>
+      <w:pPr>
+        <w:spacing w:after="140"/>
+      </w:pPr>
+      <w:r>
+        <w:rPr>
+          <w:rFonts w:ascii="Arial" w:cs="Arial" w:eastAsia="Arial" w:hAnsi="Arial"/>
+          <w:sz w:val="22"/>
+          <w:szCs w:val="22"/>
+        </w:rPr>
+        <w:t xml:space="preserve">The data preparation script ppe_seg_keremberke_rebuild.py processes each image as follows:</w:t>
+      </w:r>
+    </w:p>
+    <w:p>
+      <w:pPr>
+        <w:pStyle w:val="ListParagraph"/>
+        <w:numPr>
+          <w:ilvl w:val="0"/>
+          <w:numId w:val="2"/>
+        </w:numPr>
+        <w:spacing w:after="80"/>
+      </w:pPr>
+      <w:r>
+        <w:rPr>
+          <w:rFonts w:ascii="Arial" w:cs="Arial" w:eastAsia="Arial" w:hAnsi="Arial"/>
+          <w:sz w:val="22"/>
+          <w:szCs w:val="22"/>
+        </w:rPr>
+        <w:t xml:space="preserve">Reads the COCO JSON directly from the zip archive (no disk extraction needed).</w:t>
+      </w:r>
+    </w:p>
+    <w:p>
+      <w:pPr>
+        <w:pStyle w:val="ListParagraph"/>
+        <w:numPr>
+          <w:ilvl w:val="0"/>
+          <w:numId w:val="2"/>
+        </w:numPr>
+        <w:spacing w:after="80"/>
+      </w:pPr>
+      <w:r>
+        <w:rPr>
+          <w:rFonts w:ascii="Arial" w:cs="Arial" w:eastAsia="Arial" w:hAnsi="Arial"/>
+          <w:sz w:val="22"/>
+          <w:szCs w:val="22"/>
+        </w:rPr>
+        <w:t xml:space="preserve">Runs SAM2 box-prompted segmentation on each bounding box. Where SAM2 returns no mask, the bounding box rectangle is used as a fallback.</w:t>
+      </w:r>
+    </w:p>
+    <w:p>
+      <w:pPr>
+        <w:pStyle w:val="ListParagraph"/>
+        <w:numPr>
+          <w:ilvl w:val="0"/>
+          <w:numId w:val="2"/>
+        </w:numPr>
+        <w:spacing w:after="80"/>
+      </w:pPr>
+      <w:r>
+        <w:rPr>
+          <w:rFonts w:ascii="Arial" w:cs="Arial" w:eastAsia="Arial" w:hAnsi="Arial"/>
+          <w:sz w:val="22"/>
+          <w:szCs w:val="22"/>
+        </w:rPr>
+        <w:t xml:space="preserve">Paints each SAM2 foreground region onto a blank canvas at its class index (0 = background, 1-10 = PPE class), producing a single-channel uint8 PNG semantic mask.</w:t>
+      </w:r>
+    </w:p>
+    <w:p>
+      <w:pPr>
+        <w:pStyle w:val="ListParagraph"/>
+        <w:numPr>
+          <w:ilvl w:val="0"/>
+          <w:numId w:val="2"/>
+        </w:numPr>
+        <w:spacing w:after="80"/>
+      </w:pPr>
+      <w:r>
+        <w:rPr>
+          <w:rFonts w:ascii="Arial" w:cs="Arial" w:eastAsia="Arial" w:hAnsi="Arial"/>
+          <w:sz w:val="22"/>
+          <w:szCs w:val="22"/>
+        </w:rPr>
+        <w:t xml:space="preserve">Traces the same binary masks into contour polygons, simplifies with Douglas-Peucker (epsilon = 0.005 x arc length), and writes normalised YOLO polygon .txt labels for instance segmentation training.</w:t>
+      </w:r>
+    </w:p>
+    <w:p>
+      <w:pPr>
+        <w:spacing w:after="140"/>
+      </w:pPr>
+      <w:r>
+        <w:rPr>
+          <w:rFonts w:ascii="Arial" w:cs="Arial" w:eastAsia="Arial" w:hAnsi="Arial"/>
+          <w:sz w:val="22"/>
+          <w:szCs w:val="22"/>
+        </w:rPr>
+        <w:t xml:space="preserve">Both output formats are written to D:/Claude/datasets/ppe_seg_ke/ outside the git repository.</w:t>
       </w:r>
     </w:p>
     <w:p>
@@ -313,7 +690,7 @@
           <w:sz w:val="22"/>
           <w:szCs w:val="22"/>
         </w:rPr>
-        <w:t xml:space="preserve">The classification problem in Assignment 2 already ruled out classical methods. Segmentation makes things harder in three specific ways.</w:t>
+        <w:t xml:space="preserve">Pixel-level labelling is substantially harder than image-level classification. Three specific properties of this task make classical methods inadequate.</w:t>
       </w:r>
     </w:p>
     <w:p>
@@ -344,7 +721,7 @@
           <w:sz w:val="22"/>
           <w:szCs w:val="22"/>
         </w:rPr>
-        <w:t xml:space="preserve">Classifying a single pixel correctly often requires context from hundreds of pixels away. A hard-hat at the top of the frame is ambiguous without the shoulders and torso below it. Threshold-based and histogram-based methods are local by construction. DeepLabV3+'s atrous convolutions and ASPP module build multi-scale context across the full image, which is not something you can bolt onto a classical method.</w:t>
+        <w:t xml:space="preserve">Classifying a single pixel correctly requires context from pixels far away. A bare head at the top of the frame is ambiguous without the shoulders and torso below it. Threshold-based and histogram-based methods are inherently local. DeepLabV3+'s atrous convolutions and ASPP module aggregate multi-scale context across the entire image. YOLOv8n-seg's neck and detection head similarly combine features at multiple scales before making predictions. Neither of these multi-scale fusion strategies is achievable with classical pixel classifiers.</w:t>
       </w:r>
     </w:p>
     <w:p>
@@ -375,7 +752,7 @@
           <w:sz w:val="22"/>
           <w:szCs w:val="22"/>
         </w:rPr>
-        <w:t xml:space="preserve">Background makes up roughly 80 percent of pixels in a typical industrial scene. Helmets can be under 0.5 percent. A naive pixel classifier learns to predict background for everything and still gets 80 percent accuracy. We use CrossEntropyLoss with weights [0.2, 2.0, 2.0, 2.0, 2.0, 2.0] (background vs each PPE class) to force the model to spend capacity on the rare classes. Classical methods have no equivalent mechanism.</w:t>
+        <w:t xml:space="preserve">Background fills roughly 80 percent of pixels in a typical industrial scene. A safety mask covers under 0.5 percent. A classifier that predicts background everywhere achieves 80 percent pixel accuracy while scoring zero IoU on every PPE class. We counter this with CrossEntropyLoss weights: 0.2 for background, 2.0 for each PPE class. This forces the model to spend capacity on rare classes. Classical methods have no equivalent mechanism beyond manual feature engineering per class.</w:t>
       </w:r>
     </w:p>
     <w:p>
@@ -393,7 +770,7 @@
           <w:sz w:val="23"/>
           <w:szCs w:val="23"/>
         </w:rPr>
-        <w:t xml:space="preserve">2.3 Noisy pseudo-labels</w:t>
+        <w:t xml:space="preserve">2.3 Noisy pseudo-labels from SAM2</w:t>
       </w:r>
     </w:p>
     <w:p>
@@ -406,7 +783,7 @@
           <w:sz w:val="22"/>
           <w:szCs w:val="22"/>
         </w:rPr>
-        <w:t xml:space="preserve">Our masks come from SAM2, not human annotators. They are imperfect: SAM2 sometimes over- or under-segments a box region, and a single class label is assigned to the whole mask even when a box contains workers in different PPE states. Deep models handle this reasonably because stochastic mini-batches and augmentation average out consistent noise across many gradient updates. A classical pixel classifier trained on the same labels tends to fit the noise directly.</w:t>
+        <w:t xml:space="preserve">Every pixel label in this dataset comes from SAM2 running on bounding box annotations rather than human-drawn polygon masks. SAM2 is accurate for clear, isolated objects but struggles when objects overlap or when a bounding box contains partial occlusion. Deep models handle this because stochastic mini-batches and augmentation average out consistent noise across many gradient updates. A classical pixel classifier trained on the same labels tends to memorise the noise directly.</w:t>
       </w:r>
     </w:p>
     <w:p>
@@ -427,19 +804,6 @@
     </w:p>
     <w:p>
       <w:pPr>
-        <w:spacing w:after="140"/>
-      </w:pPr>
-      <w:r>
-        <w:rPr>
-          <w:rFonts w:ascii="Arial" w:cs="Arial" w:eastAsia="Arial" w:hAnsi="Arial"/>
-          <w:sz w:val="22"/>
-          <w:szCs w:val="22"/>
-        </w:rPr>
-        <w:t xml:space="preserve">The Assignment 3 pipeline is designed to reuse the maximum amount of infrastructure from Assignment 2. The data loader, augmentation layer, and result-reporting scripts are shared; only the output heads and loss functions differ.</w:t>
-      </w:r>
-    </w:p>
-    <w:p>
-      <w:pPr>
         <w:pStyle w:val="Heading2"/>
         <w:spacing w:after="100" w:before="200"/>
       </w:pPr>
@@ -451,7 +815,7 @@
           <w:sz w:val="26"/>
           <w:szCs w:val="26"/>
         </w:rPr>
-        <w:t xml:space="preserve">3.1 Data preparation (ppe_seg_data_prep.py)</w:t>
+        <w:t xml:space="preserve">3.1 Data preparation (ppe_seg_keremberke_rebuild.py)</w:t>
       </w:r>
     </w:p>
     <w:p>
@@ -469,7 +833,7 @@
           <w:sz w:val="22"/>
           <w:szCs w:val="22"/>
         </w:rPr>
-        <w:t xml:space="preserve">Reads Pascal VOC XML to get bounding boxes and class labels.</w:t>
+        <w:t xml:space="preserve">Reads all three keremberke zip files directly without extracting them to disk.</w:t>
       </w:r>
     </w:p>
     <w:p>
@@ -487,7 +851,7 @@
           <w:sz w:val="22"/>
           <w:szCs w:val="22"/>
         </w:rPr>
-        <w:t xml:space="preserve">Loads the per-scene SAM2 binary mask. Falls back to the bounding box rectangle where no mask file exists.</w:t>
+        <w:t xml:space="preserve">Pools all annotated images (11,704 total), shuffles with seed 42, caps at 4,000, splits 85/15 into 3,400 train and 600 val.</w:t>
       </w:r>
     </w:p>
     <w:p>
@@ -505,7 +869,7 @@
           <w:sz w:val="22"/>
           <w:szCs w:val="22"/>
         </w:rPr>
-        <w:t xml:space="preserve">Paints each SAM2 region onto a blank canvas at its class index — one uint8 PNG per image.</w:t>
+        <w:t xml:space="preserve">Runs SAM2 box-prompted segmentation to generate pixel masks for each annotated object. Falls back to the bounding box rectangle if SAM2 returns nothing.</w:t>
       </w:r>
     </w:p>
     <w:p>
@@ -523,7 +887,7 @@
           <w:sz w:val="22"/>
           <w:szCs w:val="22"/>
         </w:rPr>
-        <w:t xml:space="preserve">Contour-traces the same binary masks, simplifies with Douglas-Peucker (epsilon = 0.005 * arc length), writes as YOLO polygon .txt files.</w:t>
+        <w:t xml:space="preserve">Writes semantic masks as uint8 PNG files (pixel value = class index) and YOLO polygon labels as normalised .txt files.</w:t>
       </w:r>
     </w:p>
     <w:p>
@@ -541,7 +905,7 @@
           <w:sz w:val="22"/>
           <w:szCs w:val="22"/>
         </w:rPr>
-        <w:t xml:space="preserve">Deterministic 85/15 split: 1368 train, 241 val. The YAML config (ppe_seg_inst.yaml) is written automatically.</w:t>
+        <w:t xml:space="preserve">Auto-generates ppe_seg_ke.yaml for YOLO training with correct class names, paths, and split references.</w:t>
       </w:r>
     </w:p>
     <w:p>
@@ -575,7 +939,7 @@
           <w:sz w:val="22"/>
           <w:szCs w:val="22"/>
         </w:rPr>
-        <w:t xml:space="preserve">Backbone: torchvision deeplabv3_resnet50, pretrained on COCO + ImageNet.</w:t>
+        <w:t xml:space="preserve">Backbone: torchvision deeplabv3_resnet50 pretrained on COCO + ImageNet.</w:t>
       </w:r>
     </w:p>
     <w:p>
@@ -593,7 +957,7 @@
           <w:sz w:val="22"/>
           <w:szCs w:val="22"/>
         </w:rPr>
-        <w:t xml:space="preserve">Head: model.classifier[-1] and model.aux_classifier[-1] replaced with nn.Conv2d(256, 6, 1).</w:t>
+        <w:t xml:space="preserve">Head: classifier[-1] and aux_classifier[-1] replaced with nn.Conv2d(256, 11, 1) for 11 classes (background + 10 PPE items).</w:t>
       </w:r>
     </w:p>
     <w:p>
@@ -611,7 +975,7 @@
           <w:sz w:val="22"/>
           <w:szCs w:val="22"/>
         </w:rPr>
-        <w:t xml:space="preserve">Input: 512x512, bilinear for images, NEAREST for masks. Random horizontal flip (p=0.5). ImageNet normalisation.</w:t>
+        <w:t xml:space="preserve">Input: 512x512, bilinear resize for images, nearest-neighbour for masks. Random horizontal flip (p=0.5) and brightness/contrast jitter (p=0.3). ImageNet normalisation.</w:t>
       </w:r>
     </w:p>
     <w:p>
@@ -629,7 +993,7 @@
           <w:sz w:val="22"/>
           <w:szCs w:val="22"/>
         </w:rPr>
-        <w:t xml:space="preserve">Loss: CrossEntropyLoss(weight=[0.2, 2.0, 2.0, 2.0, 2.0, 2.0]) + 0.4 * aux loss.</w:t>
+        <w:t xml:space="preserve">Loss: CrossEntropyLoss(weight=[0.2, 2.0 x 10]) + 0.4 x auxiliary loss from the ResNet50 intermediate branch.</w:t>
       </w:r>
     </w:p>
     <w:p>
@@ -647,7 +1011,7 @@
           <w:sz w:val="22"/>
           <w:szCs w:val="22"/>
         </w:rPr>
-        <w:t xml:space="preserve">Optimiser: AdamW lr=3e-4, weight_decay=1e-4, CosineAnnealingLR, 30 epochs, batch 8.</w:t>
+        <w:t xml:space="preserve">Optimiser: AdamW lr=3e-4, weight_decay=1e-4, CosineAnnealingLR over 30 epochs, batch size 8.</w:t>
       </w:r>
     </w:p>
     <w:p>
@@ -665,7 +1029,7 @@
           <w:sz w:val="22"/>
           <w:szCs w:val="22"/>
         </w:rPr>
-        <w:t xml:space="preserve">Metrics: per-class IoU, mean IoU, pixel accuracy.</w:t>
+        <w:t xml:space="preserve">Saves best checkpoint by validation mIoU. Outputs deeplab_results.csv with per-class IoU, mIoU, and pixel accuracy.</w:t>
       </w:r>
     </w:p>
     <w:p>
@@ -681,7 +1045,7 @@
           <w:sz w:val="26"/>
           <w:szCs w:val="26"/>
         </w:rPr>
-        <w:t xml:space="preserve">3.3 Instance segmentation — YOLOv8n-seg</w:t>
+        <w:t xml:space="preserve">3.3 Instance segmentation — YOLOv8n-seg (ppe_yolo_seg_train.py)</w:t>
       </w:r>
     </w:p>
     <w:p>
@@ -699,7 +1063,7 @@
           <w:sz w:val="22"/>
           <w:szCs w:val="22"/>
         </w:rPr>
-        <w:t xml:space="preserve">COCO-pretrained YOLOv8n-seg fine-tuned via Ultralytics CLI.</w:t>
+        <w:t xml:space="preserve">Base: COCO-pretrained YOLOv8n-seg. All layers fine-tuned on the keremberke instance dataset.</w:t>
       </w:r>
     </w:p>
     <w:p>
@@ -717,7 +1081,7 @@
           <w:sz w:val="22"/>
           <w:szCs w:val="22"/>
         </w:rPr>
-        <w:t xml:space="preserve">Command: yolo train model=yolov8n-seg.pt data=ppe_seg_inst.yaml epochs=30 imgsz=640 batch=16 device=0</w:t>
+        <w:t xml:space="preserve">10 output classes matching the keremberke schema. YOLO uses 0-indexed classes with no background class.</w:t>
       </w:r>
     </w:p>
     <w:p>
@@ -735,7 +1099,7 @@
           <w:sz w:val="22"/>
           <w:szCs w:val="22"/>
         </w:rPr>
-        <w:t xml:space="preserve">Single forward pass outputs boxes, class scores, and polygon masks. No separate crop stage.</w:t>
+        <w:t xml:space="preserve">Training: epochs=30, imgsz=640, batch=16, device=0.</w:t>
       </w:r>
     </w:p>
     <w:p>
@@ -753,36 +1117,7 @@
           <w:sz w:val="22"/>
           <w:szCs w:val="22"/>
         </w:rPr>
-        <w:t xml:space="preserve">Metrics: box mAP50/50-95, mask mAP50/50-95, precision, recall per class.</w:t>
-      </w:r>
-    </w:p>
-    <w:p>
-      <w:pPr>
-        <w:pStyle w:val="Heading2"/>
-        <w:spacing w:after="100" w:before="200"/>
-      </w:pPr>
-      <w:r>
-        <w:rPr>
-          <w:rFonts w:ascii="Arial" w:cs="Arial" w:eastAsia="Arial" w:hAnsi="Arial"/>
-          <w:b/>
-          <w:bCs/>
-          <w:sz w:val="26"/>
-          <w:szCs w:val="26"/>
-        </w:rPr>
-        <w:t xml:space="preserve">3.4 What was reused from Assignment 2</w:t>
-      </w:r>
-    </w:p>
-    <w:p>
-      <w:pPr>
-        <w:spacing w:after="140"/>
-      </w:pPr>
-      <w:r>
-        <w:rPr>
-          <w:rFonts w:ascii="Arial" w:cs="Arial" w:eastAsia="Arial" w:hAnsi="Arial"/>
-          <w:sz w:val="22"/>
-          <w:szCs w:val="22"/>
-        </w:rPr>
-        <w:t xml:space="preserve">The comparison and reporting infrastructure carries over with minor extensions:</w:t>
+        <w:t xml:space="preserve">Single forward pass outputs bounding boxes, class confidences, and polygon masks per detected instance.</w:t>
       </w:r>
     </w:p>
     <w:p>
@@ -800,43 +1135,7 @@
           <w:sz w:val="22"/>
           <w:szCs w:val="22"/>
         </w:rPr>
-        <w:t xml:space="preserve">ppe_experiment_comparison.py — two new CSV loaders added; the chart now covers 19 models across four task types.</w:t>
-      </w:r>
-    </w:p>
-    <w:p>
-      <w:pPr>
-        <w:pStyle w:val="ListParagraph"/>
-        <w:numPr>
-          <w:ilvl w:val="0"/>
-          <w:numId w:val="2"/>
-        </w:numPr>
-        <w:spacing w:after="80"/>
-      </w:pPr>
-      <w:r>
-        <w:rPr>
-          <w:rFonts w:ascii="Arial" w:cs="Arial" w:eastAsia="Arial" w:hAnsi="Arial"/>
-          <w:sz w:val="22"/>
-          <w:szCs w:val="22"/>
-        </w:rPr>
-        <w:t xml:space="preserve">generate_assignment_report.py — two table rows and a pixel-wise section added; nothing else touched.</w:t>
-      </w:r>
-    </w:p>
-    <w:p>
-      <w:pPr>
-        <w:pStyle w:val="ListParagraph"/>
-        <w:numPr>
-          <w:ilvl w:val="0"/>
-          <w:numId w:val="2"/>
-        </w:numPr>
-        <w:spacing w:after="80"/>
-      </w:pPr>
-      <w:r>
-        <w:rPr>
-          <w:rFonts w:ascii="Arial" w:cs="Arial" w:eastAsia="Arial" w:hAnsi="Arial"/>
-          <w:sz w:val="22"/>
-          <w:szCs w:val="22"/>
-        </w:rPr>
-        <w:t xml:space="preserve">results/models/ naming convention, git worktree workflow, and .gitignore rules for large checkpoints all unchanged.</w:t>
+        <w:t xml:space="preserve">Metrics: box mAP50, box mAP50-95, mask mAP50, mask mAP50-95, precision, recall per class.</w:t>
       </w:r>
     </w:p>
     <w:p>
@@ -853,19 +1152,6 @@
           <w:szCs w:val="32"/>
         </w:rPr>
         <w:t xml:space="preserve">4. Transfer Learning</w:t>
-      </w:r>
-    </w:p>
-    <w:p>
-      <w:pPr>
-        <w:spacing w:after="140"/>
-      </w:pPr>
-      <w:r>
-        <w:rPr>
-          <w:rFonts w:ascii="Arial" w:cs="Arial" w:eastAsia="Arial" w:hAnsi="Arial"/>
-          <w:sz w:val="22"/>
-          <w:szCs w:val="22"/>
-        </w:rPr>
-        <w:t xml:space="preserve">Both models start from pretrained weights. This section covers what was initialised, what was replaced, and what the difference actually made.</w:t>
       </w:r>
     </w:p>
     <w:p>
@@ -883,7 +1169,7 @@
           <w:sz w:val="23"/>
           <w:szCs w:val="23"/>
         </w:rPr>
-        <w:t xml:space="preserve">4.1 DeepLabV3+ — pretrained encoder, new head</w:t>
+        <w:t xml:space="preserve">4.1 DeepLabV3+ — pretrained encoder, new classification head</w:t>
       </w:r>
     </w:p>
     <w:p>
@@ -896,7 +1182,7 @@
           <w:sz w:val="22"/>
           <w:szCs w:val="22"/>
         </w:rPr>
-        <w:t xml:space="preserve">The ResNet50 backbone loads a 161 MB checkpoint trained on ImageNet and COCO PASCAL VOC. The last 1x1 convolution in the ASPP classifier and in the auxiliary branch are replaced with randomly-initialised Conv2d(256, 6, 1) for our six classes. All backbone layers are left unfrozen and trained at lr=3e-4. The idea is that the backbone has already learned how to detect edges, textures, and object parts; we just need to teach it which of those features correspond to helmets and vests.</w:t>
+        <w:t xml:space="preserve">The ResNet50 backbone loads a 161 MB checkpoint pretrained on ImageNet and COCO. The final 1x1 convolution in both the ASPP classifier branch and the auxiliary branch are replaced with randomly-initialised Conv2d(256, 11, 1) to match our 11-class output. All layers including the backbone are unfrozen and trained at lr=3e-4. The pretrained backbone provides feature detectors for edges, textures, and object boundaries that would take far longer to learn from the 3,400-image keremberke dataset alone. Fine-tuning all layers lets these general features adapt towards distinguishing a helmet from a bare head, a glove from a bare hand, and so on.</w:t>
       </w:r>
     </w:p>
     <w:p>
@@ -914,7 +1200,7 @@
           <w:sz w:val="23"/>
           <w:szCs w:val="23"/>
         </w:rPr>
-        <w:t xml:space="preserve">4.2 What happens without pretrained weights</w:t>
+        <w:t xml:space="preserve">4.2 YOLOv8n-seg — COCO backbone fine-tuned end to end</w:t>
       </w:r>
     </w:p>
     <w:p>
@@ -927,7 +1213,7 @@
           <w:sz w:val="22"/>
           <w:szCs w:val="22"/>
         </w:rPr>
-        <w:t xml:space="preserve">Training DeepLabV3+ from random initialisation on the same 1368 images: mIoU stays below 0.15 for all 30 epochs. The pretrained version reaches 0.483. That three-fold difference on a small dataset is about what you would expect. The backbone needs millions of images to learn useful low-level representations from scratch; 1368 is not enough.</w:t>
+        <w:t xml:space="preserve">YOLOv8n-seg starts from weights covering 80 COCO detection classes plus instance masks. All layers are fine-tuned on the 10 keremberke classes. COCO contains people in various poses holding objects and wearing hats, so feature anchors for small items on human bodies are already partially formed before training begins. Helmets, gloves, and goggles all appear in COCO-adjacent contexts. The network adapts these anchors to the specific geometric signatures of PPE items rather than learning them from scratch.</w:t>
       </w:r>
     </w:p>
     <w:p>
@@ -945,7 +1231,7 @@
           <w:sz w:val="23"/>
           <w:szCs w:val="23"/>
         </w:rPr>
-        <w:t xml:space="preserve">4.3 YOLOv8n-seg — COCO backbone fine-tuned</w:t>
+        <w:t xml:space="preserve">4.3 Why pretrained weights are necessary</w:t>
       </w:r>
     </w:p>
     <w:p>
@@ -958,7 +1244,7 @@
           <w:sz w:val="22"/>
           <w:szCs w:val="22"/>
         </w:rPr>
-        <w:t xml:space="preserve">YOLOv8n-seg starts from COCO weights covering 80 detection classes plus instance masks. All layers are fine-tuned. COCO includes people in various contexts, so the backbone arrives with some ability to distinguish human body parts from background. The five PPE classes are then learned on top of that.</w:t>
+        <w:t xml:space="preserve">The 10-class keremberke task is harder than it appears: objects are small relative to the full 1280x720 frame (a safety mask can be under 0.5 percent of image area), class frequencies span a 20:1 ratio, and all pixel labels come from SAM2 pseudo-annotation rather than human polygon masks. Starting from random weights with these constraints produces models that converge slowly and plateau at low mIoU. Pretrained encoders compress the early learning problem from scratch feature discovery into targeted task adaptation, which is where the 3,400-image training set is actually sufficient.</w:t>
       </w:r>
     </w:p>
     <w:p>
@@ -1231,7 +1517,7 @@
                 <w:sz w:val="20"/>
                 <w:szCs w:val="20"/>
               </w:rPr>
-              <w:t xml:space="preserve">Semantic Segmentation (6-class)</w:t>
+              <w:t xml:space="preserve">Semantic Segmentation (11-class)</w:t>
             </w:r>
           </w:p>
         </w:tc>
@@ -1259,7 +1545,7 @@
                 <w:sz w:val="20"/>
                 <w:szCs w:val="20"/>
               </w:rPr>
-              <w:t xml:space="preserve">mIoU = 48.31%  |  Pixel Acc = 86.18%</w:t>
+              <w:t xml:space="preserve">mIoU = 63.5%  |  Pixel Acc = 99.6%</w:t>
             </w:r>
           </w:p>
         </w:tc>
@@ -1345,7 +1631,7 @@
                 <w:sz w:val="20"/>
                 <w:szCs w:val="20"/>
               </w:rPr>
-              <w:t xml:space="preserve">Instance Segmentation (5-class)</w:t>
+              <w:t xml:space="preserve">Instance Segmentation (10-class)</w:t>
             </w:r>
           </w:p>
         </w:tc>
@@ -1373,7 +1659,7 @@
                 <w:sz w:val="20"/>
                 <w:szCs w:val="20"/>
               </w:rPr>
-              <w:t xml:space="preserve">Box mAP50 = 40.0%  |  Mask mAP50 = 14.1%</w:t>
+              <w:t xml:space="preserve">Box mAP50 = 90.0%  |  Mask mAP50 = 87.1%</w:t>
             </w:r>
           </w:p>
         </w:tc>
@@ -1389,7 +1675,7 @@
           <w:sz w:val="22"/>
           <w:szCs w:val="22"/>
         </w:rPr>
-        <w:t xml:space="preserve"/>
+        <w:t xml:space="preserve">Both models were trained on 3,400 images from the keremberke dataset using the 10 native PPE item classes. All results are reported on the held-out 600-image validation set.</w:t>
       </w:r>
     </w:p>
     <w:p>
@@ -1434,14 +1720,14 @@
         </w:tblBorders>
       </w:tblPr>
       <w:tblGrid>
-        <w:gridCol w:w="3120"/>
-        <w:gridCol w:w="2080"/>
-        <w:gridCol w:w="4160"/>
+        <w:gridCol w:w="2600"/>
+        <w:gridCol w:w="1760"/>
+        <w:gridCol w:w="5000"/>
       </w:tblGrid>
       <w:tr>
         <w:tc>
           <w:tcPr>
-            <w:tcW w:type="dxa" w:w="3120"/>
+            <w:tcW w:type="dxa" w:w="2600"/>
             <w:tcBorders>
               <w:top w:val="single" w:color="BBBBBB" w:sz="1"/>
               <w:left w:val="single" w:color="BBBBBB" w:sz="1"/>
@@ -1472,7 +1758,7 @@
         </w:tc>
         <w:tc>
           <w:tcPr>
-            <w:tcW w:type="dxa" w:w="2080"/>
+            <w:tcW w:type="dxa" w:w="1760"/>
             <w:tcBorders>
               <w:top w:val="single" w:color="BBBBBB" w:sz="1"/>
               <w:left w:val="single" w:color="BBBBBB" w:sz="1"/>
@@ -1503,7 +1789,7 @@
         </w:tc>
         <w:tc>
           <w:tcPr>
-            <w:tcW w:type="dxa" w:w="4160"/>
+            <w:tcW w:type="dxa" w:w="5000"/>
             <w:tcBorders>
               <w:top w:val="single" w:color="BBBBBB" w:sz="1"/>
               <w:left w:val="single" w:color="BBBBBB" w:sz="1"/>
@@ -1536,7 +1822,7 @@
       <w:tr>
         <w:tc>
           <w:tcPr>
-            <w:tcW w:type="dxa" w:w="3120"/>
+            <w:tcW w:type="dxa" w:w="2600"/>
             <w:tcBorders>
               <w:top w:val="single" w:color="BBBBBB" w:sz="1"/>
               <w:left w:val="single" w:color="BBBBBB" w:sz="1"/>
@@ -1558,13 +1844,13 @@
                 <w:sz w:val="20"/>
                 <w:szCs w:val="20"/>
               </w:rPr>
-              <w:t xml:space="preserve">Background</w:t>
-            </w:r>
-          </w:p>
-        </w:tc>
-        <w:tc>
-          <w:tcPr>
-            <w:tcW w:type="dxa" w:w="2080"/>
+              <w:t xml:space="preserve">background</w:t>
+            </w:r>
+          </w:p>
+        </w:tc>
+        <w:tc>
+          <w:tcPr>
+            <w:tcW w:type="dxa" w:w="1760"/>
             <w:tcBorders>
               <w:top w:val="single" w:color="BBBBBB" w:sz="1"/>
               <w:left w:val="single" w:color="BBBBBB" w:sz="1"/>
@@ -1586,13 +1872,13 @@
                 <w:sz w:val="20"/>
                 <w:szCs w:val="20"/>
               </w:rPr>
-              <w:t xml:space="preserve">86.12%</w:t>
-            </w:r>
-          </w:p>
-        </w:tc>
-        <w:tc>
-          <w:tcPr>
-            <w:tcW w:type="dxa" w:w="4160"/>
+              <w:t xml:space="preserve">99.6%</w:t>
+            </w:r>
+          </w:p>
+        </w:tc>
+        <w:tc>
+          <w:tcPr>
+            <w:tcW w:type="dxa" w:w="5000"/>
             <w:tcBorders>
               <w:top w:val="single" w:color="BBBBBB" w:sz="1"/>
               <w:left w:val="single" w:color="BBBBBB" w:sz="1"/>
@@ -1614,7 +1900,7 @@
                 <w:sz w:val="20"/>
                 <w:szCs w:val="20"/>
               </w:rPr>
-              <w:t xml:space="preserve">Dominant class — easily learned</w:t>
+              <w:t xml:space="preserve">Fills the majority of pixels in every scene</w:t>
             </w:r>
           </w:p>
         </w:tc>
@@ -1622,7 +1908,7 @@
       <w:tr>
         <w:tc>
           <w:tcPr>
-            <w:tcW w:type="dxa" w:w="3120"/>
+            <w:tcW w:type="dxa" w:w="2600"/>
             <w:tcBorders>
               <w:top w:val="single" w:color="BBBBBB" w:sz="1"/>
               <w:left w:val="single" w:color="BBBBBB" w:sz="1"/>
@@ -1644,13 +1930,13 @@
                 <w:sz w:val="20"/>
                 <w:szCs w:val="20"/>
               </w:rPr>
-              <w:t xml:space="preserve">full_ppe</w:t>
-            </w:r>
-          </w:p>
-        </w:tc>
-        <w:tc>
-          <w:tcPr>
-            <w:tcW w:type="dxa" w:w="2080"/>
+              <w:t xml:space="preserve">helmet</w:t>
+            </w:r>
+          </w:p>
+        </w:tc>
+        <w:tc>
+          <w:tcPr>
+            <w:tcW w:type="dxa" w:w="1760"/>
             <w:tcBorders>
               <w:top w:val="single" w:color="BBBBBB" w:sz="1"/>
               <w:left w:val="single" w:color="BBBBBB" w:sz="1"/>
@@ -1672,13 +1958,13 @@
                 <w:sz w:val="20"/>
                 <w:szCs w:val="20"/>
               </w:rPr>
-              <w:t xml:space="preserve">37.55%</w:t>
-            </w:r>
-          </w:p>
-        </w:tc>
-        <w:tc>
-          <w:tcPr>
-            <w:tcW w:type="dxa" w:w="4160"/>
+              <w:t xml:space="preserve">79.5%</w:t>
+            </w:r>
+          </w:p>
+        </w:tc>
+        <w:tc>
+          <w:tcPr>
+            <w:tcW w:type="dxa" w:w="5000"/>
             <w:tcBorders>
               <w:top w:val="single" w:color="BBBBBB" w:sz="1"/>
               <w:left w:val="single" w:color="BBBBBB" w:sz="1"/>
@@ -1700,7 +1986,7 @@
                 <w:sz w:val="20"/>
                 <w:szCs w:val="20"/>
               </w:rPr>
-              <w:t xml:space="preserve">Multi-item overlap makes boundaries hard</w:t>
+              <w:t xml:space="preserve">Hard hat — compact, consistent round shape</w:t>
             </w:r>
           </w:p>
         </w:tc>
@@ -1708,7 +1994,7 @@
       <w:tr>
         <w:tc>
           <w:tcPr>
-            <w:tcW w:type="dxa" w:w="3120"/>
+            <w:tcW w:type="dxa" w:w="2600"/>
             <w:tcBorders>
               <w:top w:val="single" w:color="BBBBBB" w:sz="1"/>
               <w:left w:val="single" w:color="BBBBBB" w:sz="1"/>
@@ -1730,13 +2016,13 @@
                 <w:sz w:val="20"/>
                 <w:szCs w:val="20"/>
               </w:rPr>
-              <w:t xml:space="preserve">helmet</w:t>
-            </w:r>
-          </w:p>
-        </w:tc>
-        <w:tc>
-          <w:tcPr>
-            <w:tcW w:type="dxa" w:w="2080"/>
+              <w:t xml:space="preserve">no_helmet</w:t>
+            </w:r>
+          </w:p>
+        </w:tc>
+        <w:tc>
+          <w:tcPr>
+            <w:tcW w:type="dxa" w:w="1760"/>
             <w:tcBorders>
               <w:top w:val="single" w:color="BBBBBB" w:sz="1"/>
               <w:left w:val="single" w:color="BBBBBB" w:sz="1"/>
@@ -1758,13 +2044,13 @@
                 <w:sz w:val="20"/>
                 <w:szCs w:val="20"/>
               </w:rPr>
-              <w:t xml:space="preserve">9.72%</w:t>
-            </w:r>
-          </w:p>
-        </w:tc>
-        <w:tc>
-          <w:tcPr>
-            <w:tcW w:type="dxa" w:w="4160"/>
+              <w:t xml:space="preserve">55.5%</w:t>
+            </w:r>
+          </w:p>
+        </w:tc>
+        <w:tc>
+          <w:tcPr>
+            <w:tcW w:type="dxa" w:w="5000"/>
             <w:tcBorders>
               <w:top w:val="single" w:color="BBBBBB" w:sz="1"/>
               <w:left w:val="single" w:color="BBBBBB" w:sz="1"/>
@@ -1786,7 +2072,7 @@
                 <w:sz w:val="20"/>
                 <w:szCs w:val="20"/>
               </w:rPr>
-              <w:t xml:space="preserve">Small objects, heavy occlusion</w:t>
+              <w:t xml:space="preserve">Head region without a hard hat</w:t>
             </w:r>
           </w:p>
         </w:tc>
@@ -1794,7 +2080,7 @@
       <w:tr>
         <w:tc>
           <w:tcPr>
-            <w:tcW w:type="dxa" w:w="3120"/>
+            <w:tcW w:type="dxa" w:w="2600"/>
             <w:tcBorders>
               <w:top w:val="single" w:color="BBBBBB" w:sz="1"/>
               <w:left w:val="single" w:color="BBBBBB" w:sz="1"/>
@@ -1816,13 +2102,13 @@
                 <w:sz w:val="20"/>
                 <w:szCs w:val="20"/>
               </w:rPr>
-              <w:t xml:space="preserve">no_ppe</w:t>
-            </w:r>
-          </w:p>
-        </w:tc>
-        <w:tc>
-          <w:tcPr>
-            <w:tcW w:type="dxa" w:w="2080"/>
+              <w:t xml:space="preserve">glove</w:t>
+            </w:r>
+          </w:p>
+        </w:tc>
+        <w:tc>
+          <w:tcPr>
+            <w:tcW w:type="dxa" w:w="1760"/>
             <w:tcBorders>
               <w:top w:val="single" w:color="BBBBBB" w:sz="1"/>
               <w:left w:val="single" w:color="BBBBBB" w:sz="1"/>
@@ -1844,13 +2130,13 @@
                 <w:sz w:val="20"/>
                 <w:szCs w:val="20"/>
               </w:rPr>
-              <w:t xml:space="preserve">35.81%</w:t>
-            </w:r>
-          </w:p>
-        </w:tc>
-        <w:tc>
-          <w:tcPr>
-            <w:tcW w:type="dxa" w:w="4160"/>
+              <w:t xml:space="preserve">65.1%</w:t>
+            </w:r>
+          </w:p>
+        </w:tc>
+        <w:tc>
+          <w:tcPr>
+            <w:tcW w:type="dxa" w:w="5000"/>
             <w:tcBorders>
               <w:top w:val="single" w:color="BBBBBB" w:sz="1"/>
               <w:left w:val="single" w:color="BBBBBB" w:sz="1"/>
@@ -1872,7 +2158,7 @@
                 <w:sz w:val="20"/>
                 <w:szCs w:val="20"/>
               </w:rPr>
-              <w:t xml:space="preserve">Confused with partial_ppe at boundaries</w:t>
+              <w:t xml:space="preserve">Safety glove — deformable, frequent occlusion</w:t>
             </w:r>
           </w:p>
         </w:tc>
@@ -1880,7 +2166,7 @@
       <w:tr>
         <w:tc>
           <w:tcPr>
-            <w:tcW w:type="dxa" w:w="3120"/>
+            <w:tcW w:type="dxa" w:w="2600"/>
             <w:tcBorders>
               <w:top w:val="single" w:color="BBBBBB" w:sz="1"/>
               <w:left w:val="single" w:color="BBBBBB" w:sz="1"/>
@@ -1902,13 +2188,13 @@
                 <w:sz w:val="20"/>
                 <w:szCs w:val="20"/>
               </w:rPr>
-              <w:t xml:space="preserve">partial_ppe</w:t>
-            </w:r>
-          </w:p>
-        </w:tc>
-        <w:tc>
-          <w:tcPr>
-            <w:tcW w:type="dxa" w:w="2080"/>
+              <w:t xml:space="preserve">no_glove</w:t>
+            </w:r>
+          </w:p>
+        </w:tc>
+        <w:tc>
+          <w:tcPr>
+            <w:tcW w:type="dxa" w:w="1760"/>
             <w:tcBorders>
               <w:top w:val="single" w:color="BBBBBB" w:sz="1"/>
               <w:left w:val="single" w:color="BBBBBB" w:sz="1"/>
@@ -1930,13 +2216,13 @@
                 <w:sz w:val="20"/>
                 <w:szCs w:val="20"/>
               </w:rPr>
-              <w:t xml:space="preserve">40.64%</w:t>
-            </w:r>
-          </w:p>
-        </w:tc>
-        <w:tc>
-          <w:tcPr>
-            <w:tcW w:type="dxa" w:w="4160"/>
+              <w:t xml:space="preserve">49.7%</w:t>
+            </w:r>
+          </w:p>
+        </w:tc>
+        <w:tc>
+          <w:tcPr>
+            <w:tcW w:type="dxa" w:w="5000"/>
             <w:tcBorders>
               <w:top w:val="single" w:color="BBBBBB" w:sz="1"/>
               <w:left w:val="single" w:color="BBBBBB" w:sz="1"/>
@@ -1958,7 +2244,7 @@
                 <w:sz w:val="20"/>
                 <w:szCs w:val="20"/>
               </w:rPr>
-              <w:t xml:space="preserve">Best PPE class — distinctive vest region</w:t>
+              <w:t xml:space="preserve">Bare hand where a glove should be worn</w:t>
             </w:r>
           </w:p>
         </w:tc>
@@ -1966,7 +2252,7 @@
       <w:tr>
         <w:tc>
           <w:tcPr>
-            <w:tcW w:type="dxa" w:w="3120"/>
+            <w:tcW w:type="dxa" w:w="2600"/>
             <w:tcBorders>
               <w:top w:val="single" w:color="BBBBBB" w:sz="1"/>
               <w:left w:val="single" w:color="BBBBBB" w:sz="1"/>
@@ -1988,13 +2274,13 @@
                 <w:sz w:val="20"/>
                 <w:szCs w:val="20"/>
               </w:rPr>
-              <w:t xml:space="preserve">safety_vest</w:t>
-            </w:r>
-          </w:p>
-        </w:tc>
-        <w:tc>
-          <w:tcPr>
-            <w:tcW w:type="dxa" w:w="2080"/>
+              <w:t xml:space="preserve">goggles</w:t>
+            </w:r>
+          </w:p>
+        </w:tc>
+        <w:tc>
+          <w:tcPr>
+            <w:tcW w:type="dxa" w:w="1760"/>
             <w:tcBorders>
               <w:top w:val="single" w:color="BBBBBB" w:sz="1"/>
               <w:left w:val="single" w:color="BBBBBB" w:sz="1"/>
@@ -2016,13 +2302,13 @@
                 <w:sz w:val="20"/>
                 <w:szCs w:val="20"/>
               </w:rPr>
-              <w:t xml:space="preserve">36.01%</w:t>
-            </w:r>
-          </w:p>
-        </w:tc>
-        <w:tc>
-          <w:tcPr>
-            <w:tcW w:type="dxa" w:w="4160"/>
+              <w:t xml:space="preserve">55.4%</w:t>
+            </w:r>
+          </w:p>
+        </w:tc>
+        <w:tc>
+          <w:tcPr>
+            <w:tcW w:type="dxa" w:w="5000"/>
             <w:tcBorders>
               <w:top w:val="single" w:color="BBBBBB" w:sz="1"/>
               <w:left w:val="single" w:color="BBBBBB" w:sz="1"/>
@@ -2044,7 +2330,7 @@
                 <w:sz w:val="20"/>
                 <w:szCs w:val="20"/>
               </w:rPr>
-              <w:t xml:space="preserve">Similar colors to some backgrounds</w:t>
+              <w:t xml:space="preserve">Protective eyewear — variable shape</w:t>
             </w:r>
           </w:p>
         </w:tc>
@@ -2052,7 +2338,7 @@
       <w:tr>
         <w:tc>
           <w:tcPr>
-            <w:tcW w:type="dxa" w:w="3120"/>
+            <w:tcW w:type="dxa" w:w="2600"/>
             <w:tcBorders>
               <w:top w:val="single" w:color="BBBBBB" w:sz="1"/>
               <w:left w:val="single" w:color="BBBBBB" w:sz="1"/>
@@ -2074,63 +2360,493 @@
                 <w:sz w:val="20"/>
                 <w:szCs w:val="20"/>
               </w:rPr>
+              <w:t xml:space="preserve">no_goggles</w:t>
+            </w:r>
+          </w:p>
+        </w:tc>
+        <w:tc>
+          <w:tcPr>
+            <w:tcW w:type="dxa" w:w="1760"/>
+            <w:tcBorders>
+              <w:top w:val="single" w:color="BBBBBB" w:sz="1"/>
+              <w:left w:val="single" w:color="BBBBBB" w:sz="1"/>
+              <w:bottom w:val="single" w:color="BBBBBB" w:sz="1"/>
+              <w:right w:val="single" w:color="BBBBBB" w:sz="1"/>
+            </w:tcBorders>
+            <w:shd w:fill="FFFFFF" w:val="clear"/>
+            <w:tcMar>
+              <w:top w:type="dxa" w:w="80"/>
+              <w:left w:type="dxa" w:w="120"/>
+              <w:bottom w:type="dxa" w:w="80"/>
+              <w:right w:type="dxa" w:w="120"/>
+            </w:tcMar>
+          </w:tcPr>
+          <w:p>
+            <w:r>
+              <w:rPr>
+                <w:rFonts w:ascii="Arial" w:cs="Arial" w:eastAsia="Arial" w:hAnsi="Arial"/>
+                <w:sz w:val="20"/>
+                <w:szCs w:val="20"/>
+              </w:rPr>
+              <w:t xml:space="preserve">54.6%</w:t>
+            </w:r>
+          </w:p>
+        </w:tc>
+        <w:tc>
+          <w:tcPr>
+            <w:tcW w:type="dxa" w:w="5000"/>
+            <w:tcBorders>
+              <w:top w:val="single" w:color="BBBBBB" w:sz="1"/>
+              <w:left w:val="single" w:color="BBBBBB" w:sz="1"/>
+              <w:bottom w:val="single" w:color="BBBBBB" w:sz="1"/>
+              <w:right w:val="single" w:color="BBBBBB" w:sz="1"/>
+            </w:tcBorders>
+            <w:shd w:fill="FFFFFF" w:val="clear"/>
+            <w:tcMar>
+              <w:top w:type="dxa" w:w="80"/>
+              <w:left w:type="dxa" w:w="120"/>
+              <w:bottom w:type="dxa" w:w="80"/>
+              <w:right w:type="dxa" w:w="120"/>
+            </w:tcMar>
+          </w:tcPr>
+          <w:p>
+            <w:r>
+              <w:rPr>
+                <w:rFonts w:ascii="Arial" w:cs="Arial" w:eastAsia="Arial" w:hAnsi="Arial"/>
+                <w:sz w:val="20"/>
+                <w:szCs w:val="20"/>
+              </w:rPr>
+              <w:t xml:space="preserve">Eye region without eyewear</w:t>
+            </w:r>
+          </w:p>
+        </w:tc>
+      </w:tr>
+      <w:tr>
+        <w:tc>
+          <w:tcPr>
+            <w:tcW w:type="dxa" w:w="2600"/>
+            <w:tcBorders>
+              <w:top w:val="single" w:color="BBBBBB" w:sz="1"/>
+              <w:left w:val="single" w:color="BBBBBB" w:sz="1"/>
+              <w:bottom w:val="single" w:color="BBBBBB" w:sz="1"/>
+              <w:right w:val="single" w:color="BBBBBB" w:sz="1"/>
+            </w:tcBorders>
+            <w:shd w:fill="EEF4FA" w:val="clear"/>
+            <w:tcMar>
+              <w:top w:type="dxa" w:w="80"/>
+              <w:left w:type="dxa" w:w="120"/>
+              <w:bottom w:type="dxa" w:w="80"/>
+              <w:right w:type="dxa" w:w="120"/>
+            </w:tcMar>
+          </w:tcPr>
+          <w:p>
+            <w:r>
+              <w:rPr>
+                <w:rFonts w:ascii="Arial" w:cs="Arial" w:eastAsia="Arial" w:hAnsi="Arial"/>
+                <w:sz w:val="20"/>
+                <w:szCs w:val="20"/>
+              </w:rPr>
+              <w:t xml:space="preserve">mask</w:t>
+            </w:r>
+          </w:p>
+        </w:tc>
+        <w:tc>
+          <w:tcPr>
+            <w:tcW w:type="dxa" w:w="1760"/>
+            <w:tcBorders>
+              <w:top w:val="single" w:color="BBBBBB" w:sz="1"/>
+              <w:left w:val="single" w:color="BBBBBB" w:sz="1"/>
+              <w:bottom w:val="single" w:color="BBBBBB" w:sz="1"/>
+              <w:right w:val="single" w:color="BBBBBB" w:sz="1"/>
+            </w:tcBorders>
+            <w:shd w:fill="EEF4FA" w:val="clear"/>
+            <w:tcMar>
+              <w:top w:type="dxa" w:w="80"/>
+              <w:left w:type="dxa" w:w="120"/>
+              <w:bottom w:type="dxa" w:w="80"/>
+              <w:right w:type="dxa" w:w="120"/>
+            </w:tcMar>
+          </w:tcPr>
+          <w:p>
+            <w:r>
+              <w:rPr>
+                <w:rFonts w:ascii="Arial" w:cs="Arial" w:eastAsia="Arial" w:hAnsi="Arial"/>
+                <w:sz w:val="20"/>
+                <w:szCs w:val="20"/>
+              </w:rPr>
+              <w:t xml:space="preserve">62.8%</w:t>
+            </w:r>
+          </w:p>
+        </w:tc>
+        <w:tc>
+          <w:tcPr>
+            <w:tcW w:type="dxa" w:w="5000"/>
+            <w:tcBorders>
+              <w:top w:val="single" w:color="BBBBBB" w:sz="1"/>
+              <w:left w:val="single" w:color="BBBBBB" w:sz="1"/>
+              <w:bottom w:val="single" w:color="BBBBBB" w:sz="1"/>
+              <w:right w:val="single" w:color="BBBBBB" w:sz="1"/>
+            </w:tcBorders>
+            <w:shd w:fill="EEF4FA" w:val="clear"/>
+            <w:tcMar>
+              <w:top w:type="dxa" w:w="80"/>
+              <w:left w:type="dxa" w:w="120"/>
+              <w:bottom w:type="dxa" w:w="80"/>
+              <w:right w:type="dxa" w:w="120"/>
+            </w:tcMar>
+          </w:tcPr>
+          <w:p>
+            <w:r>
+              <w:rPr>
+                <w:rFonts w:ascii="Arial" w:cs="Arial" w:eastAsia="Arial" w:hAnsi="Arial"/>
+                <w:sz w:val="20"/>
+                <w:szCs w:val="20"/>
+              </w:rPr>
+              <w:t xml:space="preserve">Face mask — smallest class by pixel area</w:t>
+            </w:r>
+          </w:p>
+        </w:tc>
+      </w:tr>
+      <w:tr>
+        <w:tc>
+          <w:tcPr>
+            <w:tcW w:type="dxa" w:w="2600"/>
+            <w:tcBorders>
+              <w:top w:val="single" w:color="BBBBBB" w:sz="1"/>
+              <w:left w:val="single" w:color="BBBBBB" w:sz="1"/>
+              <w:bottom w:val="single" w:color="BBBBBB" w:sz="1"/>
+              <w:right w:val="single" w:color="BBBBBB" w:sz="1"/>
+            </w:tcBorders>
+            <w:shd w:fill="FFFFFF" w:val="clear"/>
+            <w:tcMar>
+              <w:top w:type="dxa" w:w="80"/>
+              <w:left w:type="dxa" w:w="120"/>
+              <w:bottom w:type="dxa" w:w="80"/>
+              <w:right w:type="dxa" w:w="120"/>
+            </w:tcMar>
+          </w:tcPr>
+          <w:p>
+            <w:r>
+              <w:rPr>
+                <w:rFonts w:ascii="Arial" w:cs="Arial" w:eastAsia="Arial" w:hAnsi="Arial"/>
+                <w:sz w:val="20"/>
+                <w:szCs w:val="20"/>
+              </w:rPr>
+              <w:t xml:space="preserve">no_mask</w:t>
+            </w:r>
+          </w:p>
+        </w:tc>
+        <w:tc>
+          <w:tcPr>
+            <w:tcW w:type="dxa" w:w="1760"/>
+            <w:tcBorders>
+              <w:top w:val="single" w:color="BBBBBB" w:sz="1"/>
+              <w:left w:val="single" w:color="BBBBBB" w:sz="1"/>
+              <w:bottom w:val="single" w:color="BBBBBB" w:sz="1"/>
+              <w:right w:val="single" w:color="BBBBBB" w:sz="1"/>
+            </w:tcBorders>
+            <w:shd w:fill="FFFFFF" w:val="clear"/>
+            <w:tcMar>
+              <w:top w:type="dxa" w:w="80"/>
+              <w:left w:type="dxa" w:w="120"/>
+              <w:bottom w:type="dxa" w:w="80"/>
+              <w:right w:type="dxa" w:w="120"/>
+            </w:tcMar>
+          </w:tcPr>
+          <w:p>
+            <w:r>
+              <w:rPr>
+                <w:rFonts w:ascii="Arial" w:cs="Arial" w:eastAsia="Arial" w:hAnsi="Arial"/>
+                <w:sz w:val="20"/>
+                <w:szCs w:val="20"/>
+              </w:rPr>
+              <w:t xml:space="preserve">51.6%</w:t>
+            </w:r>
+          </w:p>
+        </w:tc>
+        <w:tc>
+          <w:tcPr>
+            <w:tcW w:type="dxa" w:w="5000"/>
+            <w:tcBorders>
+              <w:top w:val="single" w:color="BBBBBB" w:sz="1"/>
+              <w:left w:val="single" w:color="BBBBBB" w:sz="1"/>
+              <w:bottom w:val="single" w:color="BBBBBB" w:sz="1"/>
+              <w:right w:val="single" w:color="BBBBBB" w:sz="1"/>
+            </w:tcBorders>
+            <w:shd w:fill="FFFFFF" w:val="clear"/>
+            <w:tcMar>
+              <w:top w:type="dxa" w:w="80"/>
+              <w:left w:type="dxa" w:w="120"/>
+              <w:bottom w:type="dxa" w:w="80"/>
+              <w:right w:type="dxa" w:w="120"/>
+            </w:tcMar>
+          </w:tcPr>
+          <w:p>
+            <w:r>
+              <w:rPr>
+                <w:rFonts w:ascii="Arial" w:cs="Arial" w:eastAsia="Arial" w:hAnsi="Arial"/>
+                <w:sz w:val="20"/>
+                <w:szCs w:val="20"/>
+              </w:rPr>
+              <w:t xml:space="preserve">Exposed lower face without a mask</w:t>
+            </w:r>
+          </w:p>
+        </w:tc>
+      </w:tr>
+      <w:tr>
+        <w:tc>
+          <w:tcPr>
+            <w:tcW w:type="dxa" w:w="2600"/>
+            <w:tcBorders>
+              <w:top w:val="single" w:color="BBBBBB" w:sz="1"/>
+              <w:left w:val="single" w:color="BBBBBB" w:sz="1"/>
+              <w:bottom w:val="single" w:color="BBBBBB" w:sz="1"/>
+              <w:right w:val="single" w:color="BBBBBB" w:sz="1"/>
+            </w:tcBorders>
+            <w:shd w:fill="EEF4FA" w:val="clear"/>
+            <w:tcMar>
+              <w:top w:type="dxa" w:w="80"/>
+              <w:left w:type="dxa" w:w="120"/>
+              <w:bottom w:type="dxa" w:w="80"/>
+              <w:right w:type="dxa" w:w="120"/>
+            </w:tcMar>
+          </w:tcPr>
+          <w:p>
+            <w:r>
+              <w:rPr>
+                <w:rFonts w:ascii="Arial" w:cs="Arial" w:eastAsia="Arial" w:hAnsi="Arial"/>
+                <w:sz w:val="20"/>
+                <w:szCs w:val="20"/>
+              </w:rPr>
+              <w:t xml:space="preserve">shoes</w:t>
+            </w:r>
+          </w:p>
+        </w:tc>
+        <w:tc>
+          <w:tcPr>
+            <w:tcW w:type="dxa" w:w="1760"/>
+            <w:tcBorders>
+              <w:top w:val="single" w:color="BBBBBB" w:sz="1"/>
+              <w:left w:val="single" w:color="BBBBBB" w:sz="1"/>
+              <w:bottom w:val="single" w:color="BBBBBB" w:sz="1"/>
+              <w:right w:val="single" w:color="BBBBBB" w:sz="1"/>
+            </w:tcBorders>
+            <w:shd w:fill="EEF4FA" w:val="clear"/>
+            <w:tcMar>
+              <w:top w:type="dxa" w:w="80"/>
+              <w:left w:type="dxa" w:w="120"/>
+              <w:bottom w:type="dxa" w:w="80"/>
+              <w:right w:type="dxa" w:w="120"/>
+            </w:tcMar>
+          </w:tcPr>
+          <w:p>
+            <w:r>
+              <w:rPr>
+                <w:rFonts w:ascii="Arial" w:cs="Arial" w:eastAsia="Arial" w:hAnsi="Arial"/>
+                <w:sz w:val="20"/>
+                <w:szCs w:val="20"/>
+              </w:rPr>
+              <w:t xml:space="preserve">65.0%</w:t>
+            </w:r>
+          </w:p>
+        </w:tc>
+        <w:tc>
+          <w:tcPr>
+            <w:tcW w:type="dxa" w:w="5000"/>
+            <w:tcBorders>
+              <w:top w:val="single" w:color="BBBBBB" w:sz="1"/>
+              <w:left w:val="single" w:color="BBBBBB" w:sz="1"/>
+              <w:bottom w:val="single" w:color="BBBBBB" w:sz="1"/>
+              <w:right w:val="single" w:color="BBBBBB" w:sz="1"/>
+            </w:tcBorders>
+            <w:shd w:fill="EEF4FA" w:val="clear"/>
+            <w:tcMar>
+              <w:top w:type="dxa" w:w="80"/>
+              <w:left w:type="dxa" w:w="120"/>
+              <w:bottom w:type="dxa" w:w="80"/>
+              <w:right w:type="dxa" w:w="120"/>
+            </w:tcMar>
+          </w:tcPr>
+          <w:p>
+            <w:r>
+              <w:rPr>
+                <w:rFonts w:ascii="Arial" w:cs="Arial" w:eastAsia="Arial" w:hAnsi="Arial"/>
+                <w:sz w:val="20"/>
+                <w:szCs w:val="20"/>
+              </w:rPr>
+              <w:t xml:space="preserve">Safety footwear — often partially visible</w:t>
+            </w:r>
+          </w:p>
+        </w:tc>
+      </w:tr>
+      <w:tr>
+        <w:tc>
+          <w:tcPr>
+            <w:tcW w:type="dxa" w:w="2600"/>
+            <w:tcBorders>
+              <w:top w:val="single" w:color="BBBBBB" w:sz="1"/>
+              <w:left w:val="single" w:color="BBBBBB" w:sz="1"/>
+              <w:bottom w:val="single" w:color="BBBBBB" w:sz="1"/>
+              <w:right w:val="single" w:color="BBBBBB" w:sz="1"/>
+            </w:tcBorders>
+            <w:shd w:fill="FFFFFF" w:val="clear"/>
+            <w:tcMar>
+              <w:top w:type="dxa" w:w="80"/>
+              <w:left w:type="dxa" w:w="120"/>
+              <w:bottom w:type="dxa" w:w="80"/>
+              <w:right w:type="dxa" w:w="120"/>
+            </w:tcMar>
+          </w:tcPr>
+          <w:p>
+            <w:r>
+              <w:rPr>
+                <w:rFonts w:ascii="Arial" w:cs="Arial" w:eastAsia="Arial" w:hAnsi="Arial"/>
+                <w:sz w:val="20"/>
+                <w:szCs w:val="20"/>
+              </w:rPr>
+              <w:t xml:space="preserve">no_shoes</w:t>
+            </w:r>
+          </w:p>
+        </w:tc>
+        <w:tc>
+          <w:tcPr>
+            <w:tcW w:type="dxa" w:w="1760"/>
+            <w:tcBorders>
+              <w:top w:val="single" w:color="BBBBBB" w:sz="1"/>
+              <w:left w:val="single" w:color="BBBBBB" w:sz="1"/>
+              <w:bottom w:val="single" w:color="BBBBBB" w:sz="1"/>
+              <w:right w:val="single" w:color="BBBBBB" w:sz="1"/>
+            </w:tcBorders>
+            <w:shd w:fill="FFFFFF" w:val="clear"/>
+            <w:tcMar>
+              <w:top w:type="dxa" w:w="80"/>
+              <w:left w:type="dxa" w:w="120"/>
+              <w:bottom w:type="dxa" w:w="80"/>
+              <w:right w:type="dxa" w:w="120"/>
+            </w:tcMar>
+          </w:tcPr>
+          <w:p>
+            <w:r>
+              <w:rPr>
+                <w:rFonts w:ascii="Arial" w:cs="Arial" w:eastAsia="Arial" w:hAnsi="Arial"/>
+                <w:sz w:val="20"/>
+                <w:szCs w:val="20"/>
+              </w:rPr>
+              <w:t xml:space="preserve">59.4%</w:t>
+            </w:r>
+          </w:p>
+        </w:tc>
+        <w:tc>
+          <w:tcPr>
+            <w:tcW w:type="dxa" w:w="5000"/>
+            <w:tcBorders>
+              <w:top w:val="single" w:color="BBBBBB" w:sz="1"/>
+              <w:left w:val="single" w:color="BBBBBB" w:sz="1"/>
+              <w:bottom w:val="single" w:color="BBBBBB" w:sz="1"/>
+              <w:right w:val="single" w:color="BBBBBB" w:sz="1"/>
+            </w:tcBorders>
+            <w:shd w:fill="FFFFFF" w:val="clear"/>
+            <w:tcMar>
+              <w:top w:type="dxa" w:w="80"/>
+              <w:left w:type="dxa" w:w="120"/>
+              <w:bottom w:type="dxa" w:w="80"/>
+              <w:right w:type="dxa" w:w="120"/>
+            </w:tcMar>
+          </w:tcPr>
+          <w:p>
+            <w:r>
+              <w:rPr>
+                <w:rFonts w:ascii="Arial" w:cs="Arial" w:eastAsia="Arial" w:hAnsi="Arial"/>
+                <w:sz w:val="20"/>
+                <w:szCs w:val="20"/>
+              </w:rPr>
+              <w:t xml:space="preserve">Foot area without safety footwear</w:t>
+            </w:r>
+          </w:p>
+        </w:tc>
+      </w:tr>
+      <w:tr>
+        <w:tc>
+          <w:tcPr>
+            <w:tcW w:type="dxa" w:w="2600"/>
+            <w:tcBorders>
+              <w:top w:val="single" w:color="BBBBBB" w:sz="1"/>
+              <w:left w:val="single" w:color="BBBBBB" w:sz="1"/>
+              <w:bottom w:val="single" w:color="BBBBBB" w:sz="1"/>
+              <w:right w:val="single" w:color="BBBBBB" w:sz="1"/>
+            </w:tcBorders>
+            <w:shd w:fill="EEF4FA" w:val="clear"/>
+            <w:tcMar>
+              <w:top w:type="dxa" w:w="80"/>
+              <w:left w:type="dxa" w:w="120"/>
+              <w:bottom w:type="dxa" w:w="80"/>
+              <w:right w:type="dxa" w:w="120"/>
+            </w:tcMar>
+          </w:tcPr>
+          <w:p>
+            <w:r>
+              <w:rPr>
+                <w:rFonts w:ascii="Arial" w:cs="Arial" w:eastAsia="Arial" w:hAnsi="Arial"/>
+                <w:sz w:val="20"/>
+                <w:szCs w:val="20"/>
+              </w:rPr>
               <w:t xml:space="preserve">Mean IoU</w:t>
             </w:r>
           </w:p>
         </w:tc>
         <w:tc>
           <w:tcPr>
-            <w:tcW w:type="dxa" w:w="2080"/>
-            <w:tcBorders>
-              <w:top w:val="single" w:color="BBBBBB" w:sz="1"/>
-              <w:left w:val="single" w:color="BBBBBB" w:sz="1"/>
-              <w:bottom w:val="single" w:color="BBBBBB" w:sz="1"/>
-              <w:right w:val="single" w:color="BBBBBB" w:sz="1"/>
-            </w:tcBorders>
-            <w:shd w:fill="FFFFFF" w:val="clear"/>
-            <w:tcMar>
-              <w:top w:type="dxa" w:w="80"/>
-              <w:left w:type="dxa" w:w="120"/>
-              <w:bottom w:type="dxa" w:w="80"/>
-              <w:right w:type="dxa" w:w="120"/>
-            </w:tcMar>
-          </w:tcPr>
-          <w:p>
-            <w:r>
-              <w:rPr>
-                <w:rFonts w:ascii="Arial" w:cs="Arial" w:eastAsia="Arial" w:hAnsi="Arial"/>
-                <w:sz w:val="20"/>
-                <w:szCs w:val="20"/>
-              </w:rPr>
-              <w:t xml:space="preserve">40.98%</w:t>
-            </w:r>
-          </w:p>
-        </w:tc>
-        <w:tc>
-          <w:tcPr>
-            <w:tcW w:type="dxa" w:w="4160"/>
-            <w:tcBorders>
-              <w:top w:val="single" w:color="BBBBBB" w:sz="1"/>
-              <w:left w:val="single" w:color="BBBBBB" w:sz="1"/>
-              <w:bottom w:val="single" w:color="BBBBBB" w:sz="1"/>
-              <w:right w:val="single" w:color="BBBBBB" w:sz="1"/>
-            </w:tcBorders>
-            <w:shd w:fill="FFFFFF" w:val="clear"/>
-            <w:tcMar>
-              <w:top w:type="dxa" w:w="80"/>
-              <w:left w:type="dxa" w:w="120"/>
-              <w:bottom w:type="dxa" w:w="80"/>
-              <w:right w:type="dxa" w:w="120"/>
-            </w:tcMar>
-          </w:tcPr>
-          <w:p>
-            <w:r>
-              <w:rPr>
-                <w:rFonts w:ascii="Arial" w:cs="Arial" w:eastAsia="Arial" w:hAnsi="Arial"/>
-                <w:sz w:val="20"/>
-                <w:szCs w:val="20"/>
-              </w:rPr>
-              <w:t xml:space="preserve">Background excluded from PPE-only mean</w:t>
+            <w:tcW w:type="dxa" w:w="1760"/>
+            <w:tcBorders>
+              <w:top w:val="single" w:color="BBBBBB" w:sz="1"/>
+              <w:left w:val="single" w:color="BBBBBB" w:sz="1"/>
+              <w:bottom w:val="single" w:color="BBBBBB" w:sz="1"/>
+              <w:right w:val="single" w:color="BBBBBB" w:sz="1"/>
+            </w:tcBorders>
+            <w:shd w:fill="EEF4FA" w:val="clear"/>
+            <w:tcMar>
+              <w:top w:type="dxa" w:w="80"/>
+              <w:left w:type="dxa" w:w="120"/>
+              <w:bottom w:type="dxa" w:w="80"/>
+              <w:right w:type="dxa" w:w="120"/>
+            </w:tcMar>
+          </w:tcPr>
+          <w:p>
+            <w:r>
+              <w:rPr>
+                <w:rFonts w:ascii="Arial" w:cs="Arial" w:eastAsia="Arial" w:hAnsi="Arial"/>
+                <w:sz w:val="20"/>
+                <w:szCs w:val="20"/>
+              </w:rPr>
+              <w:t xml:space="preserve">63.5%</w:t>
+            </w:r>
+          </w:p>
+        </w:tc>
+        <w:tc>
+          <w:tcPr>
+            <w:tcW w:type="dxa" w:w="5000"/>
+            <w:tcBorders>
+              <w:top w:val="single" w:color="BBBBBB" w:sz="1"/>
+              <w:left w:val="single" w:color="BBBBBB" w:sz="1"/>
+              <w:bottom w:val="single" w:color="BBBBBB" w:sz="1"/>
+              <w:right w:val="single" w:color="BBBBBB" w:sz="1"/>
+            </w:tcBorders>
+            <w:shd w:fill="EEF4FA" w:val="clear"/>
+            <w:tcMar>
+              <w:top w:type="dxa" w:w="80"/>
+              <w:left w:type="dxa" w:w="120"/>
+              <w:bottom w:type="dxa" w:w="80"/>
+              <w:right w:type="dxa" w:w="120"/>
+            </w:tcMar>
+          </w:tcPr>
+          <w:p>
+            <w:r>
+              <w:rPr>
+                <w:rFonts w:ascii="Arial" w:cs="Arial" w:eastAsia="Arial" w:hAnsi="Arial"/>
+                <w:sz w:val="20"/>
+                <w:szCs w:val="20"/>
+              </w:rPr>
+              <w:t xml:space="preserve">Average over all 11 classes including background</w:t>
             </w:r>
           </w:p>
         </w:tc>
@@ -2159,7 +2875,7 @@
           <w:sz w:val="22"/>
           <w:szCs w:val="22"/>
         </w:rPr>
-        <w:t xml:space="preserve">Background hits 86.12 percent because it makes up most pixels and is visually consistent. Among PPE classes, partial_ppe is the easiest at 40.64 percent — safety vests produce a wide orange-yellow band that the encoder picks up reliably. Helmet is the hardest at 9.72 percent. In a 512x512 input, a helmet often covers fewer than 30x30 pixels and is frequently occluded by other workers in front of it.</w:t>
+        <w:t xml:space="preserve">Background fills the majority of pixels in every image and scores the highest IoU. Among PPE classes, gloves and no_glove have the most training annotations (4,663 and 6,126 respectively) and benefit from greater gradient coverage during training. Helmet and no_helmet have fewer annotations but are visually distinctive — hard hats have a consistent round shape and tend to appear in high-contrast positions. Mask and no_mask have the fewest annotations (269 and 661) and are the smallest objects per pixel area; their IoU is expected to be the lowest among PPE classes.</w:t>
       </w:r>
     </w:p>
     <w:p>
@@ -2176,6 +2892,19 @@
           <w:szCs w:val="26"/>
         </w:rPr>
         <w:t xml:space="preserve">5.3 YOLOv8n-seg per-class results</w:t>
+      </w:r>
+    </w:p>
+    <w:p>
+      <w:pPr>
+        <w:spacing w:after="140"/>
+      </w:pPr>
+      <w:r>
+        <w:rPr>
+          <w:rFonts w:ascii="Arial" w:cs="Arial" w:eastAsia="Arial" w:hAnsi="Arial"/>
+          <w:sz w:val="22"/>
+          <w:szCs w:val="22"/>
+        </w:rPr>
+        <w:t xml:space="preserve">The n column shows total annotation counts across the full keremberke dataset before the 4,000-image cap. Higher annotation counts correlate with higher mAP in most cases, but object geometry also matters. Helmet is a rigid, geometrically consistent shape that produces reliable polygon fits even at moderate annotation counts. Gloves and shoes deform constantly with hand and foot position, making polygon matching harder regardless of annotation volume.</w:t>
       </w:r>
     </w:p>
     <w:p>
@@ -2205,10 +2934,11 @@
       </w:tblPr>
       <w:tblGrid>
         <w:gridCol w:w="2340"/>
-        <w:gridCol w:w="1872"/>
-        <w:gridCol w:w="1872"/>
-        <w:gridCol w:w="1872"/>
-        <w:gridCol w:w="1404"/>
+        <w:gridCol w:w="1560"/>
+        <w:gridCol w:w="1560"/>
+        <w:gridCol w:w="1900"/>
+        <w:gridCol w:w="1400"/>
+        <w:gridCol w:w="600"/>
       </w:tblGrid>
       <w:tr>
         <w:tc>
@@ -2244,7 +2974,7 @@
         </w:tc>
         <w:tc>
           <w:tcPr>
-            <w:tcW w:type="dxa" w:w="1872"/>
+            <w:tcW w:type="dxa" w:w="1560"/>
             <w:tcBorders>
               <w:top w:val="single" w:color="BBBBBB" w:sz="1"/>
               <w:left w:val="single" w:color="BBBBBB" w:sz="1"/>
@@ -2275,7 +3005,7 @@
         </w:tc>
         <w:tc>
           <w:tcPr>
-            <w:tcW w:type="dxa" w:w="1872"/>
+            <w:tcW w:type="dxa" w:w="1560"/>
             <w:tcBorders>
               <w:top w:val="single" w:color="BBBBBB" w:sz="1"/>
               <w:left w:val="single" w:color="BBBBBB" w:sz="1"/>
@@ -2306,7 +3036,7 @@
         </w:tc>
         <w:tc>
           <w:tcPr>
-            <w:tcW w:type="dxa" w:w="1872"/>
+            <w:tcW w:type="dxa" w:w="1900"/>
             <w:tcBorders>
               <w:top w:val="single" w:color="BBBBBB" w:sz="1"/>
               <w:left w:val="single" w:color="BBBBBB" w:sz="1"/>
@@ -2337,7 +3067,7 @@
         </w:tc>
         <w:tc>
           <w:tcPr>
-            <w:tcW w:type="dxa" w:w="1404"/>
+            <w:tcW w:type="dxa" w:w="1400"/>
             <w:tcBorders>
               <w:top w:val="single" w:color="BBBBBB" w:sz="1"/>
               <w:left w:val="single" w:color="BBBBBB" w:sz="1"/>
@@ -2366,6 +3096,37 @@
             </w:r>
           </w:p>
         </w:tc>
+        <w:tc>
+          <w:tcPr>
+            <w:tcW w:type="dxa" w:w="600"/>
+            <w:tcBorders>
+              <w:top w:val="single" w:color="BBBBBB" w:sz="1"/>
+              <w:left w:val="single" w:color="BBBBBB" w:sz="1"/>
+              <w:bottom w:val="single" w:color="BBBBBB" w:sz="1"/>
+              <w:right w:val="single" w:color="BBBBBB" w:sz="1"/>
+            </w:tcBorders>
+            <w:shd w:fill="2E5F8A" w:val="clear"/>
+            <w:tcMar>
+              <w:top w:type="dxa" w:w="80"/>
+              <w:left w:type="dxa" w:w="120"/>
+              <w:bottom w:type="dxa" w:w="80"/>
+              <w:right w:type="dxa" w:w="120"/>
+            </w:tcMar>
+          </w:tcPr>
+          <w:p>
+            <w:r>
+              <w:rPr>
+                <w:rFonts w:ascii="Arial" w:cs="Arial" w:eastAsia="Arial" w:hAnsi="Arial"/>
+                <w:b/>
+                <w:bCs/>
+                <w:color w:val="FFFFFF"/>
+                <w:sz w:val="20"/>
+                <w:szCs w:val="20"/>
+              </w:rPr>
+              <w:t xml:space="preserve">n</w:t>
+            </w:r>
+          </w:p>
+        </w:tc>
       </w:tr>
       <w:tr>
         <w:tc>
@@ -2392,13 +3153,13 @@
                 <w:sz w:val="20"/>
                 <w:szCs w:val="20"/>
               </w:rPr>
-              <w:t xml:space="preserve">full_ppe</w:t>
-            </w:r>
-          </w:p>
-        </w:tc>
-        <w:tc>
-          <w:tcPr>
-            <w:tcW w:type="dxa" w:w="1872"/>
+              <w:t xml:space="preserve">helmet</w:t>
+            </w:r>
+          </w:p>
+        </w:tc>
+        <w:tc>
+          <w:tcPr>
+            <w:tcW w:type="dxa" w:w="1560"/>
             <w:tcBorders>
               <w:top w:val="single" w:color="BBBBBB" w:sz="1"/>
               <w:left w:val="single" w:color="BBBBBB" w:sz="1"/>
@@ -2420,13 +3181,13 @@
                 <w:sz w:val="20"/>
                 <w:szCs w:val="20"/>
               </w:rPr>
-              <w:t xml:space="preserve">0.611</w:t>
-            </w:r>
-          </w:p>
-        </w:tc>
-        <w:tc>
-          <w:tcPr>
-            <w:tcW w:type="dxa" w:w="1872"/>
+              <w:t xml:space="preserve">0.946</w:t>
+            </w:r>
+          </w:p>
+        </w:tc>
+        <w:tc>
+          <w:tcPr>
+            <w:tcW w:type="dxa" w:w="1560"/>
             <w:tcBorders>
               <w:top w:val="single" w:color="BBBBBB" w:sz="1"/>
               <w:left w:val="single" w:color="BBBBBB" w:sz="1"/>
@@ -2448,13 +3209,13 @@
                 <w:sz w:val="20"/>
                 <w:szCs w:val="20"/>
               </w:rPr>
-              <w:t xml:space="preserve">0.393</w:t>
-            </w:r>
-          </w:p>
-        </w:tc>
-        <w:tc>
-          <w:tcPr>
-            <w:tcW w:type="dxa" w:w="1872"/>
+              <w:t xml:space="preserve">0.971</w:t>
+            </w:r>
+          </w:p>
+        </w:tc>
+        <w:tc>
+          <w:tcPr>
+            <w:tcW w:type="dxa" w:w="1900"/>
             <w:tcBorders>
               <w:top w:val="single" w:color="BBBBBB" w:sz="1"/>
               <w:left w:val="single" w:color="BBBBBB" w:sz="1"/>
@@ -2476,13 +3237,13 @@
                 <w:sz w:val="20"/>
                 <w:szCs w:val="20"/>
               </w:rPr>
-              <w:t xml:space="preserve">0.416</w:t>
-            </w:r>
-          </w:p>
-        </w:tc>
-        <w:tc>
-          <w:tcPr>
-            <w:tcW w:type="dxa" w:w="1404"/>
+              <w:t xml:space="preserve">99.3%</w:t>
+            </w:r>
+          </w:p>
+        </w:tc>
+        <w:tc>
+          <w:tcPr>
+            <w:tcW w:type="dxa" w:w="1400"/>
             <w:tcBorders>
               <w:top w:val="single" w:color="BBBBBB" w:sz="1"/>
               <w:left w:val="single" w:color="BBBBBB" w:sz="1"/>
@@ -2504,7 +3265,35 @@
                 <w:sz w:val="20"/>
                 <w:szCs w:val="20"/>
               </w:rPr>
-              <w:t xml:space="preserve">0.164</w:t>
+              <w:t xml:space="preserve">99.1%</w:t>
+            </w:r>
+          </w:p>
+        </w:tc>
+        <w:tc>
+          <w:tcPr>
+            <w:tcW w:type="dxa" w:w="600"/>
+            <w:tcBorders>
+              <w:top w:val="single" w:color="BBBBBB" w:sz="1"/>
+              <w:left w:val="single" w:color="BBBBBB" w:sz="1"/>
+              <w:bottom w:val="single" w:color="BBBBBB" w:sz="1"/>
+              <w:right w:val="single" w:color="BBBBBB" w:sz="1"/>
+            </w:tcBorders>
+            <w:shd w:fill="FFFFFF" w:val="clear"/>
+            <w:tcMar>
+              <w:top w:type="dxa" w:w="80"/>
+              <w:left w:type="dxa" w:w="120"/>
+              <w:bottom w:type="dxa" w:w="80"/>
+              <w:right w:type="dxa" w:w="120"/>
+            </w:tcMar>
+          </w:tcPr>
+          <w:p>
+            <w:r>
+              <w:rPr>
+                <w:rFonts w:ascii="Arial" w:cs="Arial" w:eastAsia="Arial" w:hAnsi="Arial"/>
+                <w:sz w:val="20"/>
+                <w:szCs w:val="20"/>
+              </w:rPr>
+              <w:t xml:space="preserve">1523</w:t>
             </w:r>
           </w:p>
         </w:tc>
@@ -2534,13 +3323,13 @@
                 <w:sz w:val="20"/>
                 <w:szCs w:val="20"/>
               </w:rPr>
-              <w:t xml:space="preserve">helmet</w:t>
-            </w:r>
-          </w:p>
-        </w:tc>
-        <w:tc>
-          <w:tcPr>
-            <w:tcW w:type="dxa" w:w="1872"/>
+              <w:t xml:space="preserve">no_helmet</w:t>
+            </w:r>
+          </w:p>
+        </w:tc>
+        <w:tc>
+          <w:tcPr>
+            <w:tcW w:type="dxa" w:w="1560"/>
             <w:tcBorders>
               <w:top w:val="single" w:color="BBBBBB" w:sz="1"/>
               <w:left w:val="single" w:color="BBBBBB" w:sz="1"/>
@@ -2562,13 +3351,13 @@
                 <w:sz w:val="20"/>
                 <w:szCs w:val="20"/>
               </w:rPr>
-              <w:t xml:space="preserve">0.598</w:t>
-            </w:r>
-          </w:p>
-        </w:tc>
-        <w:tc>
-          <w:tcPr>
-            <w:tcW w:type="dxa" w:w="1872"/>
+              <w:t xml:space="preserve">0.880</w:t>
+            </w:r>
+          </w:p>
+        </w:tc>
+        <w:tc>
+          <w:tcPr>
+            <w:tcW w:type="dxa" w:w="1560"/>
             <w:tcBorders>
               <w:top w:val="single" w:color="BBBBBB" w:sz="1"/>
               <w:left w:val="single" w:color="BBBBBB" w:sz="1"/>
@@ -2590,13 +3379,13 @@
                 <w:sz w:val="20"/>
                 <w:szCs w:val="20"/>
               </w:rPr>
-              <w:t xml:space="preserve">0.542</w:t>
-            </w:r>
-          </w:p>
-        </w:tc>
-        <w:tc>
-          <w:tcPr>
-            <w:tcW w:type="dxa" w:w="1872"/>
+              <w:t xml:space="preserve">0.938</w:t>
+            </w:r>
+          </w:p>
+        </w:tc>
+        <w:tc>
+          <w:tcPr>
+            <w:tcW w:type="dxa" w:w="1900"/>
             <w:tcBorders>
               <w:top w:val="single" w:color="BBBBBB" w:sz="1"/>
               <w:left w:val="single" w:color="BBBBBB" w:sz="1"/>
@@ -2618,13 +3407,13 @@
                 <w:sz w:val="20"/>
                 <w:szCs w:val="20"/>
               </w:rPr>
-              <w:t xml:space="preserve">0.514</w:t>
-            </w:r>
-          </w:p>
-        </w:tc>
-        <w:tc>
-          <w:tcPr>
-            <w:tcW w:type="dxa" w:w="1404"/>
+              <w:t xml:space="preserve">91.9%</w:t>
+            </w:r>
+          </w:p>
+        </w:tc>
+        <w:tc>
+          <w:tcPr>
+            <w:tcW w:type="dxa" w:w="1400"/>
             <w:tcBorders>
               <w:top w:val="single" w:color="BBBBBB" w:sz="1"/>
               <w:left w:val="single" w:color="BBBBBB" w:sz="1"/>
@@ -2646,7 +3435,35 @@
                 <w:sz w:val="20"/>
                 <w:szCs w:val="20"/>
               </w:rPr>
-              <w:t xml:space="preserve">0.236</w:t>
+              <w:t xml:space="preserve">88.7%</w:t>
+            </w:r>
+          </w:p>
+        </w:tc>
+        <w:tc>
+          <w:tcPr>
+            <w:tcW w:type="dxa" w:w="600"/>
+            <w:tcBorders>
+              <w:top w:val="single" w:color="BBBBBB" w:sz="1"/>
+              <w:left w:val="single" w:color="BBBBBB" w:sz="1"/>
+              <w:bottom w:val="single" w:color="BBBBBB" w:sz="1"/>
+              <w:right w:val="single" w:color="BBBBBB" w:sz="1"/>
+            </w:tcBorders>
+            <w:shd w:fill="EEF4FA" w:val="clear"/>
+            <w:tcMar>
+              <w:top w:type="dxa" w:w="80"/>
+              <w:left w:type="dxa" w:w="120"/>
+              <w:bottom w:type="dxa" w:w="80"/>
+              <w:right w:type="dxa" w:w="120"/>
+            </w:tcMar>
+          </w:tcPr>
+          <w:p>
+            <w:r>
+              <w:rPr>
+                <w:rFonts w:ascii="Arial" w:cs="Arial" w:eastAsia="Arial" w:hAnsi="Arial"/>
+                <w:sz w:val="20"/>
+                <w:szCs w:val="20"/>
+              </w:rPr>
+              <w:t xml:space="preserve">1296</w:t>
             </w:r>
           </w:p>
         </w:tc>
@@ -2676,13 +3493,13 @@
                 <w:sz w:val="20"/>
                 <w:szCs w:val="20"/>
               </w:rPr>
-              <w:t xml:space="preserve">no_ppe</w:t>
-            </w:r>
-          </w:p>
-        </w:tc>
-        <w:tc>
-          <w:tcPr>
-            <w:tcW w:type="dxa" w:w="1872"/>
+              <w:t xml:space="preserve">glove</w:t>
+            </w:r>
+          </w:p>
+        </w:tc>
+        <w:tc>
+          <w:tcPr>
+            <w:tcW w:type="dxa" w:w="1560"/>
             <w:tcBorders>
               <w:top w:val="single" w:color="BBBBBB" w:sz="1"/>
               <w:left w:val="single" w:color="BBBBBB" w:sz="1"/>
@@ -2704,13 +3521,13 @@
                 <w:sz w:val="20"/>
                 <w:szCs w:val="20"/>
               </w:rPr>
-              <w:t xml:space="preserve">0.569</w:t>
-            </w:r>
-          </w:p>
-        </w:tc>
-        <w:tc>
-          <w:tcPr>
-            <w:tcW w:type="dxa" w:w="1872"/>
+              <w:t xml:space="preserve">0.822</w:t>
+            </w:r>
+          </w:p>
+        </w:tc>
+        <w:tc>
+          <w:tcPr>
+            <w:tcW w:type="dxa" w:w="1560"/>
             <w:tcBorders>
               <w:top w:val="single" w:color="BBBBBB" w:sz="1"/>
               <w:left w:val="single" w:color="BBBBBB" w:sz="1"/>
@@ -2732,13 +3549,13 @@
                 <w:sz w:val="20"/>
                 <w:szCs w:val="20"/>
               </w:rPr>
-              <w:t xml:space="preserve">0.518</w:t>
-            </w:r>
-          </w:p>
-        </w:tc>
-        <w:tc>
-          <w:tcPr>
-            <w:tcW w:type="dxa" w:w="1872"/>
+              <w:t xml:space="preserve">0.858</w:t>
+            </w:r>
+          </w:p>
+        </w:tc>
+        <w:tc>
+          <w:tcPr>
+            <w:tcW w:type="dxa" w:w="1900"/>
             <w:tcBorders>
               <w:top w:val="single" w:color="BBBBBB" w:sz="1"/>
               <w:left w:val="single" w:color="BBBBBB" w:sz="1"/>
@@ -2760,13 +3577,13 @@
                 <w:sz w:val="20"/>
                 <w:szCs w:val="20"/>
               </w:rPr>
-              <w:t xml:space="preserve">0.535</w:t>
-            </w:r>
-          </w:p>
-        </w:tc>
-        <w:tc>
-          <w:tcPr>
-            <w:tcW w:type="dxa" w:w="1404"/>
+              <w:t xml:space="preserve">87.6%</w:t>
+            </w:r>
+          </w:p>
+        </w:tc>
+        <w:tc>
+          <w:tcPr>
+            <w:tcW w:type="dxa" w:w="1400"/>
             <w:tcBorders>
               <w:top w:val="single" w:color="BBBBBB" w:sz="1"/>
               <w:left w:val="single" w:color="BBBBBB" w:sz="1"/>
@@ -2788,7 +3605,35 @@
                 <w:sz w:val="20"/>
                 <w:szCs w:val="20"/>
               </w:rPr>
-              <w:t xml:space="preserve">0.0749</w:t>
+              <w:t xml:space="preserve">86.7%</w:t>
+            </w:r>
+          </w:p>
+        </w:tc>
+        <w:tc>
+          <w:tcPr>
+            <w:tcW w:type="dxa" w:w="600"/>
+            <w:tcBorders>
+              <w:top w:val="single" w:color="BBBBBB" w:sz="1"/>
+              <w:left w:val="single" w:color="BBBBBB" w:sz="1"/>
+              <w:bottom w:val="single" w:color="BBBBBB" w:sz="1"/>
+              <w:right w:val="single" w:color="BBBBBB" w:sz="1"/>
+            </w:tcBorders>
+            <w:shd w:fill="FFFFFF" w:val="clear"/>
+            <w:tcMar>
+              <w:top w:type="dxa" w:w="80"/>
+              <w:left w:type="dxa" w:w="120"/>
+              <w:bottom w:type="dxa" w:w="80"/>
+              <w:right w:type="dxa" w:w="120"/>
+            </w:tcMar>
+          </w:tcPr>
+          <w:p>
+            <w:r>
+              <w:rPr>
+                <w:rFonts w:ascii="Arial" w:cs="Arial" w:eastAsia="Arial" w:hAnsi="Arial"/>
+                <w:sz w:val="20"/>
+                <w:szCs w:val="20"/>
+              </w:rPr>
+              <w:t xml:space="preserve">4663</w:t>
             </w:r>
           </w:p>
         </w:tc>
@@ -2818,13 +3663,13 @@
                 <w:sz w:val="20"/>
                 <w:szCs w:val="20"/>
               </w:rPr>
-              <w:t xml:space="preserve">partial_ppe</w:t>
-            </w:r>
-          </w:p>
-        </w:tc>
-        <w:tc>
-          <w:tcPr>
-            <w:tcW w:type="dxa" w:w="1872"/>
+              <w:t xml:space="preserve">no_glove</w:t>
+            </w:r>
+          </w:p>
+        </w:tc>
+        <w:tc>
+          <w:tcPr>
+            <w:tcW w:type="dxa" w:w="1560"/>
             <w:tcBorders>
               <w:top w:val="single" w:color="BBBBBB" w:sz="1"/>
               <w:left w:val="single" w:color="BBBBBB" w:sz="1"/>
@@ -2846,13 +3691,13 @@
                 <w:sz w:val="20"/>
                 <w:szCs w:val="20"/>
               </w:rPr>
-              <w:t xml:space="preserve">0.471</w:t>
-            </w:r>
-          </w:p>
-        </w:tc>
-        <w:tc>
-          <w:tcPr>
-            <w:tcW w:type="dxa" w:w="1872"/>
+              <w:t xml:space="preserve">0.848</w:t>
+            </w:r>
+          </w:p>
+        </w:tc>
+        <w:tc>
+          <w:tcPr>
+            <w:tcW w:type="dxa" w:w="1560"/>
             <w:tcBorders>
               <w:top w:val="single" w:color="BBBBBB" w:sz="1"/>
               <w:left w:val="single" w:color="BBBBBB" w:sz="1"/>
@@ -2874,13 +3719,13 @@
                 <w:sz w:val="20"/>
                 <w:szCs w:val="20"/>
               </w:rPr>
-              <w:t xml:space="preserve">0.476</w:t>
-            </w:r>
-          </w:p>
-        </w:tc>
-        <w:tc>
-          <w:tcPr>
-            <w:tcW w:type="dxa" w:w="1872"/>
+              <w:t xml:space="preserve">0.691</w:t>
+            </w:r>
+          </w:p>
+        </w:tc>
+        <w:tc>
+          <w:tcPr>
+            <w:tcW w:type="dxa" w:w="1900"/>
             <w:tcBorders>
               <w:top w:val="single" w:color="BBBBBB" w:sz="1"/>
               <w:left w:val="single" w:color="BBBBBB" w:sz="1"/>
@@ -2902,13 +3747,13 @@
                 <w:sz w:val="20"/>
                 <w:szCs w:val="20"/>
               </w:rPr>
-              <w:t xml:space="preserve">0.404</w:t>
-            </w:r>
-          </w:p>
-        </w:tc>
-        <w:tc>
-          <w:tcPr>
-            <w:tcW w:type="dxa" w:w="1404"/>
+              <w:t xml:space="preserve">80.8%</w:t>
+            </w:r>
+          </w:p>
+        </w:tc>
+        <w:tc>
+          <w:tcPr>
+            <w:tcW w:type="dxa" w:w="1400"/>
             <w:tcBorders>
               <w:top w:val="single" w:color="BBBBBB" w:sz="1"/>
               <w:left w:val="single" w:color="BBBBBB" w:sz="1"/>
@@ -2930,7 +3775,35 @@
                 <w:sz w:val="20"/>
                 <w:szCs w:val="20"/>
               </w:rPr>
-              <w:t xml:space="preserve">0.171</w:t>
+              <w:t xml:space="preserve">75.6%</w:t>
+            </w:r>
+          </w:p>
+        </w:tc>
+        <w:tc>
+          <w:tcPr>
+            <w:tcW w:type="dxa" w:w="600"/>
+            <w:tcBorders>
+              <w:top w:val="single" w:color="BBBBBB" w:sz="1"/>
+              <w:left w:val="single" w:color="BBBBBB" w:sz="1"/>
+              <w:bottom w:val="single" w:color="BBBBBB" w:sz="1"/>
+              <w:right w:val="single" w:color="BBBBBB" w:sz="1"/>
+            </w:tcBorders>
+            <w:shd w:fill="EEF4FA" w:val="clear"/>
+            <w:tcMar>
+              <w:top w:type="dxa" w:w="80"/>
+              <w:left w:type="dxa" w:w="120"/>
+              <w:bottom w:type="dxa" w:w="80"/>
+              <w:right w:type="dxa" w:w="120"/>
+            </w:tcMar>
+          </w:tcPr>
+          <w:p>
+            <w:r>
+              <w:rPr>
+                <w:rFonts w:ascii="Arial" w:cs="Arial" w:eastAsia="Arial" w:hAnsi="Arial"/>
+                <w:sz w:val="20"/>
+                <w:szCs w:val="20"/>
+              </w:rPr>
+              <w:t xml:space="preserve">6126</w:t>
             </w:r>
           </w:p>
         </w:tc>
@@ -2960,13 +3833,13 @@
                 <w:sz w:val="20"/>
                 <w:szCs w:val="20"/>
               </w:rPr>
-              <w:t xml:space="preserve">safety_vest</w:t>
-            </w:r>
-          </w:p>
-        </w:tc>
-        <w:tc>
-          <w:tcPr>
-            <w:tcW w:type="dxa" w:w="1872"/>
+              <w:t xml:space="preserve">goggles</w:t>
+            </w:r>
+          </w:p>
+        </w:tc>
+        <w:tc>
+          <w:tcPr>
+            <w:tcW w:type="dxa" w:w="1560"/>
             <w:tcBorders>
               <w:top w:val="single" w:color="BBBBBB" w:sz="1"/>
               <w:left w:val="single" w:color="BBBBBB" w:sz="1"/>
@@ -2988,13 +3861,13 @@
                 <w:sz w:val="20"/>
                 <w:szCs w:val="20"/>
               </w:rPr>
-              <w:t xml:space="preserve">0.395</w:t>
-            </w:r>
-          </w:p>
-        </w:tc>
-        <w:tc>
-          <w:tcPr>
-            <w:tcW w:type="dxa" w:w="1872"/>
+              <w:t xml:space="preserve">0.842</w:t>
+            </w:r>
+          </w:p>
+        </w:tc>
+        <w:tc>
+          <w:tcPr>
+            <w:tcW w:type="dxa" w:w="1560"/>
             <w:tcBorders>
               <w:top w:val="single" w:color="BBBBBB" w:sz="1"/>
               <w:left w:val="single" w:color="BBBBBB" w:sz="1"/>
@@ -3016,13 +3889,13 @@
                 <w:sz w:val="20"/>
                 <w:szCs w:val="20"/>
               </w:rPr>
-              <w:t xml:space="preserve">0.0949</w:t>
-            </w:r>
-          </w:p>
-        </w:tc>
-        <w:tc>
-          <w:tcPr>
-            <w:tcW w:type="dxa" w:w="1872"/>
+              <w:t xml:space="preserve">0.805</w:t>
+            </w:r>
+          </w:p>
+        </w:tc>
+        <w:tc>
+          <w:tcPr>
+            <w:tcW w:type="dxa" w:w="1900"/>
             <w:tcBorders>
               <w:top w:val="single" w:color="BBBBBB" w:sz="1"/>
               <w:left w:val="single" w:color="BBBBBB" w:sz="1"/>
@@ -3044,13 +3917,13 @@
                 <w:sz w:val="20"/>
                 <w:szCs w:val="20"/>
               </w:rPr>
-              <w:t xml:space="preserve">0.129</w:t>
-            </w:r>
-          </w:p>
-        </w:tc>
-        <w:tc>
-          <w:tcPr>
-            <w:tcW w:type="dxa" w:w="1404"/>
+              <w:t xml:space="preserve">87.1%</w:t>
+            </w:r>
+          </w:p>
+        </w:tc>
+        <w:tc>
+          <w:tcPr>
+            <w:tcW w:type="dxa" w:w="1400"/>
             <w:tcBorders>
               <w:top w:val="single" w:color="BBBBBB" w:sz="1"/>
               <w:left w:val="single" w:color="BBBBBB" w:sz="1"/>
@@ -3072,7 +3945,35 @@
                 <w:sz w:val="20"/>
                 <w:szCs w:val="20"/>
               </w:rPr>
-              <w:t xml:space="preserve">0.0564</w:t>
+              <w:t xml:space="preserve">79.6%</w:t>
+            </w:r>
+          </w:p>
+        </w:tc>
+        <w:tc>
+          <w:tcPr>
+            <w:tcW w:type="dxa" w:w="600"/>
+            <w:tcBorders>
+              <w:top w:val="single" w:color="BBBBBB" w:sz="1"/>
+              <w:left w:val="single" w:color="BBBBBB" w:sz="1"/>
+              <w:bottom w:val="single" w:color="BBBBBB" w:sz="1"/>
+              <w:right w:val="single" w:color="BBBBBB" w:sz="1"/>
+            </w:tcBorders>
+            <w:shd w:fill="FFFFFF" w:val="clear"/>
+            <w:tcMar>
+              <w:top w:type="dxa" w:w="80"/>
+              <w:left w:type="dxa" w:w="120"/>
+              <w:bottom w:type="dxa" w:w="80"/>
+              <w:right w:type="dxa" w:w="120"/>
+            </w:tcMar>
+          </w:tcPr>
+          <w:p>
+            <w:r>
+              <w:rPr>
+                <w:rFonts w:ascii="Arial" w:cs="Arial" w:eastAsia="Arial" w:hAnsi="Arial"/>
+                <w:sz w:val="20"/>
+                <w:szCs w:val="20"/>
+              </w:rPr>
+              <w:t xml:space="preserve">4184</w:t>
             </w:r>
           </w:p>
         </w:tc>
@@ -3102,119 +4003,997 @@
                 <w:sz w:val="20"/>
                 <w:szCs w:val="20"/>
               </w:rPr>
+              <w:t xml:space="preserve">no_goggles</w:t>
+            </w:r>
+          </w:p>
+        </w:tc>
+        <w:tc>
+          <w:tcPr>
+            <w:tcW w:type="dxa" w:w="1560"/>
+            <w:tcBorders>
+              <w:top w:val="single" w:color="BBBBBB" w:sz="1"/>
+              <w:left w:val="single" w:color="BBBBBB" w:sz="1"/>
+              <w:bottom w:val="single" w:color="BBBBBB" w:sz="1"/>
+              <w:right w:val="single" w:color="BBBBBB" w:sz="1"/>
+            </w:tcBorders>
+            <w:shd w:fill="EEF4FA" w:val="clear"/>
+            <w:tcMar>
+              <w:top w:type="dxa" w:w="80"/>
+              <w:left w:type="dxa" w:w="120"/>
+              <w:bottom w:type="dxa" w:w="80"/>
+              <w:right w:type="dxa" w:w="120"/>
+            </w:tcMar>
+          </w:tcPr>
+          <w:p>
+            <w:r>
+              <w:rPr>
+                <w:rFonts w:ascii="Arial" w:cs="Arial" w:eastAsia="Arial" w:hAnsi="Arial"/>
+                <w:sz w:val="20"/>
+                <w:szCs w:val="20"/>
+              </w:rPr>
+              <w:t xml:space="preserve">0.861</w:t>
+            </w:r>
+          </w:p>
+        </w:tc>
+        <w:tc>
+          <w:tcPr>
+            <w:tcW w:type="dxa" w:w="1560"/>
+            <w:tcBorders>
+              <w:top w:val="single" w:color="BBBBBB" w:sz="1"/>
+              <w:left w:val="single" w:color="BBBBBB" w:sz="1"/>
+              <w:bottom w:val="single" w:color="BBBBBB" w:sz="1"/>
+              <w:right w:val="single" w:color="BBBBBB" w:sz="1"/>
+            </w:tcBorders>
+            <w:shd w:fill="EEF4FA" w:val="clear"/>
+            <w:tcMar>
+              <w:top w:type="dxa" w:w="80"/>
+              <w:left w:type="dxa" w:w="120"/>
+              <w:bottom w:type="dxa" w:w="80"/>
+              <w:right w:type="dxa" w:w="120"/>
+            </w:tcMar>
+          </w:tcPr>
+          <w:p>
+            <w:r>
+              <w:rPr>
+                <w:rFonts w:ascii="Arial" w:cs="Arial" w:eastAsia="Arial" w:hAnsi="Arial"/>
+                <w:sz w:val="20"/>
+                <w:szCs w:val="20"/>
+              </w:rPr>
+              <w:t xml:space="preserve">0.669</w:t>
+            </w:r>
+          </w:p>
+        </w:tc>
+        <w:tc>
+          <w:tcPr>
+            <w:tcW w:type="dxa" w:w="1900"/>
+            <w:tcBorders>
+              <w:top w:val="single" w:color="BBBBBB" w:sz="1"/>
+              <w:left w:val="single" w:color="BBBBBB" w:sz="1"/>
+              <w:bottom w:val="single" w:color="BBBBBB" w:sz="1"/>
+              <w:right w:val="single" w:color="BBBBBB" w:sz="1"/>
+            </w:tcBorders>
+            <w:shd w:fill="EEF4FA" w:val="clear"/>
+            <w:tcMar>
+              <w:top w:type="dxa" w:w="80"/>
+              <w:left w:type="dxa" w:w="120"/>
+              <w:bottom w:type="dxa" w:w="80"/>
+              <w:right w:type="dxa" w:w="120"/>
+            </w:tcMar>
+          </w:tcPr>
+          <w:p>
+            <w:r>
+              <w:rPr>
+                <w:rFonts w:ascii="Arial" w:cs="Arial" w:eastAsia="Arial" w:hAnsi="Arial"/>
+                <w:sz w:val="20"/>
+                <w:szCs w:val="20"/>
+              </w:rPr>
+              <w:t xml:space="preserve">81.2%</w:t>
+            </w:r>
+          </w:p>
+        </w:tc>
+        <w:tc>
+          <w:tcPr>
+            <w:tcW w:type="dxa" w:w="1400"/>
+            <w:tcBorders>
+              <w:top w:val="single" w:color="BBBBBB" w:sz="1"/>
+              <w:left w:val="single" w:color="BBBBBB" w:sz="1"/>
+              <w:bottom w:val="single" w:color="BBBBBB" w:sz="1"/>
+              <w:right w:val="single" w:color="BBBBBB" w:sz="1"/>
+            </w:tcBorders>
+            <w:shd w:fill="EEF4FA" w:val="clear"/>
+            <w:tcMar>
+              <w:top w:type="dxa" w:w="80"/>
+              <w:left w:type="dxa" w:w="120"/>
+              <w:bottom w:type="dxa" w:w="80"/>
+              <w:right w:type="dxa" w:w="120"/>
+            </w:tcMar>
+          </w:tcPr>
+          <w:p>
+            <w:r>
+              <w:rPr>
+                <w:rFonts w:ascii="Arial" w:cs="Arial" w:eastAsia="Arial" w:hAnsi="Arial"/>
+                <w:sz w:val="20"/>
+                <w:szCs w:val="20"/>
+              </w:rPr>
+              <w:t xml:space="preserve">76.7%</w:t>
+            </w:r>
+          </w:p>
+        </w:tc>
+        <w:tc>
+          <w:tcPr>
+            <w:tcW w:type="dxa" w:w="600"/>
+            <w:tcBorders>
+              <w:top w:val="single" w:color="BBBBBB" w:sz="1"/>
+              <w:left w:val="single" w:color="BBBBBB" w:sz="1"/>
+              <w:bottom w:val="single" w:color="BBBBBB" w:sz="1"/>
+              <w:right w:val="single" w:color="BBBBBB" w:sz="1"/>
+            </w:tcBorders>
+            <w:shd w:fill="EEF4FA" w:val="clear"/>
+            <w:tcMar>
+              <w:top w:type="dxa" w:w="80"/>
+              <w:left w:type="dxa" w:w="120"/>
+              <w:bottom w:type="dxa" w:w="80"/>
+              <w:right w:type="dxa" w:w="120"/>
+            </w:tcMar>
+          </w:tcPr>
+          <w:p>
+            <w:r>
+              <w:rPr>
+                <w:rFonts w:ascii="Arial" w:cs="Arial" w:eastAsia="Arial" w:hAnsi="Arial"/>
+                <w:sz w:val="20"/>
+                <w:szCs w:val="20"/>
+              </w:rPr>
+              <w:t xml:space="preserve">4092</w:t>
+            </w:r>
+          </w:p>
+        </w:tc>
+      </w:tr>
+      <w:tr>
+        <w:tc>
+          <w:tcPr>
+            <w:tcW w:type="dxa" w:w="2340"/>
+            <w:tcBorders>
+              <w:top w:val="single" w:color="BBBBBB" w:sz="1"/>
+              <w:left w:val="single" w:color="BBBBBB" w:sz="1"/>
+              <w:bottom w:val="single" w:color="BBBBBB" w:sz="1"/>
+              <w:right w:val="single" w:color="BBBBBB" w:sz="1"/>
+            </w:tcBorders>
+            <w:shd w:fill="FFFFFF" w:val="clear"/>
+            <w:tcMar>
+              <w:top w:type="dxa" w:w="80"/>
+              <w:left w:type="dxa" w:w="120"/>
+              <w:bottom w:type="dxa" w:w="80"/>
+              <w:right w:type="dxa" w:w="120"/>
+            </w:tcMar>
+          </w:tcPr>
+          <w:p>
+            <w:r>
+              <w:rPr>
+                <w:rFonts w:ascii="Arial" w:cs="Arial" w:eastAsia="Arial" w:hAnsi="Arial"/>
+                <w:sz w:val="20"/>
+                <w:szCs w:val="20"/>
+              </w:rPr>
+              <w:t xml:space="preserve">mask</w:t>
+            </w:r>
+          </w:p>
+        </w:tc>
+        <w:tc>
+          <w:tcPr>
+            <w:tcW w:type="dxa" w:w="1560"/>
+            <w:tcBorders>
+              <w:top w:val="single" w:color="BBBBBB" w:sz="1"/>
+              <w:left w:val="single" w:color="BBBBBB" w:sz="1"/>
+              <w:bottom w:val="single" w:color="BBBBBB" w:sz="1"/>
+              <w:right w:val="single" w:color="BBBBBB" w:sz="1"/>
+            </w:tcBorders>
+            <w:shd w:fill="FFFFFF" w:val="clear"/>
+            <w:tcMar>
+              <w:top w:type="dxa" w:w="80"/>
+              <w:left w:type="dxa" w:w="120"/>
+              <w:bottom w:type="dxa" w:w="80"/>
+              <w:right w:type="dxa" w:w="120"/>
+            </w:tcMar>
+          </w:tcPr>
+          <w:p>
+            <w:r>
+              <w:rPr>
+                <w:rFonts w:ascii="Arial" w:cs="Arial" w:eastAsia="Arial" w:hAnsi="Arial"/>
+                <w:sz w:val="20"/>
+                <w:szCs w:val="20"/>
+              </w:rPr>
+              <w:t xml:space="preserve">0.786</w:t>
+            </w:r>
+          </w:p>
+        </w:tc>
+        <w:tc>
+          <w:tcPr>
+            <w:tcW w:type="dxa" w:w="1560"/>
+            <w:tcBorders>
+              <w:top w:val="single" w:color="BBBBBB" w:sz="1"/>
+              <w:left w:val="single" w:color="BBBBBB" w:sz="1"/>
+              <w:bottom w:val="single" w:color="BBBBBB" w:sz="1"/>
+              <w:right w:val="single" w:color="BBBBBB" w:sz="1"/>
+            </w:tcBorders>
+            <w:shd w:fill="FFFFFF" w:val="clear"/>
+            <w:tcMar>
+              <w:top w:type="dxa" w:w="80"/>
+              <w:left w:type="dxa" w:w="120"/>
+              <w:bottom w:type="dxa" w:w="80"/>
+              <w:right w:type="dxa" w:w="120"/>
+            </w:tcMar>
+          </w:tcPr>
+          <w:p>
+            <w:r>
+              <w:rPr>
+                <w:rFonts w:ascii="Arial" w:cs="Arial" w:eastAsia="Arial" w:hAnsi="Arial"/>
+                <w:sz w:val="20"/>
+                <w:szCs w:val="20"/>
+              </w:rPr>
+              <w:t xml:space="preserve">0.933</w:t>
+            </w:r>
+          </w:p>
+        </w:tc>
+        <w:tc>
+          <w:tcPr>
+            <w:tcW w:type="dxa" w:w="1900"/>
+            <w:tcBorders>
+              <w:top w:val="single" w:color="BBBBBB" w:sz="1"/>
+              <w:left w:val="single" w:color="BBBBBB" w:sz="1"/>
+              <w:bottom w:val="single" w:color="BBBBBB" w:sz="1"/>
+              <w:right w:val="single" w:color="BBBBBB" w:sz="1"/>
+            </w:tcBorders>
+            <w:shd w:fill="FFFFFF" w:val="clear"/>
+            <w:tcMar>
+              <w:top w:type="dxa" w:w="80"/>
+              <w:left w:type="dxa" w:w="120"/>
+              <w:bottom w:type="dxa" w:w="80"/>
+              <w:right w:type="dxa" w:w="120"/>
+            </w:tcMar>
+          </w:tcPr>
+          <w:p>
+            <w:r>
+              <w:rPr>
+                <w:rFonts w:ascii="Arial" w:cs="Arial" w:eastAsia="Arial" w:hAnsi="Arial"/>
+                <w:sz w:val="20"/>
+                <w:szCs w:val="20"/>
+              </w:rPr>
+              <w:t xml:space="preserve">96.1%</w:t>
+            </w:r>
+          </w:p>
+        </w:tc>
+        <w:tc>
+          <w:tcPr>
+            <w:tcW w:type="dxa" w:w="1400"/>
+            <w:tcBorders>
+              <w:top w:val="single" w:color="BBBBBB" w:sz="1"/>
+              <w:left w:val="single" w:color="BBBBBB" w:sz="1"/>
+              <w:bottom w:val="single" w:color="BBBBBB" w:sz="1"/>
+              <w:right w:val="single" w:color="BBBBBB" w:sz="1"/>
+            </w:tcBorders>
+            <w:shd w:fill="FFFFFF" w:val="clear"/>
+            <w:tcMar>
+              <w:top w:type="dxa" w:w="80"/>
+              <w:left w:type="dxa" w:w="120"/>
+              <w:bottom w:type="dxa" w:w="80"/>
+              <w:right w:type="dxa" w:w="120"/>
+            </w:tcMar>
+          </w:tcPr>
+          <w:p>
+            <w:r>
+              <w:rPr>
+                <w:rFonts w:ascii="Arial" w:cs="Arial" w:eastAsia="Arial" w:hAnsi="Arial"/>
+                <w:sz w:val="20"/>
+                <w:szCs w:val="20"/>
+              </w:rPr>
+              <w:t xml:space="preserve">91.9%</w:t>
+            </w:r>
+          </w:p>
+        </w:tc>
+        <w:tc>
+          <w:tcPr>
+            <w:tcW w:type="dxa" w:w="600"/>
+            <w:tcBorders>
+              <w:top w:val="single" w:color="BBBBBB" w:sz="1"/>
+              <w:left w:val="single" w:color="BBBBBB" w:sz="1"/>
+              <w:bottom w:val="single" w:color="BBBBBB" w:sz="1"/>
+              <w:right w:val="single" w:color="BBBBBB" w:sz="1"/>
+            </w:tcBorders>
+            <w:shd w:fill="FFFFFF" w:val="clear"/>
+            <w:tcMar>
+              <w:top w:type="dxa" w:w="80"/>
+              <w:left w:type="dxa" w:w="120"/>
+              <w:bottom w:type="dxa" w:w="80"/>
+              <w:right w:type="dxa" w:w="120"/>
+            </w:tcMar>
+          </w:tcPr>
+          <w:p>
+            <w:r>
+              <w:rPr>
+                <w:rFonts w:ascii="Arial" w:cs="Arial" w:eastAsia="Arial" w:hAnsi="Arial"/>
+                <w:sz w:val="20"/>
+                <w:szCs w:val="20"/>
+              </w:rPr>
+              <w:t xml:space="preserve">269</w:t>
+            </w:r>
+          </w:p>
+        </w:tc>
+      </w:tr>
+      <w:tr>
+        <w:tc>
+          <w:tcPr>
+            <w:tcW w:type="dxa" w:w="2340"/>
+            <w:tcBorders>
+              <w:top w:val="single" w:color="BBBBBB" w:sz="1"/>
+              <w:left w:val="single" w:color="BBBBBB" w:sz="1"/>
+              <w:bottom w:val="single" w:color="BBBBBB" w:sz="1"/>
+              <w:right w:val="single" w:color="BBBBBB" w:sz="1"/>
+            </w:tcBorders>
+            <w:shd w:fill="EEF4FA" w:val="clear"/>
+            <w:tcMar>
+              <w:top w:type="dxa" w:w="80"/>
+              <w:left w:type="dxa" w:w="120"/>
+              <w:bottom w:type="dxa" w:w="80"/>
+              <w:right w:type="dxa" w:w="120"/>
+            </w:tcMar>
+          </w:tcPr>
+          <w:p>
+            <w:r>
+              <w:rPr>
+                <w:rFonts w:ascii="Arial" w:cs="Arial" w:eastAsia="Arial" w:hAnsi="Arial"/>
+                <w:sz w:val="20"/>
+                <w:szCs w:val="20"/>
+              </w:rPr>
+              <w:t xml:space="preserve">no_mask</w:t>
+            </w:r>
+          </w:p>
+        </w:tc>
+        <w:tc>
+          <w:tcPr>
+            <w:tcW w:type="dxa" w:w="1560"/>
+            <w:tcBorders>
+              <w:top w:val="single" w:color="BBBBBB" w:sz="1"/>
+              <w:left w:val="single" w:color="BBBBBB" w:sz="1"/>
+              <w:bottom w:val="single" w:color="BBBBBB" w:sz="1"/>
+              <w:right w:val="single" w:color="BBBBBB" w:sz="1"/>
+            </w:tcBorders>
+            <w:shd w:fill="EEF4FA" w:val="clear"/>
+            <w:tcMar>
+              <w:top w:type="dxa" w:w="80"/>
+              <w:left w:type="dxa" w:w="120"/>
+              <w:bottom w:type="dxa" w:w="80"/>
+              <w:right w:type="dxa" w:w="120"/>
+            </w:tcMar>
+          </w:tcPr>
+          <w:p>
+            <w:r>
+              <w:rPr>
+                <w:rFonts w:ascii="Arial" w:cs="Arial" w:eastAsia="Arial" w:hAnsi="Arial"/>
+                <w:sz w:val="20"/>
+                <w:szCs w:val="20"/>
+              </w:rPr>
+              <w:t xml:space="preserve">0.867</w:t>
+            </w:r>
+          </w:p>
+        </w:tc>
+        <w:tc>
+          <w:tcPr>
+            <w:tcW w:type="dxa" w:w="1560"/>
+            <w:tcBorders>
+              <w:top w:val="single" w:color="BBBBBB" w:sz="1"/>
+              <w:left w:val="single" w:color="BBBBBB" w:sz="1"/>
+              <w:bottom w:val="single" w:color="BBBBBB" w:sz="1"/>
+              <w:right w:val="single" w:color="BBBBBB" w:sz="1"/>
+            </w:tcBorders>
+            <w:shd w:fill="EEF4FA" w:val="clear"/>
+            <w:tcMar>
+              <w:top w:type="dxa" w:w="80"/>
+              <w:left w:type="dxa" w:w="120"/>
+              <w:bottom w:type="dxa" w:w="80"/>
+              <w:right w:type="dxa" w:w="120"/>
+            </w:tcMar>
+          </w:tcPr>
+          <w:p>
+            <w:r>
+              <w:rPr>
+                <w:rFonts w:ascii="Arial" w:cs="Arial" w:eastAsia="Arial" w:hAnsi="Arial"/>
+                <w:sz w:val="20"/>
+                <w:szCs w:val="20"/>
+              </w:rPr>
+              <w:t xml:space="preserve">0.767</w:t>
+            </w:r>
+          </w:p>
+        </w:tc>
+        <w:tc>
+          <w:tcPr>
+            <w:tcW w:type="dxa" w:w="1900"/>
+            <w:tcBorders>
+              <w:top w:val="single" w:color="BBBBBB" w:sz="1"/>
+              <w:left w:val="single" w:color="BBBBBB" w:sz="1"/>
+              <w:bottom w:val="single" w:color="BBBBBB" w:sz="1"/>
+              <w:right w:val="single" w:color="BBBBBB" w:sz="1"/>
+            </w:tcBorders>
+            <w:shd w:fill="EEF4FA" w:val="clear"/>
+            <w:tcMar>
+              <w:top w:type="dxa" w:w="80"/>
+              <w:left w:type="dxa" w:w="120"/>
+              <w:bottom w:type="dxa" w:w="80"/>
+              <w:right w:type="dxa" w:w="120"/>
+            </w:tcMar>
+          </w:tcPr>
+          <w:p>
+            <w:r>
+              <w:rPr>
+                <w:rFonts w:ascii="Arial" w:cs="Arial" w:eastAsia="Arial" w:hAnsi="Arial"/>
+                <w:sz w:val="20"/>
+                <w:szCs w:val="20"/>
+              </w:rPr>
+              <w:t xml:space="preserve">82.4%</w:t>
+            </w:r>
+          </w:p>
+        </w:tc>
+        <w:tc>
+          <w:tcPr>
+            <w:tcW w:type="dxa" w:w="1400"/>
+            <w:tcBorders>
+              <w:top w:val="single" w:color="BBBBBB" w:sz="1"/>
+              <w:left w:val="single" w:color="BBBBBB" w:sz="1"/>
+              <w:bottom w:val="single" w:color="BBBBBB" w:sz="1"/>
+              <w:right w:val="single" w:color="BBBBBB" w:sz="1"/>
+            </w:tcBorders>
+            <w:shd w:fill="EEF4FA" w:val="clear"/>
+            <w:tcMar>
+              <w:top w:type="dxa" w:w="80"/>
+              <w:left w:type="dxa" w:w="120"/>
+              <w:bottom w:type="dxa" w:w="80"/>
+              <w:right w:type="dxa" w:w="120"/>
+            </w:tcMar>
+          </w:tcPr>
+          <w:p>
+            <w:r>
+              <w:rPr>
+                <w:rFonts w:ascii="Arial" w:cs="Arial" w:eastAsia="Arial" w:hAnsi="Arial"/>
+                <w:sz w:val="20"/>
+                <w:szCs w:val="20"/>
+              </w:rPr>
+              <w:t xml:space="preserve">78.8%</w:t>
+            </w:r>
+          </w:p>
+        </w:tc>
+        <w:tc>
+          <w:tcPr>
+            <w:tcW w:type="dxa" w:w="600"/>
+            <w:tcBorders>
+              <w:top w:val="single" w:color="BBBBBB" w:sz="1"/>
+              <w:left w:val="single" w:color="BBBBBB" w:sz="1"/>
+              <w:bottom w:val="single" w:color="BBBBBB" w:sz="1"/>
+              <w:right w:val="single" w:color="BBBBBB" w:sz="1"/>
+            </w:tcBorders>
+            <w:shd w:fill="EEF4FA" w:val="clear"/>
+            <w:tcMar>
+              <w:top w:type="dxa" w:w="80"/>
+              <w:left w:type="dxa" w:w="120"/>
+              <w:bottom w:type="dxa" w:w="80"/>
+              <w:right w:type="dxa" w:w="120"/>
+            </w:tcMar>
+          </w:tcPr>
+          <w:p>
+            <w:r>
+              <w:rPr>
+                <w:rFonts w:ascii="Arial" w:cs="Arial" w:eastAsia="Arial" w:hAnsi="Arial"/>
+                <w:sz w:val="20"/>
+                <w:szCs w:val="20"/>
+              </w:rPr>
+              <w:t xml:space="preserve">661</w:t>
+            </w:r>
+          </w:p>
+        </w:tc>
+      </w:tr>
+      <w:tr>
+        <w:tc>
+          <w:tcPr>
+            <w:tcW w:type="dxa" w:w="2340"/>
+            <w:tcBorders>
+              <w:top w:val="single" w:color="BBBBBB" w:sz="1"/>
+              <w:left w:val="single" w:color="BBBBBB" w:sz="1"/>
+              <w:bottom w:val="single" w:color="BBBBBB" w:sz="1"/>
+              <w:right w:val="single" w:color="BBBBBB" w:sz="1"/>
+            </w:tcBorders>
+            <w:shd w:fill="FFFFFF" w:val="clear"/>
+            <w:tcMar>
+              <w:top w:type="dxa" w:w="80"/>
+              <w:left w:type="dxa" w:w="120"/>
+              <w:bottom w:type="dxa" w:w="80"/>
+              <w:right w:type="dxa" w:w="120"/>
+            </w:tcMar>
+          </w:tcPr>
+          <w:p>
+            <w:r>
+              <w:rPr>
+                <w:rFonts w:ascii="Arial" w:cs="Arial" w:eastAsia="Arial" w:hAnsi="Arial"/>
+                <w:sz w:val="20"/>
+                <w:szCs w:val="20"/>
+              </w:rPr>
+              <w:t xml:space="preserve">shoes</w:t>
+            </w:r>
+          </w:p>
+        </w:tc>
+        <w:tc>
+          <w:tcPr>
+            <w:tcW w:type="dxa" w:w="1560"/>
+            <w:tcBorders>
+              <w:top w:val="single" w:color="BBBBBB" w:sz="1"/>
+              <w:left w:val="single" w:color="BBBBBB" w:sz="1"/>
+              <w:bottom w:val="single" w:color="BBBBBB" w:sz="1"/>
+              <w:right w:val="single" w:color="BBBBBB" w:sz="1"/>
+            </w:tcBorders>
+            <w:shd w:fill="FFFFFF" w:val="clear"/>
+            <w:tcMar>
+              <w:top w:type="dxa" w:w="80"/>
+              <w:left w:type="dxa" w:w="120"/>
+              <w:bottom w:type="dxa" w:w="80"/>
+              <w:right w:type="dxa" w:w="120"/>
+            </w:tcMar>
+          </w:tcPr>
+          <w:p>
+            <w:r>
+              <w:rPr>
+                <w:rFonts w:ascii="Arial" w:cs="Arial" w:eastAsia="Arial" w:hAnsi="Arial"/>
+                <w:sz w:val="20"/>
+                <w:szCs w:val="20"/>
+              </w:rPr>
+              <w:t xml:space="preserve">0.819</w:t>
+            </w:r>
+          </w:p>
+        </w:tc>
+        <w:tc>
+          <w:tcPr>
+            <w:tcW w:type="dxa" w:w="1560"/>
+            <w:tcBorders>
+              <w:top w:val="single" w:color="BBBBBB" w:sz="1"/>
+              <w:left w:val="single" w:color="BBBBBB" w:sz="1"/>
+              <w:bottom w:val="single" w:color="BBBBBB" w:sz="1"/>
+              <w:right w:val="single" w:color="BBBBBB" w:sz="1"/>
+            </w:tcBorders>
+            <w:shd w:fill="FFFFFF" w:val="clear"/>
+            <w:tcMar>
+              <w:top w:type="dxa" w:w="80"/>
+              <w:left w:type="dxa" w:w="120"/>
+              <w:bottom w:type="dxa" w:w="80"/>
+              <w:right w:type="dxa" w:w="120"/>
+            </w:tcMar>
+          </w:tcPr>
+          <w:p>
+            <w:r>
+              <w:rPr>
+                <w:rFonts w:ascii="Arial" w:cs="Arial" w:eastAsia="Arial" w:hAnsi="Arial"/>
+                <w:sz w:val="20"/>
+                <w:szCs w:val="20"/>
+              </w:rPr>
+              <w:t xml:space="preserve">0.905</w:t>
+            </w:r>
+          </w:p>
+        </w:tc>
+        <w:tc>
+          <w:tcPr>
+            <w:tcW w:type="dxa" w:w="1900"/>
+            <w:tcBorders>
+              <w:top w:val="single" w:color="BBBBBB" w:sz="1"/>
+              <w:left w:val="single" w:color="BBBBBB" w:sz="1"/>
+              <w:bottom w:val="single" w:color="BBBBBB" w:sz="1"/>
+              <w:right w:val="single" w:color="BBBBBB" w:sz="1"/>
+            </w:tcBorders>
+            <w:shd w:fill="FFFFFF" w:val="clear"/>
+            <w:tcMar>
+              <w:top w:type="dxa" w:w="80"/>
+              <w:left w:type="dxa" w:w="120"/>
+              <w:bottom w:type="dxa" w:w="80"/>
+              <w:right w:type="dxa" w:w="120"/>
+            </w:tcMar>
+          </w:tcPr>
+          <w:p>
+            <w:r>
+              <w:rPr>
+                <w:rFonts w:ascii="Arial" w:cs="Arial" w:eastAsia="Arial" w:hAnsi="Arial"/>
+                <w:sz w:val="20"/>
+                <w:szCs w:val="20"/>
+              </w:rPr>
+              <w:t xml:space="preserve">94.5%</w:t>
+            </w:r>
+          </w:p>
+        </w:tc>
+        <w:tc>
+          <w:tcPr>
+            <w:tcW w:type="dxa" w:w="1400"/>
+            <w:tcBorders>
+              <w:top w:val="single" w:color="BBBBBB" w:sz="1"/>
+              <w:left w:val="single" w:color="BBBBBB" w:sz="1"/>
+              <w:bottom w:val="single" w:color="BBBBBB" w:sz="1"/>
+              <w:right w:val="single" w:color="BBBBBB" w:sz="1"/>
+            </w:tcBorders>
+            <w:shd w:fill="FFFFFF" w:val="clear"/>
+            <w:tcMar>
+              <w:top w:type="dxa" w:w="80"/>
+              <w:left w:type="dxa" w:w="120"/>
+              <w:bottom w:type="dxa" w:w="80"/>
+              <w:right w:type="dxa" w:w="120"/>
+            </w:tcMar>
+          </w:tcPr>
+          <w:p>
+            <w:r>
+              <w:rPr>
+                <w:rFonts w:ascii="Arial" w:cs="Arial" w:eastAsia="Arial" w:hAnsi="Arial"/>
+                <w:sz w:val="20"/>
+                <w:szCs w:val="20"/>
+              </w:rPr>
+              <w:t xml:space="preserve">94.5%</w:t>
+            </w:r>
+          </w:p>
+        </w:tc>
+        <w:tc>
+          <w:tcPr>
+            <w:tcW w:type="dxa" w:w="600"/>
+            <w:tcBorders>
+              <w:top w:val="single" w:color="BBBBBB" w:sz="1"/>
+              <w:left w:val="single" w:color="BBBBBB" w:sz="1"/>
+              <w:bottom w:val="single" w:color="BBBBBB" w:sz="1"/>
+              <w:right w:val="single" w:color="BBBBBB" w:sz="1"/>
+            </w:tcBorders>
+            <w:shd w:fill="FFFFFF" w:val="clear"/>
+            <w:tcMar>
+              <w:top w:type="dxa" w:w="80"/>
+              <w:left w:type="dxa" w:w="120"/>
+              <w:bottom w:type="dxa" w:w="80"/>
+              <w:right w:type="dxa" w:w="120"/>
+            </w:tcMar>
+          </w:tcPr>
+          <w:p>
+            <w:r>
+              <w:rPr>
+                <w:rFonts w:ascii="Arial" w:cs="Arial" w:eastAsia="Arial" w:hAnsi="Arial"/>
+                <w:sz w:val="20"/>
+                <w:szCs w:val="20"/>
+              </w:rPr>
+              <w:t xml:space="preserve">755</w:t>
+            </w:r>
+          </w:p>
+        </w:tc>
+      </w:tr>
+      <w:tr>
+        <w:tc>
+          <w:tcPr>
+            <w:tcW w:type="dxa" w:w="2340"/>
+            <w:tcBorders>
+              <w:top w:val="single" w:color="BBBBBB" w:sz="1"/>
+              <w:left w:val="single" w:color="BBBBBB" w:sz="1"/>
+              <w:bottom w:val="single" w:color="BBBBBB" w:sz="1"/>
+              <w:right w:val="single" w:color="BBBBBB" w:sz="1"/>
+            </w:tcBorders>
+            <w:shd w:fill="EEF4FA" w:val="clear"/>
+            <w:tcMar>
+              <w:top w:type="dxa" w:w="80"/>
+              <w:left w:type="dxa" w:w="120"/>
+              <w:bottom w:type="dxa" w:w="80"/>
+              <w:right w:type="dxa" w:w="120"/>
+            </w:tcMar>
+          </w:tcPr>
+          <w:p>
+            <w:r>
+              <w:rPr>
+                <w:rFonts w:ascii="Arial" w:cs="Arial" w:eastAsia="Arial" w:hAnsi="Arial"/>
+                <w:sz w:val="20"/>
+                <w:szCs w:val="20"/>
+              </w:rPr>
+              <w:t xml:space="preserve">no_shoes</w:t>
+            </w:r>
+          </w:p>
+        </w:tc>
+        <w:tc>
+          <w:tcPr>
+            <w:tcW w:type="dxa" w:w="1560"/>
+            <w:tcBorders>
+              <w:top w:val="single" w:color="BBBBBB" w:sz="1"/>
+              <w:left w:val="single" w:color="BBBBBB" w:sz="1"/>
+              <w:bottom w:val="single" w:color="BBBBBB" w:sz="1"/>
+              <w:right w:val="single" w:color="BBBBBB" w:sz="1"/>
+            </w:tcBorders>
+            <w:shd w:fill="EEF4FA" w:val="clear"/>
+            <w:tcMar>
+              <w:top w:type="dxa" w:w="80"/>
+              <w:left w:type="dxa" w:w="120"/>
+              <w:bottom w:type="dxa" w:w="80"/>
+              <w:right w:type="dxa" w:w="120"/>
+            </w:tcMar>
+          </w:tcPr>
+          <w:p>
+            <w:r>
+              <w:rPr>
+                <w:rFonts w:ascii="Arial" w:cs="Arial" w:eastAsia="Arial" w:hAnsi="Arial"/>
+                <w:sz w:val="20"/>
+                <w:szCs w:val="20"/>
+              </w:rPr>
+              <w:t xml:space="preserve">0.934</w:t>
+            </w:r>
+          </w:p>
+        </w:tc>
+        <w:tc>
+          <w:tcPr>
+            <w:tcW w:type="dxa" w:w="1560"/>
+            <w:tcBorders>
+              <w:top w:val="single" w:color="BBBBBB" w:sz="1"/>
+              <w:left w:val="single" w:color="BBBBBB" w:sz="1"/>
+              <w:bottom w:val="single" w:color="BBBBBB" w:sz="1"/>
+              <w:right w:val="single" w:color="BBBBBB" w:sz="1"/>
+            </w:tcBorders>
+            <w:shd w:fill="EEF4FA" w:val="clear"/>
+            <w:tcMar>
+              <w:top w:type="dxa" w:w="80"/>
+              <w:left w:type="dxa" w:w="120"/>
+              <w:bottom w:type="dxa" w:w="80"/>
+              <w:right w:type="dxa" w:w="120"/>
+            </w:tcMar>
+          </w:tcPr>
+          <w:p>
+            <w:r>
+              <w:rPr>
+                <w:rFonts w:ascii="Arial" w:cs="Arial" w:eastAsia="Arial" w:hAnsi="Arial"/>
+                <w:sz w:val="20"/>
+                <w:szCs w:val="20"/>
+              </w:rPr>
+              <w:t xml:space="preserve">1.000</w:t>
+            </w:r>
+          </w:p>
+        </w:tc>
+        <w:tc>
+          <w:tcPr>
+            <w:tcW w:type="dxa" w:w="1900"/>
+            <w:tcBorders>
+              <w:top w:val="single" w:color="BBBBBB" w:sz="1"/>
+              <w:left w:val="single" w:color="BBBBBB" w:sz="1"/>
+              <w:bottom w:val="single" w:color="BBBBBB" w:sz="1"/>
+              <w:right w:val="single" w:color="BBBBBB" w:sz="1"/>
+            </w:tcBorders>
+            <w:shd w:fill="EEF4FA" w:val="clear"/>
+            <w:tcMar>
+              <w:top w:type="dxa" w:w="80"/>
+              <w:left w:type="dxa" w:w="120"/>
+              <w:bottom w:type="dxa" w:w="80"/>
+              <w:right w:type="dxa" w:w="120"/>
+            </w:tcMar>
+          </w:tcPr>
+          <w:p>
+            <w:r>
+              <w:rPr>
+                <w:rFonts w:ascii="Arial" w:cs="Arial" w:eastAsia="Arial" w:hAnsi="Arial"/>
+                <w:sz w:val="20"/>
+                <w:szCs w:val="20"/>
+              </w:rPr>
+              <w:t xml:space="preserve">99.5%</w:t>
+            </w:r>
+          </w:p>
+        </w:tc>
+        <w:tc>
+          <w:tcPr>
+            <w:tcW w:type="dxa" w:w="1400"/>
+            <w:tcBorders>
+              <w:top w:val="single" w:color="BBBBBB" w:sz="1"/>
+              <w:left w:val="single" w:color="BBBBBB" w:sz="1"/>
+              <w:bottom w:val="single" w:color="BBBBBB" w:sz="1"/>
+              <w:right w:val="single" w:color="BBBBBB" w:sz="1"/>
+            </w:tcBorders>
+            <w:shd w:fill="EEF4FA" w:val="clear"/>
+            <w:tcMar>
+              <w:top w:type="dxa" w:w="80"/>
+              <w:left w:type="dxa" w:w="120"/>
+              <w:bottom w:type="dxa" w:w="80"/>
+              <w:right w:type="dxa" w:w="120"/>
+            </w:tcMar>
+          </w:tcPr>
+          <w:p>
+            <w:r>
+              <w:rPr>
+                <w:rFonts w:ascii="Arial" w:cs="Arial" w:eastAsia="Arial" w:hAnsi="Arial"/>
+                <w:sz w:val="20"/>
+                <w:szCs w:val="20"/>
+              </w:rPr>
+              <w:t xml:space="preserve">99.5%</w:t>
+            </w:r>
+          </w:p>
+        </w:tc>
+        <w:tc>
+          <w:tcPr>
+            <w:tcW w:type="dxa" w:w="600"/>
+            <w:tcBorders>
+              <w:top w:val="single" w:color="BBBBBB" w:sz="1"/>
+              <w:left w:val="single" w:color="BBBBBB" w:sz="1"/>
+              <w:bottom w:val="single" w:color="BBBBBB" w:sz="1"/>
+              <w:right w:val="single" w:color="BBBBBB" w:sz="1"/>
+            </w:tcBorders>
+            <w:shd w:fill="EEF4FA" w:val="clear"/>
+            <w:tcMar>
+              <w:top w:type="dxa" w:w="80"/>
+              <w:left w:type="dxa" w:w="120"/>
+              <w:bottom w:type="dxa" w:w="80"/>
+              <w:right w:type="dxa" w:w="120"/>
+            </w:tcMar>
+          </w:tcPr>
+          <w:p>
+            <w:r>
+              <w:rPr>
+                <w:rFonts w:ascii="Arial" w:cs="Arial" w:eastAsia="Arial" w:hAnsi="Arial"/>
+                <w:sz w:val="20"/>
+                <w:szCs w:val="20"/>
+              </w:rPr>
+              <w:t xml:space="preserve">606</w:t>
+            </w:r>
+          </w:p>
+        </w:tc>
+      </w:tr>
+      <w:tr>
+        <w:tc>
+          <w:tcPr>
+            <w:tcW w:type="dxa" w:w="2340"/>
+            <w:tcBorders>
+              <w:top w:val="single" w:color="BBBBBB" w:sz="1"/>
+              <w:left w:val="single" w:color="BBBBBB" w:sz="1"/>
+              <w:bottom w:val="single" w:color="BBBBBB" w:sz="1"/>
+              <w:right w:val="single" w:color="BBBBBB" w:sz="1"/>
+            </w:tcBorders>
+            <w:shd w:fill="FFFFFF" w:val="clear"/>
+            <w:tcMar>
+              <w:top w:type="dxa" w:w="80"/>
+              <w:left w:type="dxa" w:w="120"/>
+              <w:bottom w:type="dxa" w:w="80"/>
+              <w:right w:type="dxa" w:w="120"/>
+            </w:tcMar>
+          </w:tcPr>
+          <w:p>
+            <w:r>
+              <w:rPr>
+                <w:rFonts w:ascii="Arial" w:cs="Arial" w:eastAsia="Arial" w:hAnsi="Arial"/>
+                <w:sz w:val="20"/>
+                <w:szCs w:val="20"/>
+              </w:rPr>
               <w:t xml:space="preserve">All</w:t>
             </w:r>
           </w:p>
         </w:tc>
         <w:tc>
           <w:tcPr>
-            <w:tcW w:type="dxa" w:w="1872"/>
-            <w:tcBorders>
-              <w:top w:val="single" w:color="BBBBBB" w:sz="1"/>
-              <w:left w:val="single" w:color="BBBBBB" w:sz="1"/>
-              <w:bottom w:val="single" w:color="BBBBBB" w:sz="1"/>
-              <w:right w:val="single" w:color="BBBBBB" w:sz="1"/>
-            </w:tcBorders>
-            <w:shd w:fill="EEF4FA" w:val="clear"/>
-            <w:tcMar>
-              <w:top w:type="dxa" w:w="80"/>
-              <w:left w:type="dxa" w:w="120"/>
-              <w:bottom w:type="dxa" w:w="80"/>
-              <w:right w:type="dxa" w:w="120"/>
-            </w:tcMar>
-          </w:tcPr>
-          <w:p>
-            <w:r>
-              <w:rPr>
-                <w:rFonts w:ascii="Arial" w:cs="Arial" w:eastAsia="Arial" w:hAnsi="Arial"/>
-                <w:sz w:val="20"/>
-                <w:szCs w:val="20"/>
-              </w:rPr>
-              <w:t xml:space="preserve">0.529</w:t>
-            </w:r>
-          </w:p>
-        </w:tc>
-        <w:tc>
-          <w:tcPr>
-            <w:tcW w:type="dxa" w:w="1872"/>
-            <w:tcBorders>
-              <w:top w:val="single" w:color="BBBBBB" w:sz="1"/>
-              <w:left w:val="single" w:color="BBBBBB" w:sz="1"/>
-              <w:bottom w:val="single" w:color="BBBBBB" w:sz="1"/>
-              <w:right w:val="single" w:color="BBBBBB" w:sz="1"/>
-            </w:tcBorders>
-            <w:shd w:fill="EEF4FA" w:val="clear"/>
-            <w:tcMar>
-              <w:top w:type="dxa" w:w="80"/>
-              <w:left w:type="dxa" w:w="120"/>
-              <w:bottom w:type="dxa" w:w="80"/>
-              <w:right w:type="dxa" w:w="120"/>
-            </w:tcMar>
-          </w:tcPr>
-          <w:p>
-            <w:r>
-              <w:rPr>
-                <w:rFonts w:ascii="Arial" w:cs="Arial" w:eastAsia="Arial" w:hAnsi="Arial"/>
-                <w:sz w:val="20"/>
-                <w:szCs w:val="20"/>
-              </w:rPr>
-              <w:t xml:space="preserve">0.405</w:t>
-            </w:r>
-          </w:p>
-        </w:tc>
-        <w:tc>
-          <w:tcPr>
-            <w:tcW w:type="dxa" w:w="1872"/>
-            <w:tcBorders>
-              <w:top w:val="single" w:color="BBBBBB" w:sz="1"/>
-              <w:left w:val="single" w:color="BBBBBB" w:sz="1"/>
-              <w:bottom w:val="single" w:color="BBBBBB" w:sz="1"/>
-              <w:right w:val="single" w:color="BBBBBB" w:sz="1"/>
-            </w:tcBorders>
-            <w:shd w:fill="EEF4FA" w:val="clear"/>
-            <w:tcMar>
-              <w:top w:type="dxa" w:w="80"/>
-              <w:left w:type="dxa" w:w="120"/>
-              <w:bottom w:type="dxa" w:w="80"/>
-              <w:right w:type="dxa" w:w="120"/>
-            </w:tcMar>
-          </w:tcPr>
-          <w:p>
-            <w:r>
-              <w:rPr>
-                <w:rFonts w:ascii="Arial" w:cs="Arial" w:eastAsia="Arial" w:hAnsi="Arial"/>
-                <w:sz w:val="20"/>
-                <w:szCs w:val="20"/>
-              </w:rPr>
-              <w:t xml:space="preserve">0.400</w:t>
-            </w:r>
-          </w:p>
-        </w:tc>
-        <w:tc>
-          <w:tcPr>
-            <w:tcW w:type="dxa" w:w="1404"/>
-            <w:tcBorders>
-              <w:top w:val="single" w:color="BBBBBB" w:sz="1"/>
-              <w:left w:val="single" w:color="BBBBBB" w:sz="1"/>
-              <w:bottom w:val="single" w:color="BBBBBB" w:sz="1"/>
-              <w:right w:val="single" w:color="BBBBBB" w:sz="1"/>
-            </w:tcBorders>
-            <w:shd w:fill="EEF4FA" w:val="clear"/>
-            <w:tcMar>
-              <w:top w:type="dxa" w:w="80"/>
-              <w:left w:type="dxa" w:w="120"/>
-              <w:bottom w:type="dxa" w:w="80"/>
-              <w:right w:type="dxa" w:w="120"/>
-            </w:tcMar>
-          </w:tcPr>
-          <w:p>
-            <w:r>
-              <w:rPr>
-                <w:rFonts w:ascii="Arial" w:cs="Arial" w:eastAsia="Arial" w:hAnsi="Arial"/>
-                <w:sz w:val="20"/>
-                <w:szCs w:val="20"/>
-              </w:rPr>
-              <w:t xml:space="preserve">0.141</w:t>
+            <w:tcW w:type="dxa" w:w="1560"/>
+            <w:tcBorders>
+              <w:top w:val="single" w:color="BBBBBB" w:sz="1"/>
+              <w:left w:val="single" w:color="BBBBBB" w:sz="1"/>
+              <w:bottom w:val="single" w:color="BBBBBB" w:sz="1"/>
+              <w:right w:val="single" w:color="BBBBBB" w:sz="1"/>
+            </w:tcBorders>
+            <w:shd w:fill="FFFFFF" w:val="clear"/>
+            <w:tcMar>
+              <w:top w:type="dxa" w:w="80"/>
+              <w:left w:type="dxa" w:w="120"/>
+              <w:bottom w:type="dxa" w:w="80"/>
+              <w:right w:type="dxa" w:w="120"/>
+            </w:tcMar>
+          </w:tcPr>
+          <w:p>
+            <w:r>
+              <w:rPr>
+                <w:rFonts w:ascii="Arial" w:cs="Arial" w:eastAsia="Arial" w:hAnsi="Arial"/>
+                <w:sz w:val="20"/>
+                <w:szCs w:val="20"/>
+              </w:rPr>
+              <w:t xml:space="preserve">0.861</w:t>
+            </w:r>
+          </w:p>
+        </w:tc>
+        <w:tc>
+          <w:tcPr>
+            <w:tcW w:type="dxa" w:w="1560"/>
+            <w:tcBorders>
+              <w:top w:val="single" w:color="BBBBBB" w:sz="1"/>
+              <w:left w:val="single" w:color="BBBBBB" w:sz="1"/>
+              <w:bottom w:val="single" w:color="BBBBBB" w:sz="1"/>
+              <w:right w:val="single" w:color="BBBBBB" w:sz="1"/>
+            </w:tcBorders>
+            <w:shd w:fill="FFFFFF" w:val="clear"/>
+            <w:tcMar>
+              <w:top w:type="dxa" w:w="80"/>
+              <w:left w:type="dxa" w:w="120"/>
+              <w:bottom w:type="dxa" w:w="80"/>
+              <w:right w:type="dxa" w:w="120"/>
+            </w:tcMar>
+          </w:tcPr>
+          <w:p>
+            <w:r>
+              <w:rPr>
+                <w:rFonts w:ascii="Arial" w:cs="Arial" w:eastAsia="Arial" w:hAnsi="Arial"/>
+                <w:sz w:val="20"/>
+                <w:szCs w:val="20"/>
+              </w:rPr>
+              <w:t xml:space="preserve">0.854</w:t>
+            </w:r>
+          </w:p>
+        </w:tc>
+        <w:tc>
+          <w:tcPr>
+            <w:tcW w:type="dxa" w:w="1900"/>
+            <w:tcBorders>
+              <w:top w:val="single" w:color="BBBBBB" w:sz="1"/>
+              <w:left w:val="single" w:color="BBBBBB" w:sz="1"/>
+              <w:bottom w:val="single" w:color="BBBBBB" w:sz="1"/>
+              <w:right w:val="single" w:color="BBBBBB" w:sz="1"/>
+            </w:tcBorders>
+            <w:shd w:fill="FFFFFF" w:val="clear"/>
+            <w:tcMar>
+              <w:top w:type="dxa" w:w="80"/>
+              <w:left w:type="dxa" w:w="120"/>
+              <w:bottom w:type="dxa" w:w="80"/>
+              <w:right w:type="dxa" w:w="120"/>
+            </w:tcMar>
+          </w:tcPr>
+          <w:p>
+            <w:r>
+              <w:rPr>
+                <w:rFonts w:ascii="Arial" w:cs="Arial" w:eastAsia="Arial" w:hAnsi="Arial"/>
+                <w:sz w:val="20"/>
+                <w:szCs w:val="20"/>
+              </w:rPr>
+              <w:t xml:space="preserve">90.0%</w:t>
+            </w:r>
+          </w:p>
+        </w:tc>
+        <w:tc>
+          <w:tcPr>
+            <w:tcW w:type="dxa" w:w="1400"/>
+            <w:tcBorders>
+              <w:top w:val="single" w:color="BBBBBB" w:sz="1"/>
+              <w:left w:val="single" w:color="BBBBBB" w:sz="1"/>
+              <w:bottom w:val="single" w:color="BBBBBB" w:sz="1"/>
+              <w:right w:val="single" w:color="BBBBBB" w:sz="1"/>
+            </w:tcBorders>
+            <w:shd w:fill="FFFFFF" w:val="clear"/>
+            <w:tcMar>
+              <w:top w:type="dxa" w:w="80"/>
+              <w:left w:type="dxa" w:w="120"/>
+              <w:bottom w:type="dxa" w:w="80"/>
+              <w:right w:type="dxa" w:w="120"/>
+            </w:tcMar>
+          </w:tcPr>
+          <w:p>
+            <w:r>
+              <w:rPr>
+                <w:rFonts w:ascii="Arial" w:cs="Arial" w:eastAsia="Arial" w:hAnsi="Arial"/>
+                <w:sz w:val="20"/>
+                <w:szCs w:val="20"/>
+              </w:rPr>
+              <w:t xml:space="preserve">87.1%</w:t>
+            </w:r>
+          </w:p>
+        </w:tc>
+        <w:tc>
+          <w:tcPr>
+            <w:tcW w:type="dxa" w:w="600"/>
+            <w:tcBorders>
+              <w:top w:val="single" w:color="BBBBBB" w:sz="1"/>
+              <w:left w:val="single" w:color="BBBBBB" w:sz="1"/>
+              <w:bottom w:val="single" w:color="BBBBBB" w:sz="1"/>
+              <w:right w:val="single" w:color="BBBBBB" w:sz="1"/>
+            </w:tcBorders>
+            <w:shd w:fill="FFFFFF" w:val="clear"/>
+            <w:tcMar>
+              <w:top w:type="dxa" w:w="80"/>
+              <w:left w:type="dxa" w:w="120"/>
+              <w:bottom w:type="dxa" w:w="80"/>
+              <w:right w:type="dxa" w:w="120"/>
+            </w:tcMar>
+          </w:tcPr>
+          <w:p>
+            <w:r>
+              <w:rPr>
+                <w:rFonts w:ascii="Arial" w:cs="Arial" w:eastAsia="Arial" w:hAnsi="Arial"/>
+                <w:sz w:val="20"/>
+                <w:szCs w:val="20"/>
+              </w:rPr>
+              <w:t xml:space="preserve">~24175</w:t>
             </w:r>
           </w:p>
         </w:tc>
@@ -3231,19 +5010,6 @@
           <w:szCs w:val="22"/>
         </w:rPr>
         <w:t xml:space="preserve"/>
-      </w:r>
-    </w:p>
-    <w:p>
-      <w:pPr>
-        <w:spacing w:after="140"/>
-      </w:pPr>
-      <w:r>
-        <w:rPr>
-          <w:rFonts w:ascii="Arial" w:cs="Arial" w:eastAsia="Arial" w:hAnsi="Arial"/>
-          <w:sz w:val="22"/>
-          <w:szCs w:val="22"/>
-        </w:rPr>
-        <w:t xml:space="preserve">Helmet gets the best mask mAP50 at 23.6 percent despite being small. The reason is shape: helmets are round and consistent, so once the box is right, the polygon fits without much variation. Safety vest scores the worst at 5.64 percent. It drapes loosely on the body and its outline changes completely depending on arm position, camera angle, and fit — the model cannot generalize that shape.</w:t>
       </w:r>
     </w:p>
     <w:p>
@@ -3277,7 +5043,7 @@
           <w:sz w:val="23"/>
           <w:szCs w:val="23"/>
         </w:rPr>
-        <w:t xml:space="preserve">6.1 Convergence</w:t>
+        <w:t xml:space="preserve">6.1 Class frequency versus performance</w:t>
       </w:r>
     </w:p>
     <w:p>
@@ -3290,7 +5056,7 @@
           <w:sz w:val="22"/>
           <w:szCs w:val="22"/>
         </w:rPr>
-        <w:t xml:space="preserve">DeepLab training loss dropped from 1.07 at epoch 5 to 0.26 at epoch 30. Validation mIoU climbed from 0.374 to a peak of 0.483 at epoch 28, then slipped back to 0.475 by epoch 30. The late dip is typical of fine-tuning a large model on under 1500 images: once the cosine schedule drives the learning rate very low, the backbone starts fitting training masks rather than generalizing. We save the epoch 28 checkpoint.</w:t>
+        <w:t xml:space="preserve">The 10 keremberke classes are not uniformly represented. Gloves and goggles each have over 4,000 annotations; mask has only 269. In pixel-level segmentation this translates directly into gradient coverage: classes with more training examples cover more pixels per batch and receive stronger gradient signal. The equal class weighting in the loss function (2.0 for all 10 PPE classes) partially compensates but does not fully close the gap for mask and no_mask.</w:t>
       </w:r>
     </w:p>
     <w:p>
@@ -3308,7 +5074,7 @@
           <w:sz w:val="23"/>
           <w:szCs w:val="23"/>
         </w:rPr>
-        <w:t xml:space="preserve">6.2 Pixel accuracy vs mean IoU</w:t>
+        <w:t xml:space="preserve">6.2 Why individual items are harder to segment than whole-person regions</w:t>
       </w:r>
     </w:p>
     <w:p>
@@ -3321,7 +5087,7 @@
           <w:sz w:val="22"/>
           <w:szCs w:val="22"/>
         </w:rPr>
-        <w:t xml:space="preserve">86.18 percent pixel accuracy but 40.98 percent mean IoU. The gap is not a contradiction — it is a class imbalance artifact. Background is about 80 percent of all pixels. Getting background right is enough for high pixel accuracy without touching any PPE class. Mean IoU weights all six classes equally, so a model that ignores a PPE class pays a real penalty. For this task, mIoU is the number that matters. Pixel accuracy is almost useless as a standalone metric here.</w:t>
+        <w:t xml:space="preserve">A typical crop in Assignment 2 contained one person filling most of the image area. Here the objects of interest are individual PPE items on a person in a full scene: a glove is roughly 3-5 percent of the image area, a mask under 1 percent. At 512x512 input resolution, a mask bounding box may cover only 15x20 pixels. DeepLabV3+'s ASPP module uses atrous convolutions at rates tuned for medium-to-large objects. Very small objects at this resolution are at the boundary of what the architecture handles well without specialised small-object adaptations.</w:t>
       </w:r>
     </w:p>
     <w:p>
@@ -3339,7 +5105,7 @@
           <w:sz w:val="23"/>
           <w:szCs w:val="23"/>
         </w:rPr>
-        <w:t xml:space="preserve">6.3 Box-mask gap in YOLOv8n-seg</w:t>
+        <w:t xml:space="preserve">6.3 Pixel accuracy versus mean IoU</w:t>
       </w:r>
     </w:p>
     <w:p>
@@ -3352,7 +5118,7 @@
           <w:sz w:val="22"/>
           <w:szCs w:val="22"/>
         </w:rPr>
-        <w:t xml:space="preserve">Box mAP50 is 40.0 percent; mask mAP50 is 14.1 percent. The model finds where items are (box IoU &gt; 0.5) at a reasonable rate, but drawing a tight polygon around them is a different problem. Boxes tolerate loose boundaries. Polygon masks do not. For soft items like vests that conform to body shape, the outline changes with every pose, and 1368 training images are not enough for the model to memorize all those variations.</w:t>
+        <w:t xml:space="preserve">Background fills the majority of pixels in each image. A model that predicts background everywhere achieves high pixel accuracy while scoring zero IoU on every PPE class. Mean IoU weights all 11 classes equally, so missing any single class costs 1/11 of the total score regardless of how rarely that class appears. For this task mIoU is the primary diagnostic metric. Pixel accuracy is included for completeness but gives a misleadingly optimistic picture when background dominance is high.</w:t>
       </w:r>
     </w:p>
     <w:p>
@@ -3370,7 +5136,7 @@
           <w:sz w:val="23"/>
           <w:szCs w:val="23"/>
         </w:rPr>
-        <w:t xml:space="preserve">6.4 The pseudo-label problem</w:t>
+        <w:t xml:space="preserve">6.4 Box-mask gap in YOLOv8n-seg</w:t>
       </w:r>
     </w:p>
     <w:p>
@@ -3383,7 +5149,7 @@
           <w:sz w:val="22"/>
           <w:szCs w:val="22"/>
         </w:rPr>
-        <w:t xml:space="preserve">Assignment 2 used clean, hand-labeled crop-level categories. Here, every pixel label comes from SAM2 running on a bounding box, not from a human. Two things go wrong: SAM2 sometimes bleeds outside the actual object or misses parts of it, especially when workers overlap. And because the class label comes from the box annotation, a box containing both a helmet and vest gets one label assigned to every pixel inside it. The 87.33 percent classification accuracy from Assignment 2 versus 40.98 percent mIoU here is not an apples-to-apples comparison — the underlying label quality is completely different. Hand-annotated polygon masks would close a large part of that gap.</w:t>
+        <w:t xml:space="preserve">Box mAP50 measures whether a predicted bounding box overlaps the ground truth at IoU above 0.5. Mask mAP50 additionally requires the predicted polygon to match the object boundary at the same threshold. Boxes are forgiving — a box 10 pixels wider than the object still passes. Polygons are not. Deformable items like gloves, shoes, and face masks change shape with body position, making polygon matching harder than box matching. The box-mask gap is consistently larger for these items than for rigid objects like helmets, which is visible in the per-class table above.</w:t>
       </w:r>
     </w:p>
     <w:p>
@@ -3401,7 +5167,7 @@
           <w:sz w:val="23"/>
           <w:szCs w:val="23"/>
         </w:rPr>
-        <w:t xml:space="preserve">6.5 How the four task types compare</w:t>
+        <w:t xml:space="preserve">6.5 The pseudo-label ceiling</w:t>
       </w:r>
     </w:p>
     <w:p>
@@ -3414,7 +5180,25 @@
           <w:sz w:val="22"/>
           <w:szCs w:val="22"/>
         </w:rPr>
-        <w:t xml:space="preserve">The 19-model chart puts numbers to what you would expect intuitively:</w:t>
+        <w:t xml:space="preserve">Every pixel label in this dataset comes from SAM2 running on bounding box annotations. There are no human-drawn polygon masks. SAM2 is accurate for clear, well-isolated objects but degrades when objects overlap, when boxes are imprecisely drawn, or when a single box contains multiple workers in different PPE states. The class label for every pixel inside a SAM2 mask is taken directly from the box annotation, so any box-level annotation error propagates to every pixel in that region. This is the primary ceiling on achievable mIoU with this pipeline — architecture improvements will yield diminishing returns while the label quality remains unchanged.</w:t>
+      </w:r>
+    </w:p>
+    <w:p>
+      <w:pPr>
+        <w:pStyle w:val="Heading3"/>
+        <w:spacing w:after="80" w:before="160"/>
+      </w:pPr>
+      <w:r>
+        <w:rPr>
+          <w:rFonts w:ascii="Arial" w:cs="Arial" w:eastAsia="Arial" w:hAnsi="Arial"/>
+          <w:b/>
+          <w:bCs/>
+          <w:i/>
+          <w:iCs/>
+          <w:sz w:val="23"/>
+          <w:szCs w:val="23"/>
+        </w:rPr>
+        <w:t xml:space="preserve">6.6 What would improve results</w:t>
       </w:r>
     </w:p>
     <w:p>
@@ -3432,7 +5216,7 @@
           <w:sz w:val="22"/>
           <w:szCs w:val="22"/>
         </w:rPr>
-        <w:t xml:space="preserve">Whole-image classification, 5 classes: 70-94 percent. ViT-B-16 at 93.90 percent.</w:t>
+        <w:t xml:space="preserve">Hand-annotated polygon masks for even 500 images would likely raise mIoU more than any architecture change. SAM2 pseudo-labels are the dominant noise source.</w:t>
       </w:r>
     </w:p>
     <w:p>
@@ -3450,7 +5234,7 @@
           <w:sz w:val="22"/>
           <w:szCs w:val="22"/>
         </w:rPr>
-        <w:t xml:space="preserve">Object detection, 5 classes, 2609 scenes: 86.3 percent mAP50 with YOLOv8n.</w:t>
+        <w:t xml:space="preserve">The full keremberke dataset has 11,704 annotated images. This assignment used 4,000. Training on the complete set would directly help the low-frequency classes like mask and no_mask.</w:t>
       </w:r>
     </w:p>
     <w:p>
@@ -3468,7 +5252,7 @@
           <w:sz w:val="22"/>
           <w:szCs w:val="22"/>
         </w:rPr>
-        <w:t xml:space="preserve">Semantic segmentation, 6 classes, pixel-level: 40.98 percent mIoU with DeepLabV3+.</w:t>
+        <w:t xml:space="preserve">Separate models per item type — one DeepLabV3+ for helmet/no_helmet, another for glove/no_glove — would reduce inter-class competition and let each model specialise for its object scale.</w:t>
       </w:r>
     </w:p>
     <w:p>
@@ -3486,38 +5270,7 @@
           <w:sz w:val="22"/>
           <w:szCs w:val="22"/>
         </w:rPr>
-        <w:t xml:space="preserve">Instance segmentation, 5 classes, polygon masks: 14.1 percent mask mAP50 with YOLOv8n-seg.</w:t>
-      </w:r>
-    </w:p>
-    <w:p>
-      <w:pPr>
-        <w:spacing w:after="140"/>
-      </w:pPr>
-      <w:r>
-        <w:rPr>
-          <w:rFonts w:ascii="Arial" w:cs="Arial" w:eastAsia="Arial" w:hAnsi="Arial"/>
-          <w:sz w:val="22"/>
-          <w:szCs w:val="22"/>
-        </w:rPr>
-        <w:t xml:space="preserve">Each step down the list asks for more from the model — more spatial precision, more instances distinguished, more boundary accuracy — and the numbers reflect that.</w:t>
-      </w:r>
-    </w:p>
-    <w:p>
-      <w:pPr>
-        <w:pStyle w:val="Heading3"/>
-        <w:spacing w:after="80" w:before="160"/>
-      </w:pPr>
-      <w:r>
-        <w:rPr>
-          <w:rFonts w:ascii="Arial" w:cs="Arial" w:eastAsia="Arial" w:hAnsi="Arial"/>
-          <w:b/>
-          <w:bCs/>
-          <w:i/>
-          <w:iCs/>
-          <w:sz w:val="23"/>
-          <w:szCs w:val="23"/>
-        </w:rPr>
-        <w:t xml:space="preserve">6.6 What would actually improve these results</w:t>
+        <w:t xml:space="preserve">CRF post-processing on DeepLabV3+ outputs would sharpen predicted boundaries at no retraining cost, at the expense of added inference time.</w:t>
       </w:r>
     </w:p>
     <w:p>
@@ -3535,61 +5288,7 @@
           <w:sz w:val="22"/>
           <w:szCs w:val="22"/>
         </w:rPr>
-        <w:t xml:space="preserve">The biggest bottleneck is label quality. 500 hand-annotated polygon masks would likely raise mIoU by more than any architecture change.</w:t>
-      </w:r>
-    </w:p>
-    <w:p>
-      <w:pPr>
-        <w:pStyle w:val="ListParagraph"/>
-        <w:numPr>
-          <w:ilvl w:val="0"/>
-          <w:numId w:val="2"/>
-        </w:numPr>
-        <w:spacing w:after="80"/>
-      </w:pPr>
-      <w:r>
-        <w:rPr>
-          <w:rFonts w:ascii="Arial" w:cs="Arial" w:eastAsia="Arial" w:hAnsi="Arial"/>
-          <w:sz w:val="22"/>
-          <w:szCs w:val="22"/>
-        </w:rPr>
-        <w:t xml:space="preserve">The keremberke HuggingFace dataset would add roughly 1500 scenes once it is converted from its legacy loading script to Parquet format. That alone would nearly double the training set.</w:t>
-      </w:r>
-    </w:p>
-    <w:p>
-      <w:pPr>
-        <w:pStyle w:val="ListParagraph"/>
-        <w:numPr>
-          <w:ilvl w:val="0"/>
-          <w:numId w:val="2"/>
-        </w:numPr>
-        <w:spacing w:after="80"/>
-      </w:pPr>
-      <w:r>
-        <w:rPr>
-          <w:rFonts w:ascii="Arial" w:cs="Arial" w:eastAsia="Arial" w:hAnsi="Arial"/>
-          <w:sz w:val="22"/>
-          <w:szCs w:val="22"/>
-        </w:rPr>
-        <w:t xml:space="preserve">Running the two-stage pipeline from Assignment 2 (YOLOv8n person detect, then DeepLabV3+ on the crop) might outperform full-scene segmentation. Person crops eliminate most background pixels and let the segmentation model focus on what is actually being worn.</w:t>
-      </w:r>
-    </w:p>
-    <w:p>
-      <w:pPr>
-        <w:pStyle w:val="ListParagraph"/>
-        <w:numPr>
-          <w:ilvl w:val="0"/>
-          <w:numId w:val="2"/>
-        </w:numPr>
-        <w:spacing w:after="80"/>
-      </w:pPr>
-      <w:r>
-        <w:rPr>
-          <w:rFonts w:ascii="Arial" w:cs="Arial" w:eastAsia="Arial" w:hAnsi="Arial"/>
-          <w:sz w:val="22"/>
-          <w:szCs w:val="22"/>
-        </w:rPr>
-        <w:t xml:space="preserve">CRF post-processing on DeepLab outputs would sharpen boundaries with no retraining, at the cost of added inference time.</w:t>
+        <w:t xml:space="preserve">A two-stage pipeline combining a person detector with item-level segmentation on the resulting crops would reduce background dominance and scale the input to match object size.</w:t>
       </w:r>
     </w:p>
     <w:p>
@@ -3673,7 +5372,7 @@
           <w:sz w:val="18"/>
           <w:szCs w:val="18"/>
         </w:rPr>
-        <w:t xml:space="preserve">Figure 1. DeepLabV3+ training loss (left) and validation mIoU (right) over 30 epochs.</w:t>
+        <w:t xml:space="preserve">Figure 1. DeepLabV3+ training and validation loss (left) and validation mIoU (right) over 30 epochs.</w:t>
       </w:r>
     </w:p>
     <w:p>
@@ -3736,7 +5435,7 @@
           <w:sz w:val="18"/>
           <w:szCs w:val="18"/>
         </w:rPr>
-        <w:t xml:space="preserve">Figure 2. DeepLabV3+ per-class IoU on the validation set. Background dominates; helmet is the hardest PPE class.</w:t>
+        <w:t xml:space="preserve">Figure 2. DeepLabV3+ per-class IoU on the 600-image validation set.</w:t>
       </w:r>
     </w:p>
     <w:p>
@@ -3799,7 +5498,7 @@
           <w:sz w:val="18"/>
           <w:szCs w:val="18"/>
         </w:rPr>
-        <w:t xml:space="preserve">Figure 3. DeepLabV3+ sample predictions (left column: input image; right column: predicted segmentation mask).</w:t>
+        <w:t xml:space="preserve">Figure 3. DeepLabV3+ sample predictions. Each row shows an input image (left) and the predicted semantic mask (right).</w:t>
       </w:r>
     </w:p>
     <w:p>
@@ -3862,7 +5561,7 @@
           <w:sz w:val="18"/>
           <w:szCs w:val="18"/>
         </w:rPr>
-        <w:t xml:space="preserve">Figure 4. YOLOv8n-seg training metrics over 30 epochs including box and mask mAP.</w:t>
+        <w:t xml:space="preserve">Figure 4. YOLOv8n-seg training metrics over 30 epochs: box mAP50, mask mAP50, precision, and recall.</w:t>
       </w:r>
     </w:p>
     <w:p>
@@ -3873,7 +5572,7 @@
       <w:r>
         <w:drawing>
           <wp:inline distT="0" distB="0" distL="0" distR="0">
-            <wp:extent cx="4191000" cy="3619500"/>
+            <wp:extent cx="4191000" cy="2095500"/>
             <wp:effectExtent t="0" r="0" b="0" l="0"/>
             <wp:docPr id="1" name="yolo_seg_confusion.png" descr="yolo_seg_confusion.png" title="yolo_seg_confusion.png"/>
             <wp:cNvGraphicFramePr>
@@ -3898,7 +5597,7 @@
                   <pic:spPr bwMode="auto">
                     <a:xfrm>
                       <a:off x="0" y="0"/>
-                      <a:ext cx="4191000" cy="3619500"/>
+                      <a:ext cx="4191000" cy="2095500"/>
                     </a:xfrm>
                     <a:prstGeom prst="rect">
                       <a:avLst/>
@@ -3925,70 +5624,7 @@
           <w:sz w:val="18"/>
           <w:szCs w:val="18"/>
         </w:rPr>
-        <w:t xml:space="preserve">Figure 5. YOLOv8n-seg confusion matrix on the validation set.</w:t>
-      </w:r>
-    </w:p>
-    <w:p>
-      <w:pPr>
-        <w:spacing w:after="120"/>
-        <w:jc w:val="center"/>
-      </w:pPr>
-      <w:r>
-        <w:drawing>
-          <wp:inline distT="0" distB="0" distL="0" distR="0">
-            <wp:extent cx="5334000" cy="4381500"/>
-            <wp:effectExtent t="0" r="0" b="0" l="0"/>
-            <wp:docPr id="1" name="experiment_comparison.png" descr="experiment_comparison.png" title="experiment_comparison.png"/>
-            <wp:cNvGraphicFramePr>
-              <a:graphicFrameLocks xmlns:a="http://schemas.openxmlformats.org/drawingml/2006/main" noChangeAspect="1"/>
-            </wp:cNvGraphicFramePr>
-            <a:graphic xmlns:a="http://schemas.openxmlformats.org/drawingml/2006/main">
-              <a:graphicData uri="http://schemas.openxmlformats.org/drawingml/2006/picture">
-                <pic:pic xmlns:pic="http://schemas.openxmlformats.org/drawingml/2006/picture">
-                  <pic:nvPicPr>
-                    <pic:cNvPr id="0" name="" descr=""/>
-                    <pic:cNvPicPr>
-                      <a:picLocks noChangeAspect="1" noChangeArrowheads="1"/>
-                    </pic:cNvPicPr>
-                  </pic:nvPicPr>
-                  <pic:blipFill>
-                    <a:blip r:embed="rId13" cstate="none"/>
-                    <a:srcRect/>
-                    <a:stretch>
-                      <a:fillRect/>
-                    </a:stretch>
-                  </pic:blipFill>
-                  <pic:spPr bwMode="auto">
-                    <a:xfrm>
-                      <a:off x="0" y="0"/>
-                      <a:ext cx="5334000" cy="4381500"/>
-                    </a:xfrm>
-                    <a:prstGeom prst="rect">
-                      <a:avLst/>
-                    </a:prstGeom>
-                  </pic:spPr>
-                </pic:pic>
-              </a:graphicData>
-            </a:graphic>
-          </wp:inline>
-        </w:drawing>
-      </w:r>
-    </w:p>
-    <w:p>
-      <w:pPr>
-        <w:spacing w:after="200"/>
-        <w:jc w:val="center"/>
-      </w:pPr>
-      <w:r>
-        <w:rPr>
-          <w:rFonts w:ascii="Arial" w:cs="Arial" w:eastAsia="Arial" w:hAnsi="Arial"/>
-          <w:i/>
-          <w:iCs/>
-          <w:color w:val="555555"/>
-          <w:sz w:val="18"/>
-          <w:szCs w:val="18"/>
-        </w:rPr>
-        <w:t xml:space="preserve">Figure 6. Full 19-model comparison chart spanning classification, detection, semantic segmentation, and instance segmentation tasks.</w:t>
+        <w:t xml:space="preserve">Figure 5. YOLOv8n-seg per-class mask mAP50 on the 600-image validation set.</w:t>
       </w:r>
     </w:p>
     <w:sectPr>

</xml_diff>